<commit_message>
add 2 new fields to template docx fieldcard
</commit_message>
<xml_diff>
--- a/testDjangosite/media/fieldcard.docx
+++ b/testDjangosite/media/fieldcard.docx
@@ -1,6 +1,6 @@
 
 <file path=word/document.xml><?xml version="1.0" encoding="utf-8"?>
-<w:document xmlns:wpc="http://schemas.microsoft.com/office/word/2010/wordprocessingCanvas" xmlns:mc="http://schemas.openxmlformats.org/markup-compatibility/2006" xmlns:o="urn:schemas-microsoft-com:office:office" xmlns:r="http://schemas.openxmlformats.org/officeDocument/2006/relationships" xmlns:m="http://schemas.openxmlformats.org/officeDocument/2006/math" xmlns:v="urn:schemas-microsoft-com:vml" xmlns:wp14="http://schemas.microsoft.com/office/word/2010/wordprocessingDrawing" xmlns:wp="http://schemas.openxmlformats.org/drawingml/2006/wordprocessingDrawing" xmlns:w10="urn:schemas-microsoft-com:office:word" xmlns:w="http://schemas.openxmlformats.org/wordprocessingml/2006/main" xmlns:w14="http://schemas.microsoft.com/office/word/2010/wordml" xmlns:w15="http://schemas.microsoft.com/office/word/2012/wordml" xmlns:wpg="http://schemas.microsoft.com/office/word/2010/wordprocessingGroup" xmlns:wpi="http://schemas.microsoft.com/office/word/2010/wordprocessingInk" xmlns:wne="http://schemas.microsoft.com/office/word/2006/wordml" xmlns:wps="http://schemas.microsoft.com/office/word/2010/wordprocessingShape" mc:Ignorable="w14 w15 wp14">
+<w:document xmlns:wpc="http://schemas.microsoft.com/office/word/2010/wordprocessingCanvas" xmlns:mc="http://schemas.openxmlformats.org/markup-compatibility/2006" xmlns:o="urn:schemas-microsoft-com:office:office" xmlns:r="http://schemas.openxmlformats.org/officeDocument/2006/relationships" xmlns:m="http://schemas.openxmlformats.org/officeDocument/2006/math" xmlns:v="urn:schemas-microsoft-com:vml" xmlns:wp14="http://schemas.microsoft.com/office/word/2010/wordprocessingDrawing" xmlns:wp="http://schemas.openxmlformats.org/drawingml/2006/wordprocessingDrawing" xmlns:w10="urn:schemas-microsoft-com:office:word" xmlns:w="http://schemas.openxmlformats.org/wordprocessingml/2006/main" xmlns:w14="http://schemas.microsoft.com/office/word/2010/wordml" xmlns:wpg="http://schemas.microsoft.com/office/word/2010/wordprocessingGroup" xmlns:wpi="http://schemas.microsoft.com/office/word/2010/wordprocessingInk" xmlns:wne="http://schemas.microsoft.com/office/word/2006/wordml" xmlns:wps="http://schemas.microsoft.com/office/word/2010/wordprocessingShape" mc:Ignorable="w14 wp14">
   <w:body>
     <w:p>
       <w:pPr>
@@ -83,7 +83,47 @@
           <w:szCs w:val="20"/>
           <w:lang w:val="en-US" w:eastAsia="ru-RU"/>
         </w:rPr>
-        <w:t>{{ number_region }}</w:t>
+        <w:t>{</w:t>
+      </w:r>
+      <w:proofErr w:type="gramStart"/>
+      <w:r>
+        <w:rPr>
+          <w:rFonts w:ascii="Times New Roman" w:eastAsia="Times New Roman" w:hAnsi="Times New Roman" w:cs="Times New Roman"/>
+          <w:b/>
+          <w:bCs/>
+          <w:color w:val="000000"/>
+          <w:sz w:val="20"/>
+          <w:szCs w:val="20"/>
+          <w:lang w:val="en-US" w:eastAsia="ru-RU"/>
+        </w:rPr>
+        <w:t xml:space="preserve">{ </w:t>
+      </w:r>
+      <w:proofErr w:type="spellStart"/>
+      <w:proofErr w:type="gramEnd"/>
+      <w:r>
+        <w:rPr>
+          <w:rFonts w:ascii="Times New Roman" w:eastAsia="Times New Roman" w:hAnsi="Times New Roman" w:cs="Times New Roman"/>
+          <w:b/>
+          <w:bCs/>
+          <w:color w:val="000000"/>
+          <w:sz w:val="20"/>
+          <w:szCs w:val="20"/>
+          <w:lang w:val="en-US" w:eastAsia="ru-RU"/>
+        </w:rPr>
+        <w:t>number_region</w:t>
+      </w:r>
+      <w:proofErr w:type="spellEnd"/>
+      <w:r>
+        <w:rPr>
+          <w:rFonts w:ascii="Times New Roman" w:eastAsia="Times New Roman" w:hAnsi="Times New Roman" w:cs="Times New Roman"/>
+          <w:b/>
+          <w:bCs/>
+          <w:color w:val="000000"/>
+          <w:sz w:val="20"/>
+          <w:szCs w:val="20"/>
+          <w:lang w:val="en-US" w:eastAsia="ru-RU"/>
+        </w:rPr>
+        <w:t xml:space="preserve"> }}</w:t>
       </w:r>
     </w:p>
     <w:tbl>
@@ -144,7 +184,23 @@
                 <w:rFonts w:ascii="Times New Roman" w:hAnsi="Times New Roman" w:cs="Times New Roman"/>
                 <w:lang w:val="en-US"/>
               </w:rPr>
-              <w:t>{{ subject_rf }}</w:t>
+              <w:t xml:space="preserve">{{ </w:t>
+            </w:r>
+            <w:proofErr w:type="spellStart"/>
+            <w:r>
+              <w:rPr>
+                <w:rFonts w:ascii="Times New Roman" w:hAnsi="Times New Roman" w:cs="Times New Roman"/>
+                <w:lang w:val="en-US"/>
+              </w:rPr>
+              <w:t>subject_rf</w:t>
+            </w:r>
+            <w:proofErr w:type="spellEnd"/>
+            <w:r>
+              <w:rPr>
+                <w:rFonts w:ascii="Times New Roman" w:hAnsi="Times New Roman" w:cs="Times New Roman"/>
+                <w:lang w:val="en-US"/>
+              </w:rPr>
+              <w:t xml:space="preserve"> }}</w:t>
             </w:r>
           </w:p>
         </w:tc>
@@ -197,7 +253,23 @@
                 <w:rFonts w:ascii="Times New Roman" w:hAnsi="Times New Roman" w:cs="Times New Roman"/>
                 <w:lang w:val="en-US"/>
               </w:rPr>
-              <w:t>{{ forestly }}</w:t>
+              <w:t xml:space="preserve">{{ </w:t>
+            </w:r>
+            <w:proofErr w:type="spellStart"/>
+            <w:r>
+              <w:rPr>
+                <w:rFonts w:ascii="Times New Roman" w:hAnsi="Times New Roman" w:cs="Times New Roman"/>
+                <w:lang w:val="en-US"/>
+              </w:rPr>
+              <w:t>forestly</w:t>
+            </w:r>
+            <w:proofErr w:type="spellEnd"/>
+            <w:r>
+              <w:rPr>
+                <w:rFonts w:ascii="Times New Roman" w:hAnsi="Times New Roman" w:cs="Times New Roman"/>
+                <w:lang w:val="en-US"/>
+              </w:rPr>
+              <w:t xml:space="preserve"> }}</w:t>
             </w:r>
           </w:p>
         </w:tc>
@@ -253,7 +325,29 @@
                 <w:color w:val="000000"/>
                 <w:lang w:val="en-US" w:eastAsia="ru-RU"/>
               </w:rPr>
-              <w:t>{{ district_forestly }}</w:t>
+              <w:t xml:space="preserve">{{ </w:t>
+            </w:r>
+            <w:proofErr w:type="spellStart"/>
+            <w:r>
+              <w:rPr>
+                <w:rFonts w:ascii="Times New Roman" w:eastAsia="Times New Roman" w:hAnsi="Times New Roman" w:cs="Times New Roman"/>
+                <w:i/>
+                <w:iCs/>
+                <w:color w:val="000000"/>
+                <w:lang w:val="en-US" w:eastAsia="ru-RU"/>
+              </w:rPr>
+              <w:t>district_forestly</w:t>
+            </w:r>
+            <w:proofErr w:type="spellEnd"/>
+            <w:r>
+              <w:rPr>
+                <w:rFonts w:ascii="Times New Roman" w:eastAsia="Times New Roman" w:hAnsi="Times New Roman" w:cs="Times New Roman"/>
+                <w:i/>
+                <w:iCs/>
+                <w:color w:val="000000"/>
+                <w:lang w:val="en-US" w:eastAsia="ru-RU"/>
+              </w:rPr>
+              <w:t xml:space="preserve"> }}</w:t>
             </w:r>
           </w:p>
         </w:tc>
@@ -306,7 +400,23 @@
                 <w:rFonts w:ascii="Times New Roman" w:hAnsi="Times New Roman" w:cs="Times New Roman"/>
                 <w:lang w:val="en-US"/>
               </w:rPr>
-              <w:t>{{ name_dacha }}</w:t>
+              <w:t xml:space="preserve">{{ </w:t>
+            </w:r>
+            <w:proofErr w:type="spellStart"/>
+            <w:r>
+              <w:rPr>
+                <w:rFonts w:ascii="Times New Roman" w:hAnsi="Times New Roman" w:cs="Times New Roman"/>
+                <w:lang w:val="en-US"/>
+              </w:rPr>
+              <w:t>name_dacha</w:t>
+            </w:r>
+            <w:proofErr w:type="spellEnd"/>
+            <w:r>
+              <w:rPr>
+                <w:rFonts w:ascii="Times New Roman" w:hAnsi="Times New Roman" w:cs="Times New Roman"/>
+                <w:lang w:val="en-US"/>
+              </w:rPr>
+              <w:t xml:space="preserve"> }}</w:t>
             </w:r>
           </w:p>
         </w:tc>
@@ -379,7 +489,23 @@
                 <w:rFonts w:ascii="Times New Roman" w:hAnsi="Times New Roman" w:cs="Times New Roman"/>
                 <w:lang w:val="en-US"/>
               </w:rPr>
-              <w:t xml:space="preserve"> {{ name_quarter }}</w:t>
+              <w:t xml:space="preserve"> {{ </w:t>
+            </w:r>
+            <w:proofErr w:type="spellStart"/>
+            <w:r>
+              <w:rPr>
+                <w:rFonts w:ascii="Times New Roman" w:hAnsi="Times New Roman" w:cs="Times New Roman"/>
+                <w:lang w:val="en-US"/>
+              </w:rPr>
+              <w:t>name_quarter</w:t>
+            </w:r>
+            <w:proofErr w:type="spellEnd"/>
+            <w:r>
+              <w:rPr>
+                <w:rFonts w:ascii="Times New Roman" w:hAnsi="Times New Roman" w:cs="Times New Roman"/>
+                <w:lang w:val="en-US"/>
+              </w:rPr>
+              <w:t xml:space="preserve"> }}</w:t>
             </w:r>
           </w:p>
         </w:tc>
@@ -438,7 +564,29 @@
                 <w:color w:val="000000"/>
                 <w:lang w:val="en-US" w:eastAsia="ru-RU"/>
               </w:rPr>
-              <w:t>{{ soil_lot }}</w:t>
+              <w:t xml:space="preserve">{{ </w:t>
+            </w:r>
+            <w:proofErr w:type="spellStart"/>
+            <w:r>
+              <w:rPr>
+                <w:rFonts w:ascii="Times New Roman" w:eastAsia="Times New Roman" w:hAnsi="Times New Roman" w:cs="Times New Roman"/>
+                <w:i/>
+                <w:iCs/>
+                <w:color w:val="000000"/>
+                <w:lang w:val="en-US" w:eastAsia="ru-RU"/>
+              </w:rPr>
+              <w:t>soil_lot</w:t>
+            </w:r>
+            <w:proofErr w:type="spellEnd"/>
+            <w:r>
+              <w:rPr>
+                <w:rFonts w:ascii="Times New Roman" w:eastAsia="Times New Roman" w:hAnsi="Times New Roman" w:cs="Times New Roman"/>
+                <w:i/>
+                <w:iCs/>
+                <w:color w:val="000000"/>
+                <w:lang w:val="en-US" w:eastAsia="ru-RU"/>
+              </w:rPr>
+              <w:t xml:space="preserve"> }}</w:t>
             </w:r>
           </w:p>
         </w:tc>
@@ -498,7 +646,29 @@
                 <w:color w:val="000000"/>
                 <w:lang w:val="en-US" w:eastAsia="ru-RU"/>
               </w:rPr>
-              <w:t>{{ sample_area }}</w:t>
+              <w:t xml:space="preserve">{{ </w:t>
+            </w:r>
+            <w:proofErr w:type="spellStart"/>
+            <w:r>
+              <w:rPr>
+                <w:rFonts w:ascii="Times New Roman" w:eastAsia="Times New Roman" w:hAnsi="Times New Roman" w:cs="Times New Roman"/>
+                <w:i/>
+                <w:iCs/>
+                <w:color w:val="000000"/>
+                <w:lang w:val="en-US" w:eastAsia="ru-RU"/>
+              </w:rPr>
+              <w:t>sample_area</w:t>
+            </w:r>
+            <w:proofErr w:type="spellEnd"/>
+            <w:r>
+              <w:rPr>
+                <w:rFonts w:ascii="Times New Roman" w:eastAsia="Times New Roman" w:hAnsi="Times New Roman" w:cs="Times New Roman"/>
+                <w:i/>
+                <w:iCs/>
+                <w:color w:val="000000"/>
+                <w:lang w:val="en-US" w:eastAsia="ru-RU"/>
+              </w:rPr>
+              <w:t xml:space="preserve"> }}</w:t>
             </w:r>
           </w:p>
         </w:tc>
@@ -654,6 +824,7 @@
               </w:rPr>
               <w:t xml:space="preserve">{{ </w:t>
             </w:r>
+            <w:proofErr w:type="spellStart"/>
             <w:r>
               <w:rPr>
                 <w:rFonts w:ascii="Times New Roman" w:eastAsia="Times New Roman" w:hAnsi="Times New Roman" w:cs="Times New Roman"/>
@@ -664,6 +835,7 @@
               </w:rPr>
               <w:t>purpose_of_forests</w:t>
             </w:r>
+            <w:proofErr w:type="spellEnd"/>
             <w:r>
               <w:rPr>
                 <w:rFonts w:ascii="Times New Roman" w:eastAsia="Times New Roman" w:hAnsi="Times New Roman" w:cs="Times New Roman"/>
@@ -753,7 +925,29 @@
                 <w:color w:val="000000"/>
                 <w:lang w:val="en-US" w:eastAsia="ru-RU"/>
               </w:rPr>
-              <w:t>{{ forest_protection_category }}</w:t>
+              <w:t xml:space="preserve">{{ </w:t>
+            </w:r>
+            <w:proofErr w:type="spellStart"/>
+            <w:r>
+              <w:rPr>
+                <w:rFonts w:ascii="Times New Roman" w:eastAsia="Times New Roman" w:hAnsi="Times New Roman" w:cs="Times New Roman"/>
+                <w:i/>
+                <w:iCs/>
+                <w:color w:val="000000"/>
+                <w:lang w:val="en-US" w:eastAsia="ru-RU"/>
+              </w:rPr>
+              <w:t>forest_protection_category</w:t>
+            </w:r>
+            <w:proofErr w:type="spellEnd"/>
+            <w:r>
+              <w:rPr>
+                <w:rFonts w:ascii="Times New Roman" w:eastAsia="Times New Roman" w:hAnsi="Times New Roman" w:cs="Times New Roman"/>
+                <w:i/>
+                <w:iCs/>
+                <w:color w:val="000000"/>
+                <w:lang w:val="en-US" w:eastAsia="ru-RU"/>
+              </w:rPr>
+              <w:t xml:space="preserve"> }}</w:t>
             </w:r>
           </w:p>
         </w:tc>
@@ -834,7 +1028,29 @@
                 <w:color w:val="000000"/>
                 <w:lang w:val="en-US" w:eastAsia="ru-RU"/>
               </w:rPr>
-              <w:t>{{ protected_areas_of_forests }}</w:t>
+              <w:t xml:space="preserve">{{ </w:t>
+            </w:r>
+            <w:proofErr w:type="spellStart"/>
+            <w:r>
+              <w:rPr>
+                <w:rFonts w:ascii="Times New Roman" w:eastAsia="Times New Roman" w:hAnsi="Times New Roman" w:cs="Times New Roman"/>
+                <w:i/>
+                <w:iCs/>
+                <w:color w:val="000000"/>
+                <w:lang w:val="en-US" w:eastAsia="ru-RU"/>
+              </w:rPr>
+              <w:t>protected_areas_of_forests</w:t>
+            </w:r>
+            <w:proofErr w:type="spellEnd"/>
+            <w:r>
+              <w:rPr>
+                <w:rFonts w:ascii="Times New Roman" w:eastAsia="Times New Roman" w:hAnsi="Times New Roman" w:cs="Times New Roman"/>
+                <w:i/>
+                <w:iCs/>
+                <w:color w:val="000000"/>
+                <w:lang w:val="en-US" w:eastAsia="ru-RU"/>
+              </w:rPr>
+              <w:t xml:space="preserve"> }}</w:t>
             </w:r>
           </w:p>
         </w:tc>
@@ -920,7 +1136,29 @@
                 <w:color w:val="000000"/>
                 <w:lang w:val="en-US" w:eastAsia="ru-RU"/>
               </w:rPr>
-              <w:t>{{ rent_area }}</w:t>
+              <w:t xml:space="preserve">{{ </w:t>
+            </w:r>
+            <w:proofErr w:type="spellStart"/>
+            <w:r>
+              <w:rPr>
+                <w:rFonts w:ascii="Times New Roman" w:eastAsia="Times New Roman" w:hAnsi="Times New Roman" w:cs="Times New Roman"/>
+                <w:i/>
+                <w:iCs/>
+                <w:color w:val="000000"/>
+                <w:lang w:val="en-US" w:eastAsia="ru-RU"/>
+              </w:rPr>
+              <w:t>rent_area</w:t>
+            </w:r>
+            <w:proofErr w:type="spellEnd"/>
+            <w:r>
+              <w:rPr>
+                <w:rFonts w:ascii="Times New Roman" w:eastAsia="Times New Roman" w:hAnsi="Times New Roman" w:cs="Times New Roman"/>
+                <w:i/>
+                <w:iCs/>
+                <w:color w:val="000000"/>
+                <w:lang w:val="en-US" w:eastAsia="ru-RU"/>
+              </w:rPr>
+              <w:t xml:space="preserve"> }}</w:t>
             </w:r>
           </w:p>
         </w:tc>
@@ -1084,6 +1322,7 @@
               </w:rPr>
               <w:t xml:space="preserve">{{ </w:t>
             </w:r>
+            <w:proofErr w:type="spellStart"/>
             <w:r>
               <w:rPr>
                 <w:rFonts w:ascii="Times New Roman" w:eastAsia="Times New Roman" w:hAnsi="Times New Roman" w:cs="Times New Roman"/>
@@ -1094,6 +1333,7 @@
               </w:rPr>
               <w:t>category_of_forest_fund_lands</w:t>
             </w:r>
+            <w:proofErr w:type="spellEnd"/>
             <w:r>
               <w:rPr>
                 <w:rFonts w:ascii="Times New Roman" w:eastAsia="Times New Roman" w:hAnsi="Times New Roman" w:cs="Times New Roman"/>
@@ -1273,7 +1513,25 @@
                 <w:color w:val="000000"/>
                 <w:lang w:val="en-US" w:eastAsia="ru-RU"/>
               </w:rPr>
-              <w:t>{{ lands_other }}</w:t>
+              <w:t xml:space="preserve">{{ </w:t>
+            </w:r>
+            <w:proofErr w:type="spellStart"/>
+            <w:r>
+              <w:rPr>
+                <w:rFonts w:ascii="Times New Roman" w:eastAsia="Times New Roman" w:hAnsi="Times New Roman" w:cs="Times New Roman"/>
+                <w:color w:val="000000"/>
+                <w:lang w:val="en-US" w:eastAsia="ru-RU"/>
+              </w:rPr>
+              <w:t>lands_other</w:t>
+            </w:r>
+            <w:proofErr w:type="spellEnd"/>
+            <w:r>
+              <w:rPr>
+                <w:rFonts w:ascii="Times New Roman" w:eastAsia="Times New Roman" w:hAnsi="Times New Roman" w:cs="Times New Roman"/>
+                <w:color w:val="000000"/>
+                <w:lang w:val="en-US" w:eastAsia="ru-RU"/>
+              </w:rPr>
+              <w:t xml:space="preserve"> }}</w:t>
             </w:r>
           </w:p>
           <w:p>
@@ -1313,7 +1571,23 @@
                 <w:rFonts w:ascii="Times New Roman" w:hAnsi="Times New Roman" w:cs="Times New Roman"/>
                 <w:lang w:val="en-US"/>
               </w:rPr>
-              <w:t>{% endif %}</w:t>
+              <w:t xml:space="preserve">{% </w:t>
+            </w:r>
+            <w:proofErr w:type="spellStart"/>
+            <w:r>
+              <w:rPr>
+                <w:rFonts w:ascii="Times New Roman" w:hAnsi="Times New Roman" w:cs="Times New Roman"/>
+                <w:lang w:val="en-US"/>
+              </w:rPr>
+              <w:t>endif</w:t>
+            </w:r>
+            <w:proofErr w:type="spellEnd"/>
+            <w:r>
+              <w:rPr>
+                <w:rFonts w:ascii="Times New Roman" w:hAnsi="Times New Roman" w:cs="Times New Roman"/>
+                <w:lang w:val="en-US"/>
+              </w:rPr>
+              <w:t xml:space="preserve"> %}</w:t>
             </w:r>
           </w:p>
         </w:tc>
@@ -1372,8 +1646,18 @@
                 <w:color w:val="000000"/>
                 <w:lang w:eastAsia="ru-RU"/>
               </w:rPr>
-              <w:t>Способ лесовосстановления</w:t>
-            </w:r>
+              <w:t xml:space="preserve">Способ </w:t>
+            </w:r>
+            <w:proofErr w:type="spellStart"/>
+            <w:r>
+              <w:rPr>
+                <w:rFonts w:ascii="Times New Roman" w:eastAsia="Times New Roman" w:hAnsi="Times New Roman" w:cs="Times New Roman"/>
+                <w:color w:val="000000"/>
+                <w:lang w:eastAsia="ru-RU"/>
+              </w:rPr>
+              <w:t>лесовосстановления</w:t>
+            </w:r>
+            <w:proofErr w:type="spellEnd"/>
           </w:p>
         </w:tc>
         <w:tc>
@@ -1404,7 +1688,29 @@
                 <w:color w:val="000000"/>
                 <w:lang w:val="en-US" w:eastAsia="ru-RU"/>
               </w:rPr>
-              <w:t>{{ method_of_reforestation }}</w:t>
+              <w:t xml:space="preserve">{{ </w:t>
+            </w:r>
+            <w:proofErr w:type="spellStart"/>
+            <w:r>
+              <w:rPr>
+                <w:rFonts w:ascii="Times New Roman" w:eastAsia="Times New Roman" w:hAnsi="Times New Roman" w:cs="Times New Roman"/>
+                <w:i/>
+                <w:iCs/>
+                <w:color w:val="000000"/>
+                <w:lang w:val="en-US" w:eastAsia="ru-RU"/>
+              </w:rPr>
+              <w:t>method_of_reforestation</w:t>
+            </w:r>
+            <w:proofErr w:type="spellEnd"/>
+            <w:r>
+              <w:rPr>
+                <w:rFonts w:ascii="Times New Roman" w:eastAsia="Times New Roman" w:hAnsi="Times New Roman" w:cs="Times New Roman"/>
+                <w:i/>
+                <w:iCs/>
+                <w:color w:val="000000"/>
+                <w:lang w:val="en-US" w:eastAsia="ru-RU"/>
+              </w:rPr>
+              <w:t xml:space="preserve"> }}</w:t>
             </w:r>
           </w:p>
         </w:tc>
@@ -1461,7 +1767,25 @@
                 <w:color w:val="000000"/>
                 <w:lang w:eastAsia="ru-RU"/>
               </w:rPr>
-              <w:t>Срок проведения лесовосстановления (лесоразведения), месяц, год</w:t>
+              <w:t xml:space="preserve">Срок проведения </w:t>
+            </w:r>
+            <w:proofErr w:type="spellStart"/>
+            <w:r>
+              <w:rPr>
+                <w:rFonts w:ascii="Times New Roman" w:eastAsia="Times New Roman" w:hAnsi="Times New Roman" w:cs="Times New Roman"/>
+                <w:color w:val="000000"/>
+                <w:lang w:eastAsia="ru-RU"/>
+              </w:rPr>
+              <w:t>лесовосстановления</w:t>
+            </w:r>
+            <w:proofErr w:type="spellEnd"/>
+            <w:r>
+              <w:rPr>
+                <w:rFonts w:ascii="Times New Roman" w:eastAsia="Times New Roman" w:hAnsi="Times New Roman" w:cs="Times New Roman"/>
+                <w:color w:val="000000"/>
+                <w:lang w:eastAsia="ru-RU"/>
+              </w:rPr>
+              <w:t xml:space="preserve"> (лесоразведения), месяц, год</w:t>
             </w:r>
           </w:p>
         </w:tc>
@@ -1497,6 +1821,7 @@
               </w:rPr>
               <w:t xml:space="preserve">{{ </w:t>
             </w:r>
+            <w:proofErr w:type="spellStart"/>
             <w:r>
               <w:rPr>
                 <w:rFonts w:ascii="Times New Roman" w:eastAsia="Times New Roman" w:hAnsi="Times New Roman" w:cs="Times New Roman"/>
@@ -1507,6 +1832,7 @@
               </w:rPr>
               <w:t>time_of_reforestation</w:t>
             </w:r>
+            <w:proofErr w:type="spellEnd"/>
             <w:r>
               <w:rPr>
                 <w:rFonts w:ascii="Times New Roman" w:eastAsia="Times New Roman" w:hAnsi="Times New Roman" w:cs="Times New Roman"/>
@@ -1604,6 +1930,7 @@
               </w:rPr>
               <w:t xml:space="preserve">{{  </w:t>
             </w:r>
+            <w:proofErr w:type="spellStart"/>
             <w:r>
               <w:rPr>
                 <w:rFonts w:ascii="Times New Roman" w:eastAsia="Times New Roman" w:hAnsi="Times New Roman" w:cs="Times New Roman"/>
@@ -1614,6 +1941,7 @@
               </w:rPr>
               <w:t>forest_conditions</w:t>
             </w:r>
+            <w:proofErr w:type="spellEnd"/>
             <w:r>
               <w:rPr>
                 <w:rFonts w:ascii="Times New Roman" w:eastAsia="Times New Roman" w:hAnsi="Times New Roman" w:cs="Times New Roman"/>
@@ -1687,7 +2015,29 @@
                 <w:color w:val="000000"/>
                 <w:lang w:val="en-US" w:eastAsia="ru-RU"/>
               </w:rPr>
-              <w:t>{{ forest_type }}</w:t>
+              <w:t xml:space="preserve">{{ </w:t>
+            </w:r>
+            <w:proofErr w:type="spellStart"/>
+            <w:r>
+              <w:rPr>
+                <w:rFonts w:ascii="Times New Roman" w:eastAsia="Times New Roman" w:hAnsi="Times New Roman" w:cs="Times New Roman"/>
+                <w:i/>
+                <w:iCs/>
+                <w:color w:val="000000"/>
+                <w:lang w:val="en-US" w:eastAsia="ru-RU"/>
+              </w:rPr>
+              <w:t>forest_type</w:t>
+            </w:r>
+            <w:proofErr w:type="spellEnd"/>
+            <w:r>
+              <w:rPr>
+                <w:rFonts w:ascii="Times New Roman" w:eastAsia="Times New Roman" w:hAnsi="Times New Roman" w:cs="Times New Roman"/>
+                <w:i/>
+                <w:iCs/>
+                <w:color w:val="000000"/>
+                <w:lang w:val="en-US" w:eastAsia="ru-RU"/>
+              </w:rPr>
+              <w:t xml:space="preserve"> }}</w:t>
             </w:r>
           </w:p>
         </w:tc>
@@ -1921,7 +2271,25 @@
                 <w:color w:val="000000"/>
                 <w:lang w:eastAsia="ru-RU"/>
               </w:rPr>
-              <w:t xml:space="preserve"> отнесения земель, предназначенных для лесовосстановления к землям, на которых</w:t>
+              <w:t xml:space="preserve"> отнесения земель, предназначенных для </w:t>
+            </w:r>
+            <w:proofErr w:type="spellStart"/>
+            <w:r>
+              <w:rPr>
+                <w:rFonts w:ascii="Times New Roman" w:eastAsia="Times New Roman" w:hAnsi="Times New Roman" w:cs="Times New Roman"/>
+                <w:color w:val="000000"/>
+                <w:lang w:eastAsia="ru-RU"/>
+              </w:rPr>
+              <w:t>лесовосстановления</w:t>
+            </w:r>
+            <w:proofErr w:type="spellEnd"/>
+            <w:r>
+              <w:rPr>
+                <w:rFonts w:ascii="Times New Roman" w:eastAsia="Times New Roman" w:hAnsi="Times New Roman" w:cs="Times New Roman"/>
+                <w:color w:val="000000"/>
+                <w:lang w:eastAsia="ru-RU"/>
+              </w:rPr>
+              <w:t xml:space="preserve"> к землям, на которых</w:t>
             </w:r>
           </w:p>
         </w:tc>
@@ -1965,8 +2333,16 @@
               <w:rPr>
                 <w:rFonts w:ascii="Times New Roman" w:hAnsi="Times New Roman" w:cs="Times New Roman"/>
               </w:rPr>
-              <w:t>расположены леса от</w:t>
-            </w:r>
+              <w:t xml:space="preserve">расположены леса </w:t>
+            </w:r>
+            <w:proofErr w:type="gramStart"/>
+            <w:r>
+              <w:rPr>
+                <w:rFonts w:ascii="Times New Roman" w:hAnsi="Times New Roman" w:cs="Times New Roman"/>
+              </w:rPr>
+              <w:t>от</w:t>
+            </w:r>
+            <w:proofErr w:type="gramEnd"/>
           </w:p>
         </w:tc>
         <w:tc>
@@ -2027,7 +2403,29 @@
                 <w:color w:val="000000"/>
                 <w:lang w:val="en-US" w:eastAsia="ru-RU"/>
               </w:rPr>
-              <w:t>{{ point7number }}</w:t>
+              <w:t>{{ point7number</w:t>
+            </w:r>
+            <w:proofErr w:type="gramStart"/>
+            <w:r>
+              <w:rPr>
+                <w:rFonts w:ascii="Times New Roman" w:eastAsia="Times New Roman" w:hAnsi="Times New Roman" w:cs="Times New Roman"/>
+                <w:i/>
+                <w:iCs/>
+                <w:color w:val="000000"/>
+                <w:lang w:val="en-US" w:eastAsia="ru-RU"/>
+              </w:rPr>
+              <w:t xml:space="preserve"> }</w:t>
+            </w:r>
+            <w:proofErr w:type="gramEnd"/>
+            <w:r>
+              <w:rPr>
+                <w:rFonts w:ascii="Times New Roman" w:eastAsia="Times New Roman" w:hAnsi="Times New Roman" w:cs="Times New Roman"/>
+                <w:i/>
+                <w:iCs/>
+                <w:color w:val="000000"/>
+                <w:lang w:val="en-US" w:eastAsia="ru-RU"/>
+              </w:rPr>
+              <w:t>}</w:t>
             </w:r>
           </w:p>
         </w:tc>
@@ -2422,13 +2820,23 @@
                 <w:lang w:val="en-US" w:eastAsia="ru-RU"/>
               </w:rPr>
             </w:pPr>
-            <w:r>
-              <w:rPr>
-                <w:rFonts w:ascii="Times New Roman" w:eastAsia="Times New Roman" w:hAnsi="Times New Roman" w:cs="Times New Roman"/>
-                <w:color w:val="000000"/>
-                <w:lang w:eastAsia="ru-RU"/>
-              </w:rPr>
-              <w:t>м³/га</w:t>
+            <w:proofErr w:type="gramStart"/>
+            <w:r>
+              <w:rPr>
+                <w:rFonts w:ascii="Times New Roman" w:eastAsia="Times New Roman" w:hAnsi="Times New Roman" w:cs="Times New Roman"/>
+                <w:color w:val="000000"/>
+                <w:lang w:eastAsia="ru-RU"/>
+              </w:rPr>
+              <w:t>м</w:t>
+            </w:r>
+            <w:proofErr w:type="gramEnd"/>
+            <w:r>
+              <w:rPr>
+                <w:rFonts w:ascii="Times New Roman" w:eastAsia="Times New Roman" w:hAnsi="Times New Roman" w:cs="Times New Roman"/>
+                <w:color w:val="000000"/>
+                <w:lang w:eastAsia="ru-RU"/>
+              </w:rPr>
+              <w:t>³/га</w:t>
             </w:r>
           </w:p>
         </w:tc>
@@ -2665,8 +3073,20 @@
                 <w:szCs w:val="20"/>
                 <w:lang w:eastAsia="ru-RU"/>
               </w:rPr>
-              <w:t>Средняя высота, м</w:t>
-            </w:r>
+              <w:t xml:space="preserve">Средняя высота, </w:t>
+            </w:r>
+            <w:proofErr w:type="gramStart"/>
+            <w:r>
+              <w:rPr>
+                <w:rFonts w:ascii="Times New Roman" w:eastAsia="Times New Roman" w:hAnsi="Times New Roman" w:cs="Times New Roman"/>
+                <w:color w:val="000000"/>
+                <w:sz w:val="20"/>
+                <w:szCs w:val="20"/>
+                <w:lang w:eastAsia="ru-RU"/>
+              </w:rPr>
+              <w:t>м</w:t>
+            </w:r>
+            <w:proofErr w:type="gramEnd"/>
           </w:p>
         </w:tc>
         <w:tc>
@@ -2703,8 +3123,20 @@
                 <w:szCs w:val="20"/>
                 <w:lang w:eastAsia="ru-RU"/>
               </w:rPr>
-              <w:t>Средний диаметр, см</w:t>
-            </w:r>
+              <w:t xml:space="preserve">Средний диаметр, </w:t>
+            </w:r>
+            <w:proofErr w:type="gramStart"/>
+            <w:r>
+              <w:rPr>
+                <w:rFonts w:ascii="Times New Roman" w:eastAsia="Times New Roman" w:hAnsi="Times New Roman" w:cs="Times New Roman"/>
+                <w:color w:val="000000"/>
+                <w:sz w:val="20"/>
+                <w:szCs w:val="20"/>
+                <w:lang w:eastAsia="ru-RU"/>
+              </w:rPr>
+              <w:t>см</w:t>
+            </w:r>
+            <w:proofErr w:type="gramEnd"/>
           </w:p>
         </w:tc>
         <w:tc>
@@ -2741,8 +3173,20 @@
                 <w:szCs w:val="20"/>
                 <w:lang w:eastAsia="ru-RU"/>
               </w:rPr>
-              <w:t>Количество учтенных древесных растений, шт./га</w:t>
-            </w:r>
+              <w:t>Количество учтенных древесных растений, шт./</w:t>
+            </w:r>
+            <w:proofErr w:type="gramStart"/>
+            <w:r>
+              <w:rPr>
+                <w:rFonts w:ascii="Times New Roman" w:eastAsia="Times New Roman" w:hAnsi="Times New Roman" w:cs="Times New Roman"/>
+                <w:color w:val="000000"/>
+                <w:sz w:val="20"/>
+                <w:szCs w:val="20"/>
+                <w:lang w:eastAsia="ru-RU"/>
+              </w:rPr>
+              <w:t>га</w:t>
+            </w:r>
+            <w:proofErr w:type="gramEnd"/>
           </w:p>
         </w:tc>
       </w:tr>
@@ -2783,7 +3227,73 @@
                 <w:szCs w:val="20"/>
                 <w:lang w:val="en-US" w:eastAsia="ru-RU"/>
               </w:rPr>
-              <w:t>{%tr for i in coeff %}</w:t>
+              <w:t>{%</w:t>
+            </w:r>
+            <w:proofErr w:type="spellStart"/>
+            <w:r>
+              <w:rPr>
+                <w:rFonts w:ascii="Times New Roman" w:eastAsia="Times New Roman" w:hAnsi="Times New Roman" w:cs="Times New Roman"/>
+                <w:color w:val="000000"/>
+                <w:sz w:val="20"/>
+                <w:szCs w:val="20"/>
+                <w:lang w:val="en-US" w:eastAsia="ru-RU"/>
+              </w:rPr>
+              <w:t>tr</w:t>
+            </w:r>
+            <w:proofErr w:type="spellEnd"/>
+            <w:r>
+              <w:rPr>
+                <w:rFonts w:ascii="Times New Roman" w:eastAsia="Times New Roman" w:hAnsi="Times New Roman" w:cs="Times New Roman"/>
+                <w:color w:val="000000"/>
+                <w:sz w:val="20"/>
+                <w:szCs w:val="20"/>
+                <w:lang w:val="en-US" w:eastAsia="ru-RU"/>
+              </w:rPr>
+              <w:t xml:space="preserve"> for </w:t>
+            </w:r>
+            <w:proofErr w:type="spellStart"/>
+            <w:r>
+              <w:rPr>
+                <w:rFonts w:ascii="Times New Roman" w:eastAsia="Times New Roman" w:hAnsi="Times New Roman" w:cs="Times New Roman"/>
+                <w:color w:val="000000"/>
+                <w:sz w:val="20"/>
+                <w:szCs w:val="20"/>
+                <w:lang w:val="en-US" w:eastAsia="ru-RU"/>
+              </w:rPr>
+              <w:t>i</w:t>
+            </w:r>
+            <w:proofErr w:type="spellEnd"/>
+            <w:r>
+              <w:rPr>
+                <w:rFonts w:ascii="Times New Roman" w:eastAsia="Times New Roman" w:hAnsi="Times New Roman" w:cs="Times New Roman"/>
+                <w:color w:val="000000"/>
+                <w:sz w:val="20"/>
+                <w:szCs w:val="20"/>
+                <w:lang w:val="en-US" w:eastAsia="ru-RU"/>
+              </w:rPr>
+              <w:t xml:space="preserve"> in </w:t>
+            </w:r>
+            <w:proofErr w:type="spellStart"/>
+            <w:r>
+              <w:rPr>
+                <w:rFonts w:ascii="Times New Roman" w:eastAsia="Times New Roman" w:hAnsi="Times New Roman" w:cs="Times New Roman"/>
+                <w:color w:val="000000"/>
+                <w:sz w:val="20"/>
+                <w:szCs w:val="20"/>
+                <w:lang w:val="en-US" w:eastAsia="ru-RU"/>
+              </w:rPr>
+              <w:t>coeff</w:t>
+            </w:r>
+            <w:proofErr w:type="spellEnd"/>
+            <w:r>
+              <w:rPr>
+                <w:rFonts w:ascii="Times New Roman" w:eastAsia="Times New Roman" w:hAnsi="Times New Roman" w:cs="Times New Roman"/>
+                <w:color w:val="000000"/>
+                <w:sz w:val="20"/>
+                <w:szCs w:val="20"/>
+                <w:lang w:val="en-US" w:eastAsia="ru-RU"/>
+              </w:rPr>
+              <w:t xml:space="preserve"> %}</w:t>
             </w:r>
           </w:p>
         </w:tc>
@@ -2826,7 +3336,29 @@
                 <w:szCs w:val="20"/>
                 <w:lang w:val="en-US" w:eastAsia="ru-RU"/>
               </w:rPr>
-              <w:t>{{ i.ratio }}</w:t>
+              <w:t xml:space="preserve">{{ </w:t>
+            </w:r>
+            <w:proofErr w:type="spellStart"/>
+            <w:r>
+              <w:rPr>
+                <w:rFonts w:ascii="Times New Roman" w:eastAsia="Times New Roman" w:hAnsi="Times New Roman" w:cs="Times New Roman"/>
+                <w:color w:val="000000"/>
+                <w:sz w:val="20"/>
+                <w:szCs w:val="20"/>
+                <w:lang w:val="en-US" w:eastAsia="ru-RU"/>
+              </w:rPr>
+              <w:t>i.ratio</w:t>
+            </w:r>
+            <w:proofErr w:type="spellEnd"/>
+            <w:r>
+              <w:rPr>
+                <w:rFonts w:ascii="Times New Roman" w:eastAsia="Times New Roman" w:hAnsi="Times New Roman" w:cs="Times New Roman"/>
+                <w:color w:val="000000"/>
+                <w:sz w:val="20"/>
+                <w:szCs w:val="20"/>
+                <w:lang w:val="en-US" w:eastAsia="ru-RU"/>
+              </w:rPr>
+              <w:t xml:space="preserve"> }}</w:t>
             </w:r>
           </w:p>
         </w:tc>
@@ -2864,7 +3396,29 @@
                 <w:szCs w:val="20"/>
                 <w:lang w:val="en-US" w:eastAsia="ru-RU"/>
               </w:rPr>
-              <w:t>{{ i.breed }}</w:t>
+              <w:t xml:space="preserve">{{ </w:t>
+            </w:r>
+            <w:proofErr w:type="spellStart"/>
+            <w:r>
+              <w:rPr>
+                <w:rFonts w:ascii="Times New Roman" w:eastAsia="Times New Roman" w:hAnsi="Times New Roman" w:cs="Times New Roman"/>
+                <w:color w:val="000000"/>
+                <w:sz w:val="20"/>
+                <w:szCs w:val="20"/>
+                <w:lang w:val="en-US" w:eastAsia="ru-RU"/>
+              </w:rPr>
+              <w:t>i.breed</w:t>
+            </w:r>
+            <w:proofErr w:type="spellEnd"/>
+            <w:r>
+              <w:rPr>
+                <w:rFonts w:ascii="Times New Roman" w:eastAsia="Times New Roman" w:hAnsi="Times New Roman" w:cs="Times New Roman"/>
+                <w:color w:val="000000"/>
+                <w:sz w:val="20"/>
+                <w:szCs w:val="20"/>
+                <w:lang w:val="en-US" w:eastAsia="ru-RU"/>
+              </w:rPr>
+              <w:t xml:space="preserve"> }}</w:t>
             </w:r>
           </w:p>
         </w:tc>
@@ -2909,7 +3463,27 @@
                 <w:szCs w:val="20"/>
                 <w:lang w:val="en-US" w:eastAsia="ru-RU"/>
               </w:rPr>
-              <w:t>{{ i.age }}</w:t>
+              <w:t xml:space="preserve">{{ </w:t>
+            </w:r>
+            <w:proofErr w:type="spellStart"/>
+            <w:r>
+              <w:rPr>
+                <w:rFonts w:ascii="Times New Roman" w:eastAsia="Times New Roman" w:hAnsi="Times New Roman" w:cs="Times New Roman"/>
+                <w:sz w:val="20"/>
+                <w:szCs w:val="20"/>
+                <w:lang w:val="en-US" w:eastAsia="ru-RU"/>
+              </w:rPr>
+              <w:t>i.age</w:t>
+            </w:r>
+            <w:proofErr w:type="spellEnd"/>
+            <w:r>
+              <w:rPr>
+                <w:rFonts w:ascii="Times New Roman" w:eastAsia="Times New Roman" w:hAnsi="Times New Roman" w:cs="Times New Roman"/>
+                <w:sz w:val="20"/>
+                <w:szCs w:val="20"/>
+                <w:lang w:val="en-US" w:eastAsia="ru-RU"/>
+              </w:rPr>
+              <w:t xml:space="preserve"> }}</w:t>
             </w:r>
           </w:p>
         </w:tc>
@@ -2954,7 +3528,27 @@
                 <w:szCs w:val="20"/>
                 <w:lang w:val="en-US" w:eastAsia="ru-RU"/>
               </w:rPr>
-              <w:t>{{ i.avg_height }}</w:t>
+              <w:t xml:space="preserve">{{ </w:t>
+            </w:r>
+            <w:proofErr w:type="spellStart"/>
+            <w:r>
+              <w:rPr>
+                <w:rFonts w:ascii="Times New Roman" w:eastAsia="Times New Roman" w:hAnsi="Times New Roman" w:cs="Times New Roman"/>
+                <w:sz w:val="20"/>
+                <w:szCs w:val="20"/>
+                <w:lang w:val="en-US" w:eastAsia="ru-RU"/>
+              </w:rPr>
+              <w:t>i.avg_height</w:t>
+            </w:r>
+            <w:proofErr w:type="spellEnd"/>
+            <w:r>
+              <w:rPr>
+                <w:rFonts w:ascii="Times New Roman" w:eastAsia="Times New Roman" w:hAnsi="Times New Roman" w:cs="Times New Roman"/>
+                <w:sz w:val="20"/>
+                <w:szCs w:val="20"/>
+                <w:lang w:val="en-US" w:eastAsia="ru-RU"/>
+              </w:rPr>
+              <w:t xml:space="preserve"> }}</w:t>
             </w:r>
           </w:p>
         </w:tc>
@@ -2990,7 +3584,27 @@
                 <w:szCs w:val="20"/>
                 <w:lang w:val="en-US" w:eastAsia="ru-RU"/>
               </w:rPr>
-              <w:t>{{ i.avg_diametr }}</w:t>
+              <w:t xml:space="preserve">{{ </w:t>
+            </w:r>
+            <w:proofErr w:type="spellStart"/>
+            <w:r>
+              <w:rPr>
+                <w:rFonts w:ascii="Times New Roman" w:eastAsia="Times New Roman" w:hAnsi="Times New Roman" w:cs="Times New Roman"/>
+                <w:sz w:val="20"/>
+                <w:szCs w:val="20"/>
+                <w:lang w:val="en-US" w:eastAsia="ru-RU"/>
+              </w:rPr>
+              <w:t>i.avg_diametr</w:t>
+            </w:r>
+            <w:proofErr w:type="spellEnd"/>
+            <w:r>
+              <w:rPr>
+                <w:rFonts w:ascii="Times New Roman" w:eastAsia="Times New Roman" w:hAnsi="Times New Roman" w:cs="Times New Roman"/>
+                <w:sz w:val="20"/>
+                <w:szCs w:val="20"/>
+                <w:lang w:val="en-US" w:eastAsia="ru-RU"/>
+              </w:rPr>
+              <w:t xml:space="preserve"> }}</w:t>
             </w:r>
           </w:p>
         </w:tc>
@@ -3026,7 +3640,27 @@
                 <w:szCs w:val="20"/>
                 <w:lang w:val="en-US" w:eastAsia="ru-RU"/>
               </w:rPr>
-              <w:t>{{ i.count_plants }}</w:t>
+              <w:t xml:space="preserve">{{ </w:t>
+            </w:r>
+            <w:proofErr w:type="spellStart"/>
+            <w:r>
+              <w:rPr>
+                <w:rFonts w:ascii="Times New Roman" w:eastAsia="Times New Roman" w:hAnsi="Times New Roman" w:cs="Times New Roman"/>
+                <w:sz w:val="20"/>
+                <w:szCs w:val="20"/>
+                <w:lang w:val="en-US" w:eastAsia="ru-RU"/>
+              </w:rPr>
+              <w:t>i.count_plants</w:t>
+            </w:r>
+            <w:proofErr w:type="spellEnd"/>
+            <w:r>
+              <w:rPr>
+                <w:rFonts w:ascii="Times New Roman" w:eastAsia="Times New Roman" w:hAnsi="Times New Roman" w:cs="Times New Roman"/>
+                <w:sz w:val="20"/>
+                <w:szCs w:val="20"/>
+                <w:lang w:val="en-US" w:eastAsia="ru-RU"/>
+              </w:rPr>
+              <w:t xml:space="preserve"> }}</w:t>
             </w:r>
           </w:p>
         </w:tc>
@@ -3068,7 +3702,51 @@
                 <w:szCs w:val="20"/>
                 <w:lang w:val="en-US" w:eastAsia="ru-RU"/>
               </w:rPr>
-              <w:t>{%tr endfor %}</w:t>
+              <w:t>{%</w:t>
+            </w:r>
+            <w:proofErr w:type="spellStart"/>
+            <w:r>
+              <w:rPr>
+                <w:rFonts w:ascii="Times New Roman" w:eastAsia="Times New Roman" w:hAnsi="Times New Roman" w:cs="Times New Roman"/>
+                <w:color w:val="000000"/>
+                <w:sz w:val="20"/>
+                <w:szCs w:val="20"/>
+                <w:lang w:val="en-US" w:eastAsia="ru-RU"/>
+              </w:rPr>
+              <w:t>tr</w:t>
+            </w:r>
+            <w:proofErr w:type="spellEnd"/>
+            <w:r>
+              <w:rPr>
+                <w:rFonts w:ascii="Times New Roman" w:eastAsia="Times New Roman" w:hAnsi="Times New Roman" w:cs="Times New Roman"/>
+                <w:color w:val="000000"/>
+                <w:sz w:val="20"/>
+                <w:szCs w:val="20"/>
+                <w:lang w:val="en-US" w:eastAsia="ru-RU"/>
+              </w:rPr>
+              <w:t xml:space="preserve"> </w:t>
+            </w:r>
+            <w:proofErr w:type="spellStart"/>
+            <w:r>
+              <w:rPr>
+                <w:rFonts w:ascii="Times New Roman" w:eastAsia="Times New Roman" w:hAnsi="Times New Roman" w:cs="Times New Roman"/>
+                <w:color w:val="000000"/>
+                <w:sz w:val="20"/>
+                <w:szCs w:val="20"/>
+                <w:lang w:val="en-US" w:eastAsia="ru-RU"/>
+              </w:rPr>
+              <w:t>endfor</w:t>
+            </w:r>
+            <w:proofErr w:type="spellEnd"/>
+            <w:r>
+              <w:rPr>
+                <w:rFonts w:ascii="Times New Roman" w:eastAsia="Times New Roman" w:hAnsi="Times New Roman" w:cs="Times New Roman"/>
+                <w:color w:val="000000"/>
+                <w:sz w:val="20"/>
+                <w:szCs w:val="20"/>
+                <w:lang w:val="en-US" w:eastAsia="ru-RU"/>
+              </w:rPr>
+              <w:t xml:space="preserve"> %}</w:t>
             </w:r>
           </w:p>
         </w:tc>
@@ -3976,7 +4654,29 @@
                 <w:color w:val="000000"/>
                 <w:lang w:val="en-US" w:eastAsia="ru-RU"/>
               </w:rPr>
-              <w:t>{{ square_one_sample_area }}</w:t>
+              <w:t xml:space="preserve">{{ </w:t>
+            </w:r>
+            <w:proofErr w:type="spellStart"/>
+            <w:r>
+              <w:rPr>
+                <w:rFonts w:ascii="Times New Roman" w:eastAsia="Times New Roman" w:hAnsi="Times New Roman" w:cs="Times New Roman"/>
+                <w:i/>
+                <w:iCs/>
+                <w:color w:val="000000"/>
+                <w:lang w:val="en-US" w:eastAsia="ru-RU"/>
+              </w:rPr>
+              <w:t>square_one_sample_area</w:t>
+            </w:r>
+            <w:proofErr w:type="spellEnd"/>
+            <w:r>
+              <w:rPr>
+                <w:rFonts w:ascii="Times New Roman" w:eastAsia="Times New Roman" w:hAnsi="Times New Roman" w:cs="Times New Roman"/>
+                <w:i/>
+                <w:iCs/>
+                <w:color w:val="000000"/>
+                <w:lang w:val="en-US" w:eastAsia="ru-RU"/>
+              </w:rPr>
+              <w:t xml:space="preserve"> }}</w:t>
             </w:r>
           </w:p>
         </w:tc>
@@ -4242,7 +4942,29 @@
                 <w:color w:val="000000"/>
                 <w:lang w:val="en-US" w:eastAsia="ru-RU"/>
               </w:rPr>
-              <w:t>{{ count_sample_area }}</w:t>
+              <w:t xml:space="preserve">{{ </w:t>
+            </w:r>
+            <w:proofErr w:type="spellStart"/>
+            <w:r>
+              <w:rPr>
+                <w:rFonts w:ascii="Times New Roman" w:eastAsia="Times New Roman" w:hAnsi="Times New Roman" w:cs="Times New Roman"/>
+                <w:i/>
+                <w:iCs/>
+                <w:color w:val="000000"/>
+                <w:lang w:val="en-US" w:eastAsia="ru-RU"/>
+              </w:rPr>
+              <w:t>count_sample_area</w:t>
+            </w:r>
+            <w:proofErr w:type="spellEnd"/>
+            <w:r>
+              <w:rPr>
+                <w:rFonts w:ascii="Times New Roman" w:eastAsia="Times New Roman" w:hAnsi="Times New Roman" w:cs="Times New Roman"/>
+                <w:i/>
+                <w:iCs/>
+                <w:color w:val="000000"/>
+                <w:lang w:val="en-US" w:eastAsia="ru-RU"/>
+              </w:rPr>
+              <w:t xml:space="preserve"> }}</w:t>
             </w:r>
           </w:p>
         </w:tc>
@@ -4648,7 +5370,51 @@
                 <w:color w:val="000000"/>
                 <w:lang w:val="en-US" w:eastAsia="ru-RU"/>
               </w:rPr>
-              <w:t>{%tr for i in samples %}</w:t>
+              <w:t>{%</w:t>
+            </w:r>
+            <w:proofErr w:type="spellStart"/>
+            <w:r>
+              <w:rPr>
+                <w:rFonts w:ascii="Times New Roman" w:eastAsia="Times New Roman" w:hAnsi="Times New Roman" w:cs="Times New Roman"/>
+                <w:i/>
+                <w:iCs/>
+                <w:color w:val="000000"/>
+                <w:lang w:val="en-US" w:eastAsia="ru-RU"/>
+              </w:rPr>
+              <w:t>tr</w:t>
+            </w:r>
+            <w:proofErr w:type="spellEnd"/>
+            <w:r>
+              <w:rPr>
+                <w:rFonts w:ascii="Times New Roman" w:eastAsia="Times New Roman" w:hAnsi="Times New Roman" w:cs="Times New Roman"/>
+                <w:i/>
+                <w:iCs/>
+                <w:color w:val="000000"/>
+                <w:lang w:val="en-US" w:eastAsia="ru-RU"/>
+              </w:rPr>
+              <w:t xml:space="preserve"> for </w:t>
+            </w:r>
+            <w:proofErr w:type="spellStart"/>
+            <w:r>
+              <w:rPr>
+                <w:rFonts w:ascii="Times New Roman" w:eastAsia="Times New Roman" w:hAnsi="Times New Roman" w:cs="Times New Roman"/>
+                <w:i/>
+                <w:iCs/>
+                <w:color w:val="000000"/>
+                <w:lang w:val="en-US" w:eastAsia="ru-RU"/>
+              </w:rPr>
+              <w:t>i</w:t>
+            </w:r>
+            <w:proofErr w:type="spellEnd"/>
+            <w:r>
+              <w:rPr>
+                <w:rFonts w:ascii="Times New Roman" w:eastAsia="Times New Roman" w:hAnsi="Times New Roman" w:cs="Times New Roman"/>
+                <w:i/>
+                <w:iCs/>
+                <w:color w:val="000000"/>
+                <w:lang w:val="en-US" w:eastAsia="ru-RU"/>
+              </w:rPr>
+              <w:t xml:space="preserve"> in samples %}</w:t>
             </w:r>
           </w:p>
         </w:tc>
@@ -4692,7 +5458,29 @@
                 <w:color w:val="000000"/>
                 <w:lang w:val="en-US" w:eastAsia="ru-RU"/>
               </w:rPr>
-              <w:t>{{ i.number }}</w:t>
+              <w:t xml:space="preserve">{{ </w:t>
+            </w:r>
+            <w:proofErr w:type="spellStart"/>
+            <w:r>
+              <w:rPr>
+                <w:rFonts w:ascii="Times New Roman" w:eastAsia="Times New Roman" w:hAnsi="Times New Roman" w:cs="Times New Roman"/>
+                <w:i/>
+                <w:iCs/>
+                <w:color w:val="000000"/>
+                <w:lang w:val="en-US" w:eastAsia="ru-RU"/>
+              </w:rPr>
+              <w:t>i.number</w:t>
+            </w:r>
+            <w:proofErr w:type="spellEnd"/>
+            <w:r>
+              <w:rPr>
+                <w:rFonts w:ascii="Times New Roman" w:eastAsia="Times New Roman" w:hAnsi="Times New Roman" w:cs="Times New Roman"/>
+                <w:i/>
+                <w:iCs/>
+                <w:color w:val="000000"/>
+                <w:lang w:val="en-US" w:eastAsia="ru-RU"/>
+              </w:rPr>
+              <w:t xml:space="preserve"> }}</w:t>
             </w:r>
           </w:p>
         </w:tc>
@@ -4731,7 +5519,29 @@
                 <w:color w:val="000000"/>
                 <w:lang w:val="en-US" w:eastAsia="ru-RU"/>
               </w:rPr>
-              <w:t>{{ i.latitude }}</w:t>
+              <w:t xml:space="preserve">{{ </w:t>
+            </w:r>
+            <w:proofErr w:type="spellStart"/>
+            <w:r>
+              <w:rPr>
+                <w:rFonts w:ascii="Times New Roman" w:eastAsia="Times New Roman" w:hAnsi="Times New Roman" w:cs="Times New Roman"/>
+                <w:i/>
+                <w:iCs/>
+                <w:color w:val="000000"/>
+                <w:lang w:val="en-US" w:eastAsia="ru-RU"/>
+              </w:rPr>
+              <w:t>i.latitude</w:t>
+            </w:r>
+            <w:proofErr w:type="spellEnd"/>
+            <w:r>
+              <w:rPr>
+                <w:rFonts w:ascii="Times New Roman" w:eastAsia="Times New Roman" w:hAnsi="Times New Roman" w:cs="Times New Roman"/>
+                <w:i/>
+                <w:iCs/>
+                <w:color w:val="000000"/>
+                <w:lang w:val="en-US" w:eastAsia="ru-RU"/>
+              </w:rPr>
+              <w:t xml:space="preserve"> }}</w:t>
             </w:r>
           </w:p>
         </w:tc>
@@ -4770,7 +5580,29 @@
                 <w:color w:val="000000"/>
                 <w:lang w:val="en-US" w:eastAsia="ru-RU"/>
               </w:rPr>
-              <w:t>{{ i.longitude }}</w:t>
+              <w:t xml:space="preserve">{{ </w:t>
+            </w:r>
+            <w:proofErr w:type="spellStart"/>
+            <w:r>
+              <w:rPr>
+                <w:rFonts w:ascii="Times New Roman" w:eastAsia="Times New Roman" w:hAnsi="Times New Roman" w:cs="Times New Roman"/>
+                <w:i/>
+                <w:iCs/>
+                <w:color w:val="000000"/>
+                <w:lang w:val="en-US" w:eastAsia="ru-RU"/>
+              </w:rPr>
+              <w:t>i.longitude</w:t>
+            </w:r>
+            <w:proofErr w:type="spellEnd"/>
+            <w:r>
+              <w:rPr>
+                <w:rFonts w:ascii="Times New Roman" w:eastAsia="Times New Roman" w:hAnsi="Times New Roman" w:cs="Times New Roman"/>
+                <w:i/>
+                <w:iCs/>
+                <w:color w:val="000000"/>
+                <w:lang w:val="en-US" w:eastAsia="ru-RU"/>
+              </w:rPr>
+              <w:t xml:space="preserve"> }}</w:t>
             </w:r>
           </w:p>
         </w:tc>
@@ -4813,7 +5645,51 @@
                 <w:color w:val="000000"/>
                 <w:lang w:val="en-US" w:eastAsia="ru-RU"/>
               </w:rPr>
-              <w:t>{%tr endfor %}</w:t>
+              <w:t>{%</w:t>
+            </w:r>
+            <w:proofErr w:type="spellStart"/>
+            <w:r>
+              <w:rPr>
+                <w:rFonts w:ascii="Times New Roman" w:eastAsia="Times New Roman" w:hAnsi="Times New Roman" w:cs="Times New Roman"/>
+                <w:i/>
+                <w:iCs/>
+                <w:color w:val="000000"/>
+                <w:lang w:val="en-US" w:eastAsia="ru-RU"/>
+              </w:rPr>
+              <w:t>tr</w:t>
+            </w:r>
+            <w:proofErr w:type="spellEnd"/>
+            <w:r>
+              <w:rPr>
+                <w:rFonts w:ascii="Times New Roman" w:eastAsia="Times New Roman" w:hAnsi="Times New Roman" w:cs="Times New Roman"/>
+                <w:i/>
+                <w:iCs/>
+                <w:color w:val="000000"/>
+                <w:lang w:val="en-US" w:eastAsia="ru-RU"/>
+              </w:rPr>
+              <w:t xml:space="preserve"> </w:t>
+            </w:r>
+            <w:proofErr w:type="spellStart"/>
+            <w:r>
+              <w:rPr>
+                <w:rFonts w:ascii="Times New Roman" w:eastAsia="Times New Roman" w:hAnsi="Times New Roman" w:cs="Times New Roman"/>
+                <w:i/>
+                <w:iCs/>
+                <w:color w:val="000000"/>
+                <w:lang w:val="en-US" w:eastAsia="ru-RU"/>
+              </w:rPr>
+              <w:t>endfor</w:t>
+            </w:r>
+            <w:proofErr w:type="spellEnd"/>
+            <w:r>
+              <w:rPr>
+                <w:rFonts w:ascii="Times New Roman" w:eastAsia="Times New Roman" w:hAnsi="Times New Roman" w:cs="Times New Roman"/>
+                <w:i/>
+                <w:iCs/>
+                <w:color w:val="000000"/>
+                <w:lang w:val="en-US" w:eastAsia="ru-RU"/>
+              </w:rPr>
+              <w:t xml:space="preserve"> %}</w:t>
             </w:r>
           </w:p>
           <w:p>
@@ -5499,7 +6375,29 @@
                 <w:color w:val="000000"/>
                 <w:lang w:val="en-US" w:eastAsia="ru-RU"/>
               </w:rPr>
-              <w:t>{{ breed_composition }}</w:t>
+              <w:t xml:space="preserve">{{ </w:t>
+            </w:r>
+            <w:proofErr w:type="spellStart"/>
+            <w:r>
+              <w:rPr>
+                <w:rFonts w:ascii="Times New Roman" w:eastAsia="Times New Roman" w:hAnsi="Times New Roman" w:cs="Times New Roman"/>
+                <w:i/>
+                <w:iCs/>
+                <w:color w:val="000000"/>
+                <w:lang w:val="en-US" w:eastAsia="ru-RU"/>
+              </w:rPr>
+              <w:t>breed_composition</w:t>
+            </w:r>
+            <w:proofErr w:type="spellEnd"/>
+            <w:r>
+              <w:rPr>
+                <w:rFonts w:ascii="Times New Roman" w:eastAsia="Times New Roman" w:hAnsi="Times New Roman" w:cs="Times New Roman"/>
+                <w:i/>
+                <w:iCs/>
+                <w:color w:val="000000"/>
+                <w:lang w:val="en-US" w:eastAsia="ru-RU"/>
+              </w:rPr>
+              <w:t xml:space="preserve"> }}</w:t>
             </w:r>
             <w:r>
               <w:rPr>
@@ -5550,7 +6448,29 @@
                 <w:color w:val="000000"/>
                 <w:lang w:val="en-US" w:eastAsia="ru-RU"/>
               </w:rPr>
-              <w:t>{{ economy_sapling }}</w:t>
+              <w:t xml:space="preserve">{{ </w:t>
+            </w:r>
+            <w:proofErr w:type="spellStart"/>
+            <w:r>
+              <w:rPr>
+                <w:rFonts w:ascii="Times New Roman" w:eastAsia="Times New Roman" w:hAnsi="Times New Roman" w:cs="Times New Roman"/>
+                <w:i/>
+                <w:iCs/>
+                <w:color w:val="000000"/>
+                <w:lang w:val="en-US" w:eastAsia="ru-RU"/>
+              </w:rPr>
+              <w:t>economy_sapling</w:t>
+            </w:r>
+            <w:proofErr w:type="spellEnd"/>
+            <w:r>
+              <w:rPr>
+                <w:rFonts w:ascii="Times New Roman" w:eastAsia="Times New Roman" w:hAnsi="Times New Roman" w:cs="Times New Roman"/>
+                <w:i/>
+                <w:iCs/>
+                <w:color w:val="000000"/>
+                <w:lang w:val="en-US" w:eastAsia="ru-RU"/>
+              </w:rPr>
+              <w:t xml:space="preserve"> }}</w:t>
             </w:r>
           </w:p>
         </w:tc>
@@ -5669,6 +6589,7 @@
               </w:rPr>
               <w:t xml:space="preserve">{{ </w:t>
             </w:r>
+            <w:proofErr w:type="spellStart"/>
             <w:r>
               <w:rPr>
                 <w:rFonts w:ascii="Times New Roman" w:eastAsia="Times New Roman" w:hAnsi="Times New Roman" w:cs="Times New Roman"/>
@@ -5685,7 +6606,17 @@
                 <w:iCs/>
                 <w:lang w:val="en-US" w:eastAsia="ru-RU"/>
               </w:rPr>
-              <w:t>_sapling  }}</w:t>
+              <w:t>_sapling</w:t>
+            </w:r>
+            <w:proofErr w:type="spellEnd"/>
+            <w:r>
+              <w:rPr>
+                <w:rFonts w:ascii="Times New Roman" w:eastAsia="Times New Roman" w:hAnsi="Times New Roman" w:cs="Times New Roman"/>
+                <w:i/>
+                <w:iCs/>
+                <w:lang w:val="en-US" w:eastAsia="ru-RU"/>
+              </w:rPr>
+              <w:t xml:space="preserve">  }}</w:t>
             </w:r>
           </w:p>
         </w:tc>
@@ -5792,7 +6723,27 @@
                 <w:iCs/>
                 <w:lang w:val="en-US" w:eastAsia="ru-RU"/>
               </w:rPr>
-              <w:t>{{ stock_sapling }}</w:t>
+              <w:t xml:space="preserve">{{ </w:t>
+            </w:r>
+            <w:proofErr w:type="spellStart"/>
+            <w:r>
+              <w:rPr>
+                <w:rFonts w:ascii="Times New Roman" w:eastAsia="Times New Roman" w:hAnsi="Times New Roman" w:cs="Times New Roman"/>
+                <w:i/>
+                <w:iCs/>
+                <w:lang w:val="en-US" w:eastAsia="ru-RU"/>
+              </w:rPr>
+              <w:t>stock_sapling</w:t>
+            </w:r>
+            <w:proofErr w:type="spellEnd"/>
+            <w:r>
+              <w:rPr>
+                <w:rFonts w:ascii="Times New Roman" w:eastAsia="Times New Roman" w:hAnsi="Times New Roman" w:cs="Times New Roman"/>
+                <w:i/>
+                <w:iCs/>
+                <w:lang w:val="en-US" w:eastAsia="ru-RU"/>
+              </w:rPr>
+              <w:t xml:space="preserve"> }}</w:t>
             </w:r>
           </w:p>
         </w:tc>
@@ -5817,13 +6768,23 @@
                 <w:lang w:eastAsia="ru-RU"/>
               </w:rPr>
             </w:pPr>
-            <w:r>
-              <w:rPr>
-                <w:rFonts w:ascii="Times New Roman" w:eastAsia="Times New Roman" w:hAnsi="Times New Roman" w:cs="Times New Roman"/>
-                <w:color w:val="000000"/>
-                <w:lang w:eastAsia="ru-RU"/>
-              </w:rPr>
-              <w:t>м³/га</w:t>
+            <w:proofErr w:type="gramStart"/>
+            <w:r>
+              <w:rPr>
+                <w:rFonts w:ascii="Times New Roman" w:eastAsia="Times New Roman" w:hAnsi="Times New Roman" w:cs="Times New Roman"/>
+                <w:color w:val="000000"/>
+                <w:lang w:eastAsia="ru-RU"/>
+              </w:rPr>
+              <w:t>м</w:t>
+            </w:r>
+            <w:proofErr w:type="gramEnd"/>
+            <w:r>
+              <w:rPr>
+                <w:rFonts w:ascii="Times New Roman" w:eastAsia="Times New Roman" w:hAnsi="Times New Roman" w:cs="Times New Roman"/>
+                <w:color w:val="000000"/>
+                <w:lang w:eastAsia="ru-RU"/>
+              </w:rPr>
+              <w:t>³/га</w:t>
             </w:r>
           </w:p>
         </w:tc>
@@ -6423,8 +7384,20 @@
                 <w:szCs w:val="20"/>
                 <w:lang w:eastAsia="ru-RU"/>
               </w:rPr>
-              <w:t>Средняя высота, м</w:t>
-            </w:r>
+              <w:t xml:space="preserve">Средняя высота, </w:t>
+            </w:r>
+            <w:proofErr w:type="gramStart"/>
+            <w:r>
+              <w:rPr>
+                <w:rFonts w:ascii="Times New Roman" w:eastAsia="Times New Roman" w:hAnsi="Times New Roman" w:cs="Times New Roman"/>
+                <w:color w:val="000000"/>
+                <w:sz w:val="20"/>
+                <w:szCs w:val="20"/>
+                <w:lang w:eastAsia="ru-RU"/>
+              </w:rPr>
+              <w:t>м</w:t>
+            </w:r>
+            <w:proofErr w:type="gramEnd"/>
           </w:p>
         </w:tc>
         <w:tc>
@@ -6461,8 +7434,20 @@
                 <w:szCs w:val="20"/>
                 <w:lang w:eastAsia="ru-RU"/>
               </w:rPr>
-              <w:t>Средний диаметр, см</w:t>
-            </w:r>
+              <w:t xml:space="preserve">Средний диаметр, </w:t>
+            </w:r>
+            <w:proofErr w:type="gramStart"/>
+            <w:r>
+              <w:rPr>
+                <w:rFonts w:ascii="Times New Roman" w:eastAsia="Times New Roman" w:hAnsi="Times New Roman" w:cs="Times New Roman"/>
+                <w:color w:val="000000"/>
+                <w:sz w:val="20"/>
+                <w:szCs w:val="20"/>
+                <w:lang w:eastAsia="ru-RU"/>
+              </w:rPr>
+              <w:t>см</w:t>
+            </w:r>
+            <w:proofErr w:type="gramEnd"/>
           </w:p>
         </w:tc>
         <w:tc>
@@ -6499,8 +7484,20 @@
                 <w:szCs w:val="20"/>
                 <w:lang w:eastAsia="ru-RU"/>
               </w:rPr>
-              <w:t>Количество учтенных древесных растений, шт./га</w:t>
-            </w:r>
+              <w:t>Количество учтенных древесных растений, шт./</w:t>
+            </w:r>
+            <w:proofErr w:type="gramStart"/>
+            <w:r>
+              <w:rPr>
+                <w:rFonts w:ascii="Times New Roman" w:eastAsia="Times New Roman" w:hAnsi="Times New Roman" w:cs="Times New Roman"/>
+                <w:color w:val="000000"/>
+                <w:sz w:val="20"/>
+                <w:szCs w:val="20"/>
+                <w:lang w:eastAsia="ru-RU"/>
+              </w:rPr>
+              <w:t>га</w:t>
+            </w:r>
+            <w:proofErr w:type="gramEnd"/>
           </w:p>
         </w:tc>
       </w:tr>
@@ -6541,7 +7538,51 @@
                 <w:szCs w:val="20"/>
                 <w:lang w:val="en-US" w:eastAsia="ru-RU"/>
               </w:rPr>
-              <w:t>{%tr for i in saplings %}</w:t>
+              <w:t>{%</w:t>
+            </w:r>
+            <w:proofErr w:type="spellStart"/>
+            <w:r>
+              <w:rPr>
+                <w:rFonts w:ascii="Times New Roman" w:eastAsia="Times New Roman" w:hAnsi="Times New Roman" w:cs="Times New Roman"/>
+                <w:color w:val="000000"/>
+                <w:sz w:val="20"/>
+                <w:szCs w:val="20"/>
+                <w:lang w:val="en-US" w:eastAsia="ru-RU"/>
+              </w:rPr>
+              <w:t>tr</w:t>
+            </w:r>
+            <w:proofErr w:type="spellEnd"/>
+            <w:r>
+              <w:rPr>
+                <w:rFonts w:ascii="Times New Roman" w:eastAsia="Times New Roman" w:hAnsi="Times New Roman" w:cs="Times New Roman"/>
+                <w:color w:val="000000"/>
+                <w:sz w:val="20"/>
+                <w:szCs w:val="20"/>
+                <w:lang w:val="en-US" w:eastAsia="ru-RU"/>
+              </w:rPr>
+              <w:t xml:space="preserve"> for </w:t>
+            </w:r>
+            <w:proofErr w:type="spellStart"/>
+            <w:r>
+              <w:rPr>
+                <w:rFonts w:ascii="Times New Roman" w:eastAsia="Times New Roman" w:hAnsi="Times New Roman" w:cs="Times New Roman"/>
+                <w:color w:val="000000"/>
+                <w:sz w:val="20"/>
+                <w:szCs w:val="20"/>
+                <w:lang w:val="en-US" w:eastAsia="ru-RU"/>
+              </w:rPr>
+              <w:t>i</w:t>
+            </w:r>
+            <w:proofErr w:type="spellEnd"/>
+            <w:r>
+              <w:rPr>
+                <w:rFonts w:ascii="Times New Roman" w:eastAsia="Times New Roman" w:hAnsi="Times New Roman" w:cs="Times New Roman"/>
+                <w:color w:val="000000"/>
+                <w:sz w:val="20"/>
+                <w:szCs w:val="20"/>
+                <w:lang w:val="en-US" w:eastAsia="ru-RU"/>
+              </w:rPr>
+              <w:t xml:space="preserve"> in saplings %}</w:t>
             </w:r>
           </w:p>
         </w:tc>
@@ -6584,11 +7625,34 @@
                 <w:szCs w:val="20"/>
                 <w:lang w:val="en-US" w:eastAsia="ru-RU"/>
               </w:rPr>
-              <w:t>{{i.</w:t>
+              <w:t>{{</w:t>
+            </w:r>
+            <w:proofErr w:type="spellStart"/>
+            <w:r>
+              <w:rPr>
+                <w:rFonts w:ascii="Times New Roman" w:eastAsia="Times New Roman" w:hAnsi="Times New Roman" w:cs="Times New Roman"/>
+                <w:color w:val="000000"/>
+                <w:sz w:val="20"/>
+                <w:szCs w:val="20"/>
+                <w:lang w:val="en-US" w:eastAsia="ru-RU"/>
+              </w:rPr>
+              <w:t>i</w:t>
+            </w:r>
+            <w:proofErr w:type="spellEnd"/>
+            <w:r>
+              <w:rPr>
+                <w:rFonts w:ascii="Times New Roman" w:eastAsia="Times New Roman" w:hAnsi="Times New Roman" w:cs="Times New Roman"/>
+                <w:color w:val="000000"/>
+                <w:sz w:val="20"/>
+                <w:szCs w:val="20"/>
+                <w:lang w:val="en-US" w:eastAsia="ru-RU"/>
+              </w:rPr>
+              <w:t>.</w:t>
             </w:r>
             <w:r>
               <w:t xml:space="preserve"> </w:t>
             </w:r>
+            <w:proofErr w:type="spellStart"/>
             <w:r>
               <w:rPr>
                 <w:rFonts w:ascii="Times New Roman" w:eastAsia="Times New Roman" w:hAnsi="Times New Roman" w:cs="Times New Roman"/>
@@ -6599,6 +7663,7 @@
               </w:rPr>
               <w:t>ratio_composition</w:t>
             </w:r>
+            <w:proofErr w:type="spellEnd"/>
             <w:r>
               <w:rPr>
                 <w:rFonts w:ascii="Times New Roman" w:eastAsia="Times New Roman" w:hAnsi="Times New Roman" w:cs="Times New Roman"/>
@@ -6645,7 +7710,29 @@
                 <w:szCs w:val="20"/>
                 <w:lang w:val="en-US" w:eastAsia="ru-RU"/>
               </w:rPr>
-              <w:t>{{ i.breed }}</w:t>
+              <w:t xml:space="preserve">{{ </w:t>
+            </w:r>
+            <w:proofErr w:type="spellStart"/>
+            <w:r>
+              <w:rPr>
+                <w:rFonts w:ascii="Times New Roman" w:eastAsia="Times New Roman" w:hAnsi="Times New Roman" w:cs="Times New Roman"/>
+                <w:color w:val="000000"/>
+                <w:sz w:val="20"/>
+                <w:szCs w:val="20"/>
+                <w:lang w:val="en-US" w:eastAsia="ru-RU"/>
+              </w:rPr>
+              <w:t>i.breed</w:t>
+            </w:r>
+            <w:proofErr w:type="spellEnd"/>
+            <w:r>
+              <w:rPr>
+                <w:rFonts w:ascii="Times New Roman" w:eastAsia="Times New Roman" w:hAnsi="Times New Roman" w:cs="Times New Roman"/>
+                <w:color w:val="000000"/>
+                <w:sz w:val="20"/>
+                <w:szCs w:val="20"/>
+                <w:lang w:val="en-US" w:eastAsia="ru-RU"/>
+              </w:rPr>
+              <w:t xml:space="preserve"> }}</w:t>
             </w:r>
           </w:p>
         </w:tc>
@@ -6685,15 +7772,39 @@
               </w:rPr>
               <w:t xml:space="preserve">{{ </w:t>
             </w:r>
-            <w:r>
-              <w:rPr>
-                <w:rFonts w:ascii="Times New Roman" w:eastAsia="Times New Roman" w:hAnsi="Times New Roman" w:cs="Times New Roman"/>
-                <w:color w:val="000000"/>
-                <w:sz w:val="20"/>
-                <w:szCs w:val="20"/>
-                <w:lang w:val="en-US" w:eastAsia="ru-RU"/>
-              </w:rPr>
-              <w:t>i.age }}</w:t>
+            <w:proofErr w:type="spellStart"/>
+            <w:r>
+              <w:rPr>
+                <w:rFonts w:ascii="Times New Roman" w:eastAsia="Times New Roman" w:hAnsi="Times New Roman" w:cs="Times New Roman"/>
+                <w:color w:val="000000"/>
+                <w:sz w:val="20"/>
+                <w:szCs w:val="20"/>
+                <w:lang w:val="en-US" w:eastAsia="ru-RU"/>
+              </w:rPr>
+              <w:t>i.age</w:t>
+            </w:r>
+            <w:proofErr w:type="spellEnd"/>
+            <w:proofErr w:type="gramStart"/>
+            <w:r>
+              <w:rPr>
+                <w:rFonts w:ascii="Times New Roman" w:eastAsia="Times New Roman" w:hAnsi="Times New Roman" w:cs="Times New Roman"/>
+                <w:color w:val="000000"/>
+                <w:sz w:val="20"/>
+                <w:szCs w:val="20"/>
+                <w:lang w:val="en-US" w:eastAsia="ru-RU"/>
+              </w:rPr>
+              <w:t xml:space="preserve"> }</w:t>
+            </w:r>
+            <w:proofErr w:type="gramEnd"/>
+            <w:r>
+              <w:rPr>
+                <w:rFonts w:ascii="Times New Roman" w:eastAsia="Times New Roman" w:hAnsi="Times New Roman" w:cs="Times New Roman"/>
+                <w:color w:val="000000"/>
+                <w:sz w:val="20"/>
+                <w:szCs w:val="20"/>
+                <w:lang w:val="en-US" w:eastAsia="ru-RU"/>
+              </w:rPr>
+              <w:t>}</w:t>
             </w:r>
           </w:p>
         </w:tc>
@@ -6733,25 +7844,61 @@
               </w:rPr>
               <w:t xml:space="preserve">{{ </w:t>
             </w:r>
-            <w:r>
-              <w:rPr>
-                <w:rFonts w:ascii="Times New Roman" w:eastAsia="Times New Roman" w:hAnsi="Times New Roman" w:cs="Times New Roman"/>
-                <w:color w:val="000000"/>
-                <w:sz w:val="20"/>
-                <w:szCs w:val="20"/>
-                <w:lang w:val="en-US" w:eastAsia="ru-RU"/>
-              </w:rPr>
-              <w:t>i.</w:t>
-            </w:r>
-            <w:r>
-              <w:rPr>
-                <w:rFonts w:ascii="Times New Roman" w:eastAsia="Times New Roman" w:hAnsi="Times New Roman" w:cs="Times New Roman"/>
-                <w:color w:val="000000"/>
-                <w:sz w:val="20"/>
-                <w:szCs w:val="20"/>
-                <w:lang w:eastAsia="ru-RU"/>
-              </w:rPr>
-              <w:t>avg_height }}</w:t>
+            <w:proofErr w:type="spellStart"/>
+            <w:r>
+              <w:rPr>
+                <w:rFonts w:ascii="Times New Roman" w:eastAsia="Times New Roman" w:hAnsi="Times New Roman" w:cs="Times New Roman"/>
+                <w:color w:val="000000"/>
+                <w:sz w:val="20"/>
+                <w:szCs w:val="20"/>
+                <w:lang w:val="en-US" w:eastAsia="ru-RU"/>
+              </w:rPr>
+              <w:t>i</w:t>
+            </w:r>
+            <w:proofErr w:type="spellEnd"/>
+            <w:r>
+              <w:rPr>
+                <w:rFonts w:ascii="Times New Roman" w:eastAsia="Times New Roman" w:hAnsi="Times New Roman" w:cs="Times New Roman"/>
+                <w:color w:val="000000"/>
+                <w:sz w:val="20"/>
+                <w:szCs w:val="20"/>
+                <w:lang w:val="en-US" w:eastAsia="ru-RU"/>
+              </w:rPr>
+              <w:t>.</w:t>
+            </w:r>
+            <w:proofErr w:type="spellStart"/>
+            <w:r>
+              <w:rPr>
+                <w:rFonts w:ascii="Times New Roman" w:eastAsia="Times New Roman" w:hAnsi="Times New Roman" w:cs="Times New Roman"/>
+                <w:color w:val="000000"/>
+                <w:sz w:val="20"/>
+                <w:szCs w:val="20"/>
+                <w:lang w:eastAsia="ru-RU"/>
+              </w:rPr>
+              <w:t>avg_height</w:t>
+            </w:r>
+            <w:proofErr w:type="spellEnd"/>
+            <w:proofErr w:type="gramStart"/>
+            <w:r>
+              <w:rPr>
+                <w:rFonts w:ascii="Times New Roman" w:eastAsia="Times New Roman" w:hAnsi="Times New Roman" w:cs="Times New Roman"/>
+                <w:color w:val="000000"/>
+                <w:sz w:val="20"/>
+                <w:szCs w:val="20"/>
+                <w:lang w:eastAsia="ru-RU"/>
+              </w:rPr>
+              <w:t xml:space="preserve"> }</w:t>
+            </w:r>
+            <w:proofErr w:type="gramEnd"/>
+            <w:r>
+              <w:rPr>
+                <w:rFonts w:ascii="Times New Roman" w:eastAsia="Times New Roman" w:hAnsi="Times New Roman" w:cs="Times New Roman"/>
+                <w:color w:val="000000"/>
+                <w:sz w:val="20"/>
+                <w:szCs w:val="20"/>
+                <w:lang w:eastAsia="ru-RU"/>
+              </w:rPr>
+              <w:t>}</w:t>
             </w:r>
           </w:p>
         </w:tc>
@@ -6789,7 +7936,29 @@
                 <w:szCs w:val="20"/>
                 <w:lang w:val="en-US" w:eastAsia="ru-RU"/>
               </w:rPr>
-              <w:t>{{ i.diameter }}</w:t>
+              <w:t xml:space="preserve">{{ </w:t>
+            </w:r>
+            <w:proofErr w:type="spellStart"/>
+            <w:r>
+              <w:rPr>
+                <w:rFonts w:ascii="Times New Roman" w:eastAsia="Times New Roman" w:hAnsi="Times New Roman" w:cs="Times New Roman"/>
+                <w:color w:val="000000"/>
+                <w:sz w:val="20"/>
+                <w:szCs w:val="20"/>
+                <w:lang w:val="en-US" w:eastAsia="ru-RU"/>
+              </w:rPr>
+              <w:t>i.diameter</w:t>
+            </w:r>
+            <w:proofErr w:type="spellEnd"/>
+            <w:r>
+              <w:rPr>
+                <w:rFonts w:ascii="Times New Roman" w:eastAsia="Times New Roman" w:hAnsi="Times New Roman" w:cs="Times New Roman"/>
+                <w:color w:val="000000"/>
+                <w:sz w:val="20"/>
+                <w:szCs w:val="20"/>
+                <w:lang w:val="en-US" w:eastAsia="ru-RU"/>
+              </w:rPr>
+              <w:t xml:space="preserve"> }}</w:t>
             </w:r>
           </w:p>
         </w:tc>
@@ -6827,7 +7996,29 @@
                 <w:szCs w:val="20"/>
                 <w:lang w:val="en-US" w:eastAsia="ru-RU"/>
               </w:rPr>
-              <w:t>{{ i.count_of_plants }}</w:t>
+              <w:t xml:space="preserve">{{ </w:t>
+            </w:r>
+            <w:proofErr w:type="spellStart"/>
+            <w:r>
+              <w:rPr>
+                <w:rFonts w:ascii="Times New Roman" w:eastAsia="Times New Roman" w:hAnsi="Times New Roman" w:cs="Times New Roman"/>
+                <w:color w:val="000000"/>
+                <w:sz w:val="20"/>
+                <w:szCs w:val="20"/>
+                <w:lang w:val="en-US" w:eastAsia="ru-RU"/>
+              </w:rPr>
+              <w:t>i.count_of_plants</w:t>
+            </w:r>
+            <w:proofErr w:type="spellEnd"/>
+            <w:r>
+              <w:rPr>
+                <w:rFonts w:ascii="Times New Roman" w:eastAsia="Times New Roman" w:hAnsi="Times New Roman" w:cs="Times New Roman"/>
+                <w:color w:val="000000"/>
+                <w:sz w:val="20"/>
+                <w:szCs w:val="20"/>
+                <w:lang w:val="en-US" w:eastAsia="ru-RU"/>
+              </w:rPr>
+              <w:t xml:space="preserve"> }}</w:t>
             </w:r>
           </w:p>
         </w:tc>
@@ -6871,6 +8062,7 @@
               </w:rPr>
               <w:t>{%</w:t>
             </w:r>
+            <w:proofErr w:type="spellStart"/>
             <w:r>
               <w:rPr>
                 <w:rFonts w:ascii="Times New Roman" w:eastAsia="Times New Roman" w:hAnsi="Times New Roman" w:cs="Times New Roman"/>
@@ -6881,6 +8073,7 @@
               </w:rPr>
               <w:t>tr</w:t>
             </w:r>
+            <w:proofErr w:type="spellEnd"/>
             <w:r>
               <w:rPr>
                 <w:rFonts w:ascii="Times New Roman" w:eastAsia="Times New Roman" w:hAnsi="Times New Roman" w:cs="Times New Roman"/>
@@ -6891,6 +8084,7 @@
               </w:rPr>
               <w:t xml:space="preserve"> </w:t>
             </w:r>
+            <w:proofErr w:type="spellStart"/>
             <w:r>
               <w:rPr>
                 <w:rFonts w:ascii="Times New Roman" w:eastAsia="Times New Roman" w:hAnsi="Times New Roman" w:cs="Times New Roman"/>
@@ -6901,6 +8095,7 @@
               </w:rPr>
               <w:t>endfor</w:t>
             </w:r>
+            <w:proofErr w:type="spellEnd"/>
             <w:r>
               <w:rPr>
                 <w:rFonts w:ascii="Times New Roman" w:eastAsia="Times New Roman" w:hAnsi="Times New Roman" w:cs="Times New Roman"/>
@@ -6989,8 +8184,36 @@
                 <w:color w:val="000000"/>
                 <w:lang w:eastAsia="ru-RU"/>
               </w:rPr>
-              <w:t xml:space="preserve">12. Участок критериям и требованиям к молоднякам, площади которых подлежат отнесению к землям, на которых расположены леса, указанным в Правилах лесовосстановления, утвержденных приказом Минприроды России от {{ </w:t>
-            </w:r>
+              <w:t xml:space="preserve">12. Участок критериям и требованиям к молоднякам, площади которых подлежат отнесению к землям, на которых расположены леса, указанным в Правилах </w:t>
+            </w:r>
+            <w:proofErr w:type="spellStart"/>
+            <w:r>
+              <w:rPr>
+                <w:rFonts w:ascii="Times New Roman" w:eastAsia="Times New Roman" w:hAnsi="Times New Roman" w:cs="Times New Roman"/>
+                <w:color w:val="000000"/>
+                <w:lang w:eastAsia="ru-RU"/>
+              </w:rPr>
+              <w:t>лесовосстановления</w:t>
+            </w:r>
+            <w:proofErr w:type="spellEnd"/>
+            <w:r>
+              <w:rPr>
+                <w:rFonts w:ascii="Times New Roman" w:eastAsia="Times New Roman" w:hAnsi="Times New Roman" w:cs="Times New Roman"/>
+                <w:color w:val="000000"/>
+                <w:lang w:eastAsia="ru-RU"/>
+              </w:rPr>
+              <w:t>, утвержденных приказом Минприроды России от {</w:t>
+            </w:r>
+            <w:proofErr w:type="gramStart"/>
+            <w:r>
+              <w:rPr>
+                <w:rFonts w:ascii="Times New Roman" w:eastAsia="Times New Roman" w:hAnsi="Times New Roman" w:cs="Times New Roman"/>
+                <w:color w:val="000000"/>
+                <w:lang w:eastAsia="ru-RU"/>
+              </w:rPr>
+              <w:t xml:space="preserve">{ </w:t>
+            </w:r>
+            <w:proofErr w:type="gramEnd"/>
             <w:r>
               <w:rPr>
                 <w:rFonts w:ascii="Times New Roman" w:eastAsia="Times New Roman" w:hAnsi="Times New Roman" w:cs="Times New Roman"/>
@@ -7141,7 +8364,25 @@
                 <w:color w:val="000000"/>
                 <w:lang w:eastAsia="ru-RU"/>
               </w:rPr>
-              <w:t xml:space="preserve">Участок хозяйству при отнесении к землям, на которых расположены леса, указанному в Акте отнесения земель, предназначенных для лесовосстановления, к землям, на которых расположены леса,  </w:t>
+              <w:t xml:space="preserve">Участок хозяйству при отнесении к землям, на которых расположены леса, указанному в Акте отнесения земель, предназначенных для </w:t>
+            </w:r>
+            <w:proofErr w:type="spellStart"/>
+            <w:r>
+              <w:rPr>
+                <w:rFonts w:ascii="Times New Roman" w:eastAsia="Times New Roman" w:hAnsi="Times New Roman" w:cs="Times New Roman"/>
+                <w:color w:val="000000"/>
+                <w:lang w:eastAsia="ru-RU"/>
+              </w:rPr>
+              <w:t>лесовосстановления</w:t>
+            </w:r>
+            <w:proofErr w:type="spellEnd"/>
+            <w:r>
+              <w:rPr>
+                <w:rFonts w:ascii="Times New Roman" w:eastAsia="Times New Roman" w:hAnsi="Times New Roman" w:cs="Times New Roman"/>
+                <w:color w:val="000000"/>
+                <w:lang w:eastAsia="ru-RU"/>
+              </w:rPr>
+              <w:t xml:space="preserve">, к землям, на которых расположены леса,  </w:t>
             </w:r>
           </w:p>
         </w:tc>
@@ -7201,17 +8442,7 @@
                 <w:color w:val="000000"/>
                 <w:lang w:val="en-US" w:eastAsia="ru-RU"/>
               </w:rPr>
-              <w:t xml:space="preserve">{{ </w:t>
-            </w:r>
-            <w:r>
-              <w:rPr>
-                <w:rFonts w:ascii="Times New Roman" w:eastAsia="Times New Roman" w:hAnsi="Times New Roman" w:cs="Times New Roman"/>
-                <w:i/>
-                <w:iCs/>
-                <w:color w:val="000000"/>
-                <w:lang w:val="en-US" w:eastAsia="ru-RU"/>
-              </w:rPr>
-              <w:t>point7date</w:t>
+              <w:t>{{ point7date</w:t>
             </w:r>
             <w:r>
               <w:rPr>
@@ -7240,7 +8471,7 @@
               <w:rPr>
                 <w:rFonts w:ascii="Times New Roman" w:eastAsia="Times New Roman" w:hAnsi="Times New Roman" w:cs="Times New Roman"/>
                 <w:color w:val="000000"/>
-                <w:lang w:eastAsia="ru-RU"/>
+                <w:lang w:val="en-US" w:eastAsia="ru-RU"/>
               </w:rPr>
             </w:pPr>
           </w:p>
@@ -7279,27 +8510,29 @@
                 <w:color w:val="000000"/>
                 <w:lang w:val="en-US" w:eastAsia="ru-RU"/>
               </w:rPr>
-              <w:t xml:space="preserve">{{ </w:t>
-            </w:r>
-            <w:r>
-              <w:rPr>
-                <w:rFonts w:ascii="Times New Roman" w:eastAsia="Times New Roman" w:hAnsi="Times New Roman" w:cs="Times New Roman"/>
-                <w:i/>
-                <w:iCs/>
-                <w:color w:val="000000"/>
-                <w:lang w:val="en-US" w:eastAsia="ru-RU"/>
-              </w:rPr>
-              <w:t>point7number</w:t>
-            </w:r>
-            <w:r>
-              <w:rPr>
-                <w:rFonts w:ascii="Times New Roman" w:eastAsia="Times New Roman" w:hAnsi="Times New Roman" w:cs="Times New Roman"/>
-                <w:i/>
-                <w:iCs/>
-                <w:color w:val="000000"/>
-                <w:lang w:val="en-US" w:eastAsia="ru-RU"/>
-              </w:rPr>
-              <w:t xml:space="preserve"> }}</w:t>
+              <w:t>{{ point7number</w:t>
+            </w:r>
+            <w:proofErr w:type="gramStart"/>
+            <w:r>
+              <w:rPr>
+                <w:rFonts w:ascii="Times New Roman" w:eastAsia="Times New Roman" w:hAnsi="Times New Roman" w:cs="Times New Roman"/>
+                <w:i/>
+                <w:iCs/>
+                <w:color w:val="000000"/>
+                <w:lang w:val="en-US" w:eastAsia="ru-RU"/>
+              </w:rPr>
+              <w:t xml:space="preserve"> }</w:t>
+            </w:r>
+            <w:proofErr w:type="gramEnd"/>
+            <w:r>
+              <w:rPr>
+                <w:rFonts w:ascii="Times New Roman" w:eastAsia="Times New Roman" w:hAnsi="Times New Roman" w:cs="Times New Roman"/>
+                <w:i/>
+                <w:iCs/>
+                <w:color w:val="000000"/>
+                <w:lang w:val="en-US" w:eastAsia="ru-RU"/>
+              </w:rPr>
+              <w:t>}</w:t>
             </w:r>
             <w:r>
               <w:rPr>
@@ -7373,8 +8606,6 @@
               </w:rPr>
               <w:t>{{ point7agreed }}</w:t>
             </w:r>
-            <w:bookmarkStart w:id="0" w:name="_GoBack"/>
-            <w:bookmarkEnd w:id="0"/>
           </w:p>
         </w:tc>
       </w:tr>
@@ -7409,7 +8640,29 @@
                 <w:color w:val="000000"/>
                 <w:lang w:val="en-US" w:eastAsia="ru-RU"/>
               </w:rPr>
-              <w:t>{{ respond_farm }}</w:t>
+              <w:t xml:space="preserve">{{ </w:t>
+            </w:r>
+            <w:proofErr w:type="spellStart"/>
+            <w:r>
+              <w:rPr>
+                <w:rFonts w:ascii="Times New Roman" w:eastAsia="Times New Roman" w:hAnsi="Times New Roman" w:cs="Times New Roman"/>
+                <w:i/>
+                <w:iCs/>
+                <w:color w:val="000000"/>
+                <w:lang w:val="en-US" w:eastAsia="ru-RU"/>
+              </w:rPr>
+              <w:t>respond_farm</w:t>
+            </w:r>
+            <w:proofErr w:type="spellEnd"/>
+            <w:r>
+              <w:rPr>
+                <w:rFonts w:ascii="Times New Roman" w:eastAsia="Times New Roman" w:hAnsi="Times New Roman" w:cs="Times New Roman"/>
+                <w:i/>
+                <w:iCs/>
+                <w:color w:val="000000"/>
+                <w:lang w:val="en-US" w:eastAsia="ru-RU"/>
+              </w:rPr>
+              <w:t xml:space="preserve"> }}</w:t>
             </w:r>
           </w:p>
         </w:tc>
@@ -7443,8 +8696,36 @@
                 <w:color w:val="000000"/>
                 <w:lang w:eastAsia="ru-RU"/>
               </w:rPr>
-              <w:t xml:space="preserve">13. В случае несоответствия участка критериям и требованиям к молоднякам, площади которых подлежат отнесению к землям, на которых расположены леса, указанным в Правилах лесовосстановления, утвержденных приказом Минприроды России от {{ </w:t>
-            </w:r>
+              <w:t xml:space="preserve">13. В случае несоответствия участка критериям и требованиям к молоднякам, площади которых подлежат отнесению к землям, на которых расположены леса, указанным в Правилах </w:t>
+            </w:r>
+            <w:proofErr w:type="spellStart"/>
+            <w:r>
+              <w:rPr>
+                <w:rFonts w:ascii="Times New Roman" w:eastAsia="Times New Roman" w:hAnsi="Times New Roman" w:cs="Times New Roman"/>
+                <w:color w:val="000000"/>
+                <w:lang w:eastAsia="ru-RU"/>
+              </w:rPr>
+              <w:t>лесовосстановления</w:t>
+            </w:r>
+            <w:proofErr w:type="spellEnd"/>
+            <w:r>
+              <w:rPr>
+                <w:rFonts w:ascii="Times New Roman" w:eastAsia="Times New Roman" w:hAnsi="Times New Roman" w:cs="Times New Roman"/>
+                <w:color w:val="000000"/>
+                <w:lang w:eastAsia="ru-RU"/>
+              </w:rPr>
+              <w:t>, утвержденных приказом Минприроды России от {</w:t>
+            </w:r>
+            <w:proofErr w:type="gramStart"/>
+            <w:r>
+              <w:rPr>
+                <w:rFonts w:ascii="Times New Roman" w:eastAsia="Times New Roman" w:hAnsi="Times New Roman" w:cs="Times New Roman"/>
+                <w:color w:val="000000"/>
+                <w:lang w:eastAsia="ru-RU"/>
+              </w:rPr>
+              <w:t xml:space="preserve">{ </w:t>
+            </w:r>
+            <w:proofErr w:type="gramEnd"/>
             <w:r>
               <w:rPr>
                 <w:rFonts w:ascii="Times New Roman" w:eastAsia="Times New Roman" w:hAnsi="Times New Roman" w:cs="Times New Roman"/>
@@ -7509,7 +8790,29 @@
                 <w:color w:val="000000"/>
                 <w:lang w:val="en-US" w:eastAsia="ru-RU"/>
               </w:rPr>
-              <w:t>{{ plot_farm_referring_land }}</w:t>
+              <w:t xml:space="preserve">{{ </w:t>
+            </w:r>
+            <w:proofErr w:type="spellStart"/>
+            <w:r>
+              <w:rPr>
+                <w:rFonts w:ascii="Times New Roman" w:eastAsia="Times New Roman" w:hAnsi="Times New Roman" w:cs="Times New Roman"/>
+                <w:i/>
+                <w:iCs/>
+                <w:color w:val="000000"/>
+                <w:lang w:val="en-US" w:eastAsia="ru-RU"/>
+              </w:rPr>
+              <w:t>plot_farm_referring_land</w:t>
+            </w:r>
+            <w:proofErr w:type="spellEnd"/>
+            <w:r>
+              <w:rPr>
+                <w:rFonts w:ascii="Times New Roman" w:eastAsia="Times New Roman" w:hAnsi="Times New Roman" w:cs="Times New Roman"/>
+                <w:i/>
+                <w:iCs/>
+                <w:color w:val="000000"/>
+                <w:lang w:val="en-US" w:eastAsia="ru-RU"/>
+              </w:rPr>
+              <w:t xml:space="preserve"> }}</w:t>
             </w:r>
           </w:p>
         </w:tc>
@@ -7576,7 +8879,27 @@
                 <w:iCs/>
                 <w:lang w:val="en-US" w:eastAsia="ru-RU"/>
               </w:rPr>
-              <w:t>{{ recomendation }}</w:t>
+              <w:t xml:space="preserve">{{ </w:t>
+            </w:r>
+            <w:proofErr w:type="spellStart"/>
+            <w:r>
+              <w:rPr>
+                <w:rFonts w:ascii="Times New Roman" w:eastAsia="Times New Roman" w:hAnsi="Times New Roman" w:cs="Times New Roman"/>
+                <w:i/>
+                <w:iCs/>
+                <w:lang w:val="en-US" w:eastAsia="ru-RU"/>
+              </w:rPr>
+              <w:t>recomendation</w:t>
+            </w:r>
+            <w:proofErr w:type="spellEnd"/>
+            <w:r>
+              <w:rPr>
+                <w:rFonts w:ascii="Times New Roman" w:eastAsia="Times New Roman" w:hAnsi="Times New Roman" w:cs="Times New Roman"/>
+                <w:i/>
+                <w:iCs/>
+                <w:lang w:val="en-US" w:eastAsia="ru-RU"/>
+              </w:rPr>
+              <w:t xml:space="preserve"> }}</w:t>
             </w:r>
           </w:p>
         </w:tc>
@@ -7643,7 +8966,29 @@
                 <w:color w:val="000000"/>
                 <w:lang w:val="en-US" w:eastAsia="ru-RU"/>
               </w:rPr>
-              <w:t>{{ plot_features }}</w:t>
+              <w:t xml:space="preserve">{{ </w:t>
+            </w:r>
+            <w:proofErr w:type="spellStart"/>
+            <w:r>
+              <w:rPr>
+                <w:rFonts w:ascii="Times New Roman" w:eastAsia="Times New Roman" w:hAnsi="Times New Roman" w:cs="Times New Roman"/>
+                <w:i/>
+                <w:iCs/>
+                <w:color w:val="000000"/>
+                <w:lang w:val="en-US" w:eastAsia="ru-RU"/>
+              </w:rPr>
+              <w:t>plot_features</w:t>
+            </w:r>
+            <w:proofErr w:type="spellEnd"/>
+            <w:r>
+              <w:rPr>
+                <w:rFonts w:ascii="Times New Roman" w:eastAsia="Times New Roman" w:hAnsi="Times New Roman" w:cs="Times New Roman"/>
+                <w:i/>
+                <w:iCs/>
+                <w:color w:val="000000"/>
+                <w:lang w:val="en-US" w:eastAsia="ru-RU"/>
+              </w:rPr>
+              <w:t xml:space="preserve"> }}</w:t>
             </w:r>
           </w:p>
         </w:tc>
@@ -7666,7 +9011,9 @@
       </w:tblPr>
       <w:tblGrid>
         <w:gridCol w:w="4785"/>
-        <w:gridCol w:w="4786"/>
+        <w:gridCol w:w="2393"/>
+        <w:gridCol w:w="1196"/>
+        <w:gridCol w:w="1197"/>
       </w:tblGrid>
       <w:tr>
         <w:tc>
@@ -7708,6 +9055,7 @@
         <w:tc>
           <w:tcPr>
             <w:tcW w:w="4786" w:type="dxa"/>
+            <w:gridSpan w:val="3"/>
             <w:tcBorders>
               <w:bottom w:val="single" w:sz="4" w:space="0" w:color="auto"/>
             </w:tcBorders>
@@ -7721,7 +9069,29 @@
                 <w:color w:val="000000"/>
                 <w:lang w:val="en-US" w:eastAsia="ru-RU"/>
               </w:rPr>
-              <w:t>{{ site_survey }}</w:t>
+              <w:t xml:space="preserve">{{ </w:t>
+            </w:r>
+            <w:proofErr w:type="spellStart"/>
+            <w:r>
+              <w:rPr>
+                <w:rFonts w:ascii="Times New Roman" w:eastAsia="Times New Roman" w:hAnsi="Times New Roman" w:cs="Times New Roman"/>
+                <w:i/>
+                <w:iCs/>
+                <w:color w:val="000000"/>
+                <w:lang w:val="en-US" w:eastAsia="ru-RU"/>
+              </w:rPr>
+              <w:t>site_survey</w:t>
+            </w:r>
+            <w:proofErr w:type="spellEnd"/>
+            <w:r>
+              <w:rPr>
+                <w:rFonts w:ascii="Times New Roman" w:eastAsia="Times New Roman" w:hAnsi="Times New Roman" w:cs="Times New Roman"/>
+                <w:i/>
+                <w:iCs/>
+                <w:color w:val="000000"/>
+                <w:lang w:val="en-US" w:eastAsia="ru-RU"/>
+              </w:rPr>
+              <w:t xml:space="preserve"> }}</w:t>
             </w:r>
           </w:p>
         </w:tc>
@@ -7752,6 +9122,7 @@
         <w:tc>
           <w:tcPr>
             <w:tcW w:w="4786" w:type="dxa"/>
+            <w:gridSpan w:val="3"/>
             <w:tcBorders>
               <w:top w:val="single" w:sz="4" w:space="0" w:color="auto"/>
               <w:bottom w:val="single" w:sz="4" w:space="0" w:color="auto"/>
@@ -7771,7 +9142,29 @@
                 <w:color w:val="000000"/>
                 <w:lang w:val="en-US" w:eastAsia="ru-RU"/>
               </w:rPr>
-              <w:t>{{ in_front }}</w:t>
+              <w:t xml:space="preserve">{{ </w:t>
+            </w:r>
+            <w:proofErr w:type="spellStart"/>
+            <w:r>
+              <w:rPr>
+                <w:rFonts w:ascii="Times New Roman" w:eastAsia="Times New Roman" w:hAnsi="Times New Roman" w:cs="Times New Roman"/>
+                <w:i/>
+                <w:iCs/>
+                <w:color w:val="000000"/>
+                <w:lang w:val="en-US" w:eastAsia="ru-RU"/>
+              </w:rPr>
+              <w:t>in_front</w:t>
+            </w:r>
+            <w:proofErr w:type="spellEnd"/>
+            <w:r>
+              <w:rPr>
+                <w:rFonts w:ascii="Times New Roman" w:eastAsia="Times New Roman" w:hAnsi="Times New Roman" w:cs="Times New Roman"/>
+                <w:i/>
+                <w:iCs/>
+                <w:color w:val="000000"/>
+                <w:lang w:val="en-US" w:eastAsia="ru-RU"/>
+              </w:rPr>
+              <w:t xml:space="preserve"> }}</w:t>
             </w:r>
             <w:r>
               <w:rPr>
@@ -7811,7 +9204,7 @@
         </w:tc>
         <w:tc>
           <w:tcPr>
-            <w:tcW w:w="4786" w:type="dxa"/>
+            <w:tcW w:w="2393" w:type="dxa"/>
             <w:tcBorders>
               <w:top w:val="single" w:sz="4" w:space="0" w:color="auto"/>
               <w:bottom w:val="single" w:sz="4" w:space="0" w:color="auto"/>
@@ -7826,7 +9219,116 @@
                 <w:color w:val="000000"/>
                 <w:lang w:val="en-US" w:eastAsia="ru-RU"/>
               </w:rPr>
-              <w:t>{{ date_and_time }}</w:t>
+              <w:t xml:space="preserve">{{ </w:t>
+            </w:r>
+            <w:proofErr w:type="spellStart"/>
+            <w:r>
+              <w:rPr>
+                <w:rFonts w:ascii="Times New Roman" w:eastAsia="Times New Roman" w:hAnsi="Times New Roman" w:cs="Times New Roman"/>
+                <w:i/>
+                <w:iCs/>
+                <w:color w:val="000000"/>
+                <w:lang w:val="en-US" w:eastAsia="ru-RU"/>
+              </w:rPr>
+              <w:t>date_and_time</w:t>
+            </w:r>
+            <w:proofErr w:type="spellEnd"/>
+            <w:r>
+              <w:rPr>
+                <w:rFonts w:ascii="Times New Roman" w:eastAsia="Times New Roman" w:hAnsi="Times New Roman" w:cs="Times New Roman"/>
+                <w:i/>
+                <w:iCs/>
+                <w:color w:val="000000"/>
+                <w:lang w:val="en-US" w:eastAsia="ru-RU"/>
+              </w:rPr>
+              <w:t xml:space="preserve"> }}</w:t>
+            </w:r>
+          </w:p>
+        </w:tc>
+        <w:tc>
+          <w:tcPr>
+            <w:tcW w:w="1196" w:type="dxa"/>
+            <w:tcBorders>
+              <w:top w:val="single" w:sz="4" w:space="0" w:color="auto"/>
+              <w:bottom w:val="single" w:sz="4" w:space="0" w:color="auto"/>
+            </w:tcBorders>
+          </w:tcPr>
+          <w:p>
+            <w:r>
+              <w:t xml:space="preserve">с </w:t>
+            </w:r>
+            <w:r>
+              <w:rPr>
+                <w:lang w:val="en-US"/>
+              </w:rPr>
+              <w:t>{</w:t>
+            </w:r>
+            <w:proofErr w:type="gramStart"/>
+            <w:r>
+              <w:rPr>
+                <w:lang w:val="en-US"/>
+              </w:rPr>
+              <w:t xml:space="preserve">{ </w:t>
+            </w:r>
+            <w:proofErr w:type="spellStart"/>
+            <w:proofErr w:type="gramEnd"/>
+            <w:r>
+              <w:rPr>
+                <w:lang w:val="en-US"/>
+              </w:rPr>
+              <w:t>start_at</w:t>
+            </w:r>
+            <w:proofErr w:type="spellEnd"/>
+            <w:r>
+              <w:rPr>
+                <w:lang w:val="en-US"/>
+              </w:rPr>
+              <w:t xml:space="preserve"> }}</w:t>
+            </w:r>
+          </w:p>
+        </w:tc>
+        <w:tc>
+          <w:tcPr>
+            <w:tcW w:w="1197" w:type="dxa"/>
+            <w:tcBorders>
+              <w:top w:val="single" w:sz="4" w:space="0" w:color="auto"/>
+              <w:bottom w:val="single" w:sz="4" w:space="0" w:color="auto"/>
+            </w:tcBorders>
+          </w:tcPr>
+          <w:p>
+            <w:r>
+              <w:t>п</w:t>
+            </w:r>
+            <w:bookmarkStart w:id="0" w:name="_GoBack"/>
+            <w:bookmarkEnd w:id="0"/>
+            <w:r>
+              <w:t>о</w:t>
+            </w:r>
+            <w:r>
+              <w:t xml:space="preserve"> </w:t>
+            </w:r>
+            <w:r>
+              <w:rPr>
+                <w:lang w:val="en-US"/>
+              </w:rPr>
+              <w:t xml:space="preserve">{{ </w:t>
+            </w:r>
+            <w:proofErr w:type="spellStart"/>
+            <w:r>
+              <w:rPr>
+                <w:lang w:val="en-US"/>
+              </w:rPr>
+              <w:t>end_at</w:t>
+            </w:r>
+            <w:proofErr w:type="spellEnd"/>
+            <w:r>
+              <w:rPr>
+                <w:lang w:val="en-US"/>
+              </w:rPr>
+              <w:t xml:space="preserve"> }}</w:t>
+            </w:r>
+            <w:r>
+              <w:t xml:space="preserve"> </w:t>
             </w:r>
           </w:p>
         </w:tc>
@@ -7867,7 +9369,7 @@
 </file>
 
 <file path=word/endnotes.xml><?xml version="1.0" encoding="utf-8"?>
-<w:endnotes xmlns:wpc="http://schemas.microsoft.com/office/word/2010/wordprocessingCanvas" xmlns:mc="http://schemas.openxmlformats.org/markup-compatibility/2006" xmlns:o="urn:schemas-microsoft-com:office:office" xmlns:r="http://schemas.openxmlformats.org/officeDocument/2006/relationships" xmlns:m="http://schemas.openxmlformats.org/officeDocument/2006/math" xmlns:v="urn:schemas-microsoft-com:vml" xmlns:wp14="http://schemas.microsoft.com/office/word/2010/wordprocessingDrawing" xmlns:wp="http://schemas.openxmlformats.org/drawingml/2006/wordprocessingDrawing" xmlns:w10="urn:schemas-microsoft-com:office:word" xmlns:w="http://schemas.openxmlformats.org/wordprocessingml/2006/main" xmlns:w14="http://schemas.microsoft.com/office/word/2010/wordml" xmlns:w15="http://schemas.microsoft.com/office/word/2012/wordml" xmlns:wpg="http://schemas.microsoft.com/office/word/2010/wordprocessingGroup" xmlns:wpi="http://schemas.microsoft.com/office/word/2010/wordprocessingInk" xmlns:wne="http://schemas.microsoft.com/office/word/2006/wordml" xmlns:wps="http://schemas.microsoft.com/office/word/2010/wordprocessingShape" mc:Ignorable="w14 w15 wp14">
+<w:endnotes xmlns:wpc="http://schemas.microsoft.com/office/word/2010/wordprocessingCanvas" xmlns:mc="http://schemas.openxmlformats.org/markup-compatibility/2006" xmlns:o="urn:schemas-microsoft-com:office:office" xmlns:r="http://schemas.openxmlformats.org/officeDocument/2006/relationships" xmlns:m="http://schemas.openxmlformats.org/officeDocument/2006/math" xmlns:v="urn:schemas-microsoft-com:vml" xmlns:wp14="http://schemas.microsoft.com/office/word/2010/wordprocessingDrawing" xmlns:wp="http://schemas.openxmlformats.org/drawingml/2006/wordprocessingDrawing" xmlns:w10="urn:schemas-microsoft-com:office:word" xmlns:w="http://schemas.openxmlformats.org/wordprocessingml/2006/main" xmlns:w14="http://schemas.microsoft.com/office/word/2010/wordml" xmlns:wpg="http://schemas.microsoft.com/office/word/2010/wordprocessingGroup" xmlns:wpi="http://schemas.microsoft.com/office/word/2010/wordprocessingInk" xmlns:wne="http://schemas.microsoft.com/office/word/2006/wordml" xmlns:wps="http://schemas.microsoft.com/office/word/2010/wordprocessingShape" mc:Ignorable="w14 wp14">
   <w:endnote w:type="separator" w:id="-1">
     <w:p>
       <w:pPr>
@@ -7892,7 +9394,7 @@
 </file>
 
 <file path=word/footnotes.xml><?xml version="1.0" encoding="utf-8"?>
-<w:footnotes xmlns:wpc="http://schemas.microsoft.com/office/word/2010/wordprocessingCanvas" xmlns:mc="http://schemas.openxmlformats.org/markup-compatibility/2006" xmlns:o="urn:schemas-microsoft-com:office:office" xmlns:r="http://schemas.openxmlformats.org/officeDocument/2006/relationships" xmlns:m="http://schemas.openxmlformats.org/officeDocument/2006/math" xmlns:v="urn:schemas-microsoft-com:vml" xmlns:wp14="http://schemas.microsoft.com/office/word/2010/wordprocessingDrawing" xmlns:wp="http://schemas.openxmlformats.org/drawingml/2006/wordprocessingDrawing" xmlns:w10="urn:schemas-microsoft-com:office:word" xmlns:w="http://schemas.openxmlformats.org/wordprocessingml/2006/main" xmlns:w14="http://schemas.microsoft.com/office/word/2010/wordml" xmlns:w15="http://schemas.microsoft.com/office/word/2012/wordml" xmlns:wpg="http://schemas.microsoft.com/office/word/2010/wordprocessingGroup" xmlns:wpi="http://schemas.microsoft.com/office/word/2010/wordprocessingInk" xmlns:wne="http://schemas.microsoft.com/office/word/2006/wordml" xmlns:wps="http://schemas.microsoft.com/office/word/2010/wordprocessingShape" mc:Ignorable="w14 w15 wp14">
+<w:footnotes xmlns:wpc="http://schemas.microsoft.com/office/word/2010/wordprocessingCanvas" xmlns:mc="http://schemas.openxmlformats.org/markup-compatibility/2006" xmlns:o="urn:schemas-microsoft-com:office:office" xmlns:r="http://schemas.openxmlformats.org/officeDocument/2006/relationships" xmlns:m="http://schemas.openxmlformats.org/officeDocument/2006/math" xmlns:v="urn:schemas-microsoft-com:vml" xmlns:wp14="http://schemas.microsoft.com/office/word/2010/wordprocessingDrawing" xmlns:wp="http://schemas.openxmlformats.org/drawingml/2006/wordprocessingDrawing" xmlns:w10="urn:schemas-microsoft-com:office:word" xmlns:w="http://schemas.openxmlformats.org/wordprocessingml/2006/main" xmlns:w14="http://schemas.microsoft.com/office/word/2010/wordml" xmlns:wpg="http://schemas.microsoft.com/office/word/2010/wordprocessingGroup" xmlns:wpi="http://schemas.microsoft.com/office/word/2010/wordprocessingInk" xmlns:wne="http://schemas.microsoft.com/office/word/2006/wordml" xmlns:wps="http://schemas.microsoft.com/office/word/2010/wordprocessingShape" mc:Ignorable="w14 wp14">
   <w:footnote w:type="separator" w:id="-1">
     <w:p>
       <w:pPr>
@@ -7917,7 +9419,7 @@
 </file>
 
 <file path=word/numbering.xml><?xml version="1.0" encoding="utf-8"?>
-<w:numbering xmlns:wpc="http://schemas.microsoft.com/office/word/2010/wordprocessingCanvas" xmlns:mc="http://schemas.openxmlformats.org/markup-compatibility/2006" xmlns:o="urn:schemas-microsoft-com:office:office" xmlns:r="http://schemas.openxmlformats.org/officeDocument/2006/relationships" xmlns:m="http://schemas.openxmlformats.org/officeDocument/2006/math" xmlns:v="urn:schemas-microsoft-com:vml" xmlns:wp14="http://schemas.microsoft.com/office/word/2010/wordprocessingDrawing" xmlns:wp="http://schemas.openxmlformats.org/drawingml/2006/wordprocessingDrawing" xmlns:w10="urn:schemas-microsoft-com:office:word" xmlns:w="http://schemas.openxmlformats.org/wordprocessingml/2006/main" xmlns:w14="http://schemas.microsoft.com/office/word/2010/wordml" xmlns:w15="http://schemas.microsoft.com/office/word/2012/wordml" xmlns:wpg="http://schemas.microsoft.com/office/word/2010/wordprocessingGroup" xmlns:wpi="http://schemas.microsoft.com/office/word/2010/wordprocessingInk" xmlns:wne="http://schemas.microsoft.com/office/word/2006/wordml" xmlns:wps="http://schemas.microsoft.com/office/word/2010/wordprocessingShape" mc:Ignorable="w14 w15 wp14">
+<w:numbering xmlns:wpc="http://schemas.microsoft.com/office/word/2010/wordprocessingCanvas" xmlns:mc="http://schemas.openxmlformats.org/markup-compatibility/2006" xmlns:o="urn:schemas-microsoft-com:office:office" xmlns:r="http://schemas.openxmlformats.org/officeDocument/2006/relationships" xmlns:m="http://schemas.openxmlformats.org/officeDocument/2006/math" xmlns:v="urn:schemas-microsoft-com:vml" xmlns:wp14="http://schemas.microsoft.com/office/word/2010/wordprocessingDrawing" xmlns:wp="http://schemas.openxmlformats.org/drawingml/2006/wordprocessingDrawing" xmlns:w10="urn:schemas-microsoft-com:office:word" xmlns:w="http://schemas.openxmlformats.org/wordprocessingml/2006/main" xmlns:w14="http://schemas.microsoft.com/office/word/2010/wordml" xmlns:wpg="http://schemas.microsoft.com/office/word/2010/wordprocessingGroup" xmlns:wpi="http://schemas.microsoft.com/office/word/2010/wordprocessingInk" xmlns:wne="http://schemas.microsoft.com/office/word/2006/wordml" xmlns:wps="http://schemas.microsoft.com/office/word/2010/wordprocessingShape" mc:Ignorable="w14 wp14">
   <w:abstractNum w:abstractNumId="0">
     <w:nsid w:val="3D813B10"/>
     <w:multiLevelType w:val="hybridMultilevel"/>
@@ -8014,7 +9516,7 @@
 </file>
 
 <file path=word/styles.xml><?xml version="1.0" encoding="utf-8"?>
-<w:styles xmlns:mc="http://schemas.openxmlformats.org/markup-compatibility/2006" xmlns:r="http://schemas.openxmlformats.org/officeDocument/2006/relationships" xmlns:w="http://schemas.openxmlformats.org/wordprocessingml/2006/main" xmlns:w14="http://schemas.microsoft.com/office/word/2010/wordml" xmlns:w15="http://schemas.microsoft.com/office/word/2012/wordml" mc:Ignorable="w14 w15">
+<w:styles xmlns:mc="http://schemas.openxmlformats.org/markup-compatibility/2006" xmlns:r="http://schemas.openxmlformats.org/officeDocument/2006/relationships" xmlns:w="http://schemas.openxmlformats.org/wordprocessingml/2006/main" xmlns:w14="http://schemas.microsoft.com/office/word/2010/wordml" mc:Ignorable="w14">
   <w:docDefaults>
     <w:rPrDefault>
       <w:rPr>
@@ -8030,378 +9532,144 @@
       </w:pPr>
     </w:pPrDefault>
   </w:docDefaults>
-  <w:latentStyles w:defLockedState="0" w:defUIPriority="99" w:defSemiHidden="0" w:defUnhideWhenUsed="0" w:defQFormat="0" w:count="371">
-    <w:lsdException w:name="Normal" w:uiPriority="0" w:qFormat="1"/>
-    <w:lsdException w:name="heading 1" w:uiPriority="9" w:qFormat="1"/>
-    <w:lsdException w:name="heading 2" w:semiHidden="1" w:uiPriority="9" w:unhideWhenUsed="1" w:qFormat="1"/>
-    <w:lsdException w:name="heading 3" w:semiHidden="1" w:uiPriority="9" w:unhideWhenUsed="1" w:qFormat="1"/>
-    <w:lsdException w:name="heading 4" w:semiHidden="1" w:uiPriority="9" w:unhideWhenUsed="1" w:qFormat="1"/>
-    <w:lsdException w:name="heading 5" w:semiHidden="1" w:uiPriority="9" w:unhideWhenUsed="1" w:qFormat="1"/>
-    <w:lsdException w:name="heading 6" w:semiHidden="1" w:uiPriority="9" w:unhideWhenUsed="1" w:qFormat="1"/>
-    <w:lsdException w:name="heading 7" w:semiHidden="1" w:uiPriority="9" w:unhideWhenUsed="1" w:qFormat="1"/>
-    <w:lsdException w:name="heading 8" w:semiHidden="1" w:uiPriority="9" w:unhideWhenUsed="1" w:qFormat="1"/>
-    <w:lsdException w:name="heading 9" w:semiHidden="1" w:uiPriority="9" w:unhideWhenUsed="1" w:qFormat="1"/>
-    <w:lsdException w:name="index 1" w:semiHidden="1" w:unhideWhenUsed="1"/>
-    <w:lsdException w:name="index 2" w:semiHidden="1" w:unhideWhenUsed="1"/>
-    <w:lsdException w:name="index 3" w:semiHidden="1" w:unhideWhenUsed="1"/>
-    <w:lsdException w:name="index 4" w:semiHidden="1" w:unhideWhenUsed="1"/>
-    <w:lsdException w:name="index 5" w:semiHidden="1" w:unhideWhenUsed="1"/>
-    <w:lsdException w:name="index 6" w:semiHidden="1" w:unhideWhenUsed="1"/>
-    <w:lsdException w:name="index 7" w:semiHidden="1" w:unhideWhenUsed="1"/>
-    <w:lsdException w:name="index 8" w:semiHidden="1" w:unhideWhenUsed="1"/>
-    <w:lsdException w:name="index 9" w:semiHidden="1" w:unhideWhenUsed="1"/>
-    <w:lsdException w:name="toc 1" w:semiHidden="1" w:uiPriority="39" w:unhideWhenUsed="1"/>
-    <w:lsdException w:name="toc 2" w:semiHidden="1" w:uiPriority="39" w:unhideWhenUsed="1"/>
-    <w:lsdException w:name="toc 3" w:semiHidden="1" w:uiPriority="39" w:unhideWhenUsed="1"/>
-    <w:lsdException w:name="toc 4" w:semiHidden="1" w:uiPriority="39" w:unhideWhenUsed="1"/>
-    <w:lsdException w:name="toc 5" w:semiHidden="1" w:uiPriority="39" w:unhideWhenUsed="1"/>
-    <w:lsdException w:name="toc 6" w:semiHidden="1" w:uiPriority="39" w:unhideWhenUsed="1"/>
-    <w:lsdException w:name="toc 7" w:semiHidden="1" w:uiPriority="39" w:unhideWhenUsed="1"/>
-    <w:lsdException w:name="toc 8" w:semiHidden="1" w:uiPriority="39" w:unhideWhenUsed="1"/>
-    <w:lsdException w:name="toc 9" w:semiHidden="1" w:uiPriority="39" w:unhideWhenUsed="1"/>
-    <w:lsdException w:name="Normal Indent" w:semiHidden="1" w:unhideWhenUsed="1"/>
-    <w:lsdException w:name="footnote text" w:semiHidden="1" w:unhideWhenUsed="1"/>
-    <w:lsdException w:name="annotation text" w:semiHidden="1" w:unhideWhenUsed="1"/>
-    <w:lsdException w:name="header" w:semiHidden="1" w:unhideWhenUsed="1"/>
-    <w:lsdException w:name="footer" w:semiHidden="1" w:unhideWhenUsed="1"/>
-    <w:lsdException w:name="index heading" w:semiHidden="1" w:unhideWhenUsed="1"/>
-    <w:lsdException w:name="caption" w:semiHidden="1" w:uiPriority="35" w:unhideWhenUsed="1" w:qFormat="1"/>
-    <w:lsdException w:name="table of figures" w:semiHidden="1" w:unhideWhenUsed="1"/>
-    <w:lsdException w:name="envelope address" w:semiHidden="1" w:unhideWhenUsed="1"/>
-    <w:lsdException w:name="envelope return" w:semiHidden="1" w:unhideWhenUsed="1"/>
-    <w:lsdException w:name="footnote reference" w:semiHidden="1" w:unhideWhenUsed="1"/>
-    <w:lsdException w:name="annotation reference" w:semiHidden="1" w:unhideWhenUsed="1"/>
-    <w:lsdException w:name="line number" w:semiHidden="1" w:unhideWhenUsed="1"/>
-    <w:lsdException w:name="page number" w:semiHidden="1" w:unhideWhenUsed="1"/>
-    <w:lsdException w:name="endnote reference" w:semiHidden="1" w:unhideWhenUsed="1"/>
-    <w:lsdException w:name="endnote text" w:semiHidden="1" w:unhideWhenUsed="1"/>
-    <w:lsdException w:name="table of authorities" w:semiHidden="1" w:unhideWhenUsed="1"/>
-    <w:lsdException w:name="macro" w:semiHidden="1" w:unhideWhenUsed="1"/>
-    <w:lsdException w:name="toa heading" w:semiHidden="1" w:unhideWhenUsed="1"/>
-    <w:lsdException w:name="List" w:semiHidden="1" w:unhideWhenUsed="1"/>
-    <w:lsdException w:name="List Bullet" w:semiHidden="1" w:unhideWhenUsed="1"/>
-    <w:lsdException w:name="List Number" w:semiHidden="1" w:unhideWhenUsed="1"/>
-    <w:lsdException w:name="List 2" w:semiHidden="1" w:unhideWhenUsed="1"/>
-    <w:lsdException w:name="List 3" w:semiHidden="1" w:unhideWhenUsed="1"/>
-    <w:lsdException w:name="List 4" w:semiHidden="1" w:unhideWhenUsed="1"/>
-    <w:lsdException w:name="List 5" w:semiHidden="1" w:unhideWhenUsed="1"/>
-    <w:lsdException w:name="List Bullet 2" w:semiHidden="1" w:unhideWhenUsed="1"/>
-    <w:lsdException w:name="List Bullet 3" w:semiHidden="1" w:unhideWhenUsed="1"/>
-    <w:lsdException w:name="List Bullet 4" w:semiHidden="1" w:unhideWhenUsed="1"/>
-    <w:lsdException w:name="List Bullet 5" w:semiHidden="1" w:unhideWhenUsed="1"/>
-    <w:lsdException w:name="List Number 2" w:semiHidden="1" w:unhideWhenUsed="1"/>
-    <w:lsdException w:name="List Number 3" w:semiHidden="1" w:unhideWhenUsed="1"/>
-    <w:lsdException w:name="List Number 4" w:semiHidden="1" w:unhideWhenUsed="1"/>
-    <w:lsdException w:name="List Number 5" w:semiHidden="1" w:unhideWhenUsed="1"/>
-    <w:lsdException w:name="Title" w:uiPriority="10" w:qFormat="1"/>
-    <w:lsdException w:name="Closing" w:semiHidden="1" w:unhideWhenUsed="1"/>
-    <w:lsdException w:name="Signature" w:semiHidden="1" w:unhideWhenUsed="1"/>
-    <w:lsdException w:name="Default Paragraph Font" w:semiHidden="1" w:uiPriority="1" w:unhideWhenUsed="1"/>
-    <w:lsdException w:name="Body Text" w:semiHidden="1" w:unhideWhenUsed="1"/>
-    <w:lsdException w:name="Body Text Indent" w:semiHidden="1" w:unhideWhenUsed="1"/>
-    <w:lsdException w:name="List Continue" w:semiHidden="1" w:unhideWhenUsed="1"/>
-    <w:lsdException w:name="List Continue 2" w:semiHidden="1" w:unhideWhenUsed="1"/>
-    <w:lsdException w:name="List Continue 3" w:semiHidden="1" w:unhideWhenUsed="1"/>
-    <w:lsdException w:name="List Continue 4" w:semiHidden="1" w:unhideWhenUsed="1"/>
-    <w:lsdException w:name="List Continue 5" w:semiHidden="1" w:unhideWhenUsed="1"/>
-    <w:lsdException w:name="Message Header" w:semiHidden="1" w:unhideWhenUsed="1"/>
-    <w:lsdException w:name="Subtitle" w:uiPriority="11" w:qFormat="1"/>
-    <w:lsdException w:name="Salutation" w:semiHidden="1" w:unhideWhenUsed="1"/>
-    <w:lsdException w:name="Date" w:semiHidden="1" w:unhideWhenUsed="1"/>
-    <w:lsdException w:name="Body Text First Indent" w:semiHidden="1" w:unhideWhenUsed="1"/>
-    <w:lsdException w:name="Body Text First Indent 2" w:semiHidden="1" w:unhideWhenUsed="1"/>
-    <w:lsdException w:name="Note Heading" w:semiHidden="1" w:unhideWhenUsed="1"/>
-    <w:lsdException w:name="Body Text 2" w:semiHidden="1" w:unhideWhenUsed="1"/>
-    <w:lsdException w:name="Body Text 3" w:semiHidden="1" w:unhideWhenUsed="1"/>
-    <w:lsdException w:name="Body Text Indent 2" w:semiHidden="1" w:unhideWhenUsed="1"/>
-    <w:lsdException w:name="Body Text Indent 3" w:semiHidden="1" w:unhideWhenUsed="1"/>
-    <w:lsdException w:name="Block Text" w:semiHidden="1" w:unhideWhenUsed="1"/>
-    <w:lsdException w:name="Hyperlink" w:semiHidden="1" w:unhideWhenUsed="1"/>
-    <w:lsdException w:name="FollowedHyperlink" w:semiHidden="1" w:unhideWhenUsed="1"/>
-    <w:lsdException w:name="Strong" w:uiPriority="22" w:qFormat="1"/>
-    <w:lsdException w:name="Emphasis" w:uiPriority="20" w:qFormat="1"/>
-    <w:lsdException w:name="Document Map" w:semiHidden="1" w:unhideWhenUsed="1"/>
-    <w:lsdException w:name="Plain Text" w:semiHidden="1" w:unhideWhenUsed="1"/>
-    <w:lsdException w:name="E-mail Signature" w:semiHidden="1" w:unhideWhenUsed="1"/>
-    <w:lsdException w:name="HTML Top of Form" w:semiHidden="1" w:unhideWhenUsed="1"/>
-    <w:lsdException w:name="HTML Bottom of Form" w:semiHidden="1" w:unhideWhenUsed="1"/>
-    <w:lsdException w:name="Normal (Web)" w:semiHidden="1" w:unhideWhenUsed="1"/>
-    <w:lsdException w:name="HTML Acronym" w:semiHidden="1" w:unhideWhenUsed="1"/>
-    <w:lsdException w:name="HTML Address" w:semiHidden="1" w:unhideWhenUsed="1"/>
-    <w:lsdException w:name="HTML Cite" w:semiHidden="1" w:unhideWhenUsed="1"/>
-    <w:lsdException w:name="HTML Code" w:semiHidden="1" w:unhideWhenUsed="1"/>
-    <w:lsdException w:name="HTML Definition" w:semiHidden="1" w:unhideWhenUsed="1"/>
-    <w:lsdException w:name="HTML Keyboard" w:semiHidden="1" w:unhideWhenUsed="1"/>
-    <w:lsdException w:name="HTML Preformatted" w:semiHidden="1" w:unhideWhenUsed="1"/>
-    <w:lsdException w:name="HTML Sample" w:semiHidden="1" w:unhideWhenUsed="1"/>
-    <w:lsdException w:name="HTML Typewriter" w:semiHidden="1" w:unhideWhenUsed="1"/>
-    <w:lsdException w:name="HTML Variable" w:semiHidden="1" w:unhideWhenUsed="1"/>
-    <w:lsdException w:name="Normal Table" w:semiHidden="1" w:unhideWhenUsed="1"/>
-    <w:lsdException w:name="annotation subject" w:semiHidden="1" w:unhideWhenUsed="1"/>
-    <w:lsdException w:name="No List" w:semiHidden="1" w:unhideWhenUsed="1"/>
-    <w:lsdException w:name="Outline List 1" w:semiHidden="1" w:unhideWhenUsed="1"/>
-    <w:lsdException w:name="Outline List 2" w:semiHidden="1" w:unhideWhenUsed="1"/>
-    <w:lsdException w:name="Outline List 3" w:semiHidden="1" w:unhideWhenUsed="1"/>
-    <w:lsdException w:name="Table Simple 1" w:semiHidden="1" w:unhideWhenUsed="1"/>
-    <w:lsdException w:name="Table Simple 2" w:semiHidden="1" w:unhideWhenUsed="1"/>
-    <w:lsdException w:name="Table Simple 3" w:semiHidden="1" w:unhideWhenUsed="1"/>
-    <w:lsdException w:name="Table Classic 1" w:semiHidden="1" w:unhideWhenUsed="1"/>
-    <w:lsdException w:name="Table Classic 2" w:semiHidden="1" w:unhideWhenUsed="1"/>
-    <w:lsdException w:name="Table Classic 3" w:semiHidden="1" w:unhideWhenUsed="1"/>
-    <w:lsdException w:name="Table Classic 4" w:semiHidden="1" w:unhideWhenUsed="1"/>
-    <w:lsdException w:name="Table Colorful 1" w:semiHidden="1" w:unhideWhenUsed="1"/>
-    <w:lsdException w:name="Table Colorful 2" w:semiHidden="1" w:unhideWhenUsed="1"/>
-    <w:lsdException w:name="Table Colorful 3" w:semiHidden="1" w:unhideWhenUsed="1"/>
-    <w:lsdException w:name="Table Columns 1" w:semiHidden="1" w:unhideWhenUsed="1"/>
-    <w:lsdException w:name="Table Columns 2" w:semiHidden="1" w:unhideWhenUsed="1"/>
-    <w:lsdException w:name="Table Columns 3" w:semiHidden="1" w:unhideWhenUsed="1"/>
-    <w:lsdException w:name="Table Columns 4" w:semiHidden="1" w:unhideWhenUsed="1"/>
-    <w:lsdException w:name="Table Columns 5" w:semiHidden="1" w:unhideWhenUsed="1"/>
-    <w:lsdException w:name="Table Grid 1" w:semiHidden="1" w:unhideWhenUsed="1"/>
-    <w:lsdException w:name="Table Grid 2" w:semiHidden="1" w:unhideWhenUsed="1"/>
-    <w:lsdException w:name="Table Grid 3" w:semiHidden="1" w:unhideWhenUsed="1"/>
-    <w:lsdException w:name="Table Grid 4" w:semiHidden="1" w:unhideWhenUsed="1"/>
-    <w:lsdException w:name="Table Grid 5" w:semiHidden="1" w:unhideWhenUsed="1"/>
-    <w:lsdException w:name="Table Grid 6" w:semiHidden="1" w:unhideWhenUsed="1"/>
-    <w:lsdException w:name="Table Grid 7" w:semiHidden="1" w:unhideWhenUsed="1"/>
-    <w:lsdException w:name="Table Grid 8" w:semiHidden="1" w:unhideWhenUsed="1"/>
-    <w:lsdException w:name="Table List 1" w:semiHidden="1" w:unhideWhenUsed="1"/>
-    <w:lsdException w:name="Table List 2" w:semiHidden="1" w:unhideWhenUsed="1"/>
-    <w:lsdException w:name="Table List 3" w:semiHidden="1" w:unhideWhenUsed="1"/>
-    <w:lsdException w:name="Table List 4" w:semiHidden="1" w:unhideWhenUsed="1"/>
-    <w:lsdException w:name="Table List 5" w:semiHidden="1" w:unhideWhenUsed="1"/>
-    <w:lsdException w:name="Table List 6" w:semiHidden="1" w:unhideWhenUsed="1"/>
-    <w:lsdException w:name="Table List 7" w:semiHidden="1" w:unhideWhenUsed="1"/>
-    <w:lsdException w:name="Table List 8" w:semiHidden="1" w:unhideWhenUsed="1"/>
-    <w:lsdException w:name="Table 3D effects 1" w:semiHidden="1" w:unhideWhenUsed="1"/>
-    <w:lsdException w:name="Table 3D effects 2" w:semiHidden="1" w:unhideWhenUsed="1"/>
-    <w:lsdException w:name="Table 3D effects 3" w:semiHidden="1" w:unhideWhenUsed="1"/>
-    <w:lsdException w:name="Table Contemporary" w:semiHidden="1" w:unhideWhenUsed="1"/>
-    <w:lsdException w:name="Table Elegant" w:semiHidden="1" w:unhideWhenUsed="1"/>
-    <w:lsdException w:name="Table Professional" w:semiHidden="1" w:unhideWhenUsed="1"/>
-    <w:lsdException w:name="Table Subtle 1" w:semiHidden="1" w:unhideWhenUsed="1"/>
-    <w:lsdException w:name="Table Subtle 2" w:semiHidden="1" w:unhideWhenUsed="1"/>
-    <w:lsdException w:name="Table Web 1" w:semiHidden="1" w:unhideWhenUsed="1"/>
-    <w:lsdException w:name="Table Web 2" w:semiHidden="1" w:unhideWhenUsed="1"/>
-    <w:lsdException w:name="Table Web 3" w:semiHidden="1" w:unhideWhenUsed="1"/>
-    <w:lsdException w:name="Balloon Text" w:semiHidden="1" w:unhideWhenUsed="1"/>
-    <w:lsdException w:name="Table Grid" w:uiPriority="59"/>
-    <w:lsdException w:name="Table Theme" w:semiHidden="1" w:unhideWhenUsed="1"/>
-    <w:lsdException w:name="Placeholder Text" w:semiHidden="1"/>
-    <w:lsdException w:name="No Spacing" w:uiPriority="1" w:qFormat="1"/>
-    <w:lsdException w:name="Light Shading" w:uiPriority="60"/>
-    <w:lsdException w:name="Light List" w:uiPriority="61"/>
-    <w:lsdException w:name="Light Grid" w:uiPriority="62"/>
-    <w:lsdException w:name="Medium Shading 1" w:uiPriority="63"/>
-    <w:lsdException w:name="Medium Shading 2" w:uiPriority="64"/>
-    <w:lsdException w:name="Medium List 1" w:uiPriority="65"/>
-    <w:lsdException w:name="Medium List 2" w:uiPriority="66"/>
-    <w:lsdException w:name="Medium Grid 1" w:uiPriority="67"/>
-    <w:lsdException w:name="Medium Grid 2" w:uiPriority="68"/>
-    <w:lsdException w:name="Medium Grid 3" w:uiPriority="69"/>
-    <w:lsdException w:name="Dark List" w:uiPriority="70"/>
-    <w:lsdException w:name="Colorful Shading" w:uiPriority="71"/>
-    <w:lsdException w:name="Colorful List" w:uiPriority="72"/>
-    <w:lsdException w:name="Colorful Grid" w:uiPriority="73"/>
-    <w:lsdException w:name="Light Shading Accent 1" w:uiPriority="60"/>
-    <w:lsdException w:name="Light List Accent 1" w:uiPriority="61"/>
-    <w:lsdException w:name="Light Grid Accent 1" w:uiPriority="62"/>
-    <w:lsdException w:name="Medium Shading 1 Accent 1" w:uiPriority="63"/>
-    <w:lsdException w:name="Medium Shading 2 Accent 1" w:uiPriority="64"/>
-    <w:lsdException w:name="Medium List 1 Accent 1" w:uiPriority="65"/>
-    <w:lsdException w:name="Revision" w:semiHidden="1"/>
-    <w:lsdException w:name="List Paragraph" w:uiPriority="34" w:qFormat="1"/>
-    <w:lsdException w:name="Quote" w:uiPriority="29" w:qFormat="1"/>
-    <w:lsdException w:name="Intense Quote" w:uiPriority="30" w:qFormat="1"/>
-    <w:lsdException w:name="Medium List 2 Accent 1" w:uiPriority="66"/>
-    <w:lsdException w:name="Medium Grid 1 Accent 1" w:uiPriority="67"/>
-    <w:lsdException w:name="Medium Grid 2 Accent 1" w:uiPriority="68"/>
-    <w:lsdException w:name="Medium Grid 3 Accent 1" w:uiPriority="69"/>
-    <w:lsdException w:name="Dark List Accent 1" w:uiPriority="70"/>
-    <w:lsdException w:name="Colorful Shading Accent 1" w:uiPriority="71"/>
-    <w:lsdException w:name="Colorful List Accent 1" w:uiPriority="72"/>
-    <w:lsdException w:name="Colorful Grid Accent 1" w:uiPriority="73"/>
-    <w:lsdException w:name="Light Shading Accent 2" w:uiPriority="60"/>
-    <w:lsdException w:name="Light List Accent 2" w:uiPriority="61"/>
-    <w:lsdException w:name="Light Grid Accent 2" w:uiPriority="62"/>
-    <w:lsdException w:name="Medium Shading 1 Accent 2" w:uiPriority="63"/>
-    <w:lsdException w:name="Medium Shading 2 Accent 2" w:uiPriority="64"/>
-    <w:lsdException w:name="Medium List 1 Accent 2" w:uiPriority="65"/>
-    <w:lsdException w:name="Medium List 2 Accent 2" w:uiPriority="66"/>
-    <w:lsdException w:name="Medium Grid 1 Accent 2" w:uiPriority="67"/>
-    <w:lsdException w:name="Medium Grid 2 Accent 2" w:uiPriority="68"/>
-    <w:lsdException w:name="Medium Grid 3 Accent 2" w:uiPriority="69"/>
-    <w:lsdException w:name="Dark List Accent 2" w:uiPriority="70"/>
-    <w:lsdException w:name="Colorful Shading Accent 2" w:uiPriority="71"/>
-    <w:lsdException w:name="Colorful List Accent 2" w:uiPriority="72"/>
-    <w:lsdException w:name="Colorful Grid Accent 2" w:uiPriority="73"/>
-    <w:lsdException w:name="Light Shading Accent 3" w:uiPriority="60"/>
-    <w:lsdException w:name="Light List Accent 3" w:uiPriority="61"/>
-    <w:lsdException w:name="Light Grid Accent 3" w:uiPriority="62"/>
-    <w:lsdException w:name="Medium Shading 1 Accent 3" w:uiPriority="63"/>
-    <w:lsdException w:name="Medium Shading 2 Accent 3" w:uiPriority="64"/>
-    <w:lsdException w:name="Medium List 1 Accent 3" w:uiPriority="65"/>
-    <w:lsdException w:name="Medium List 2 Accent 3" w:uiPriority="66"/>
-    <w:lsdException w:name="Medium Grid 1 Accent 3" w:uiPriority="67"/>
-    <w:lsdException w:name="Medium Grid 2 Accent 3" w:uiPriority="68"/>
-    <w:lsdException w:name="Medium Grid 3 Accent 3" w:uiPriority="69"/>
-    <w:lsdException w:name="Dark List Accent 3" w:uiPriority="70"/>
-    <w:lsdException w:name="Colorful Shading Accent 3" w:uiPriority="71"/>
-    <w:lsdException w:name="Colorful List Accent 3" w:uiPriority="72"/>
-    <w:lsdException w:name="Colorful Grid Accent 3" w:uiPriority="73"/>
-    <w:lsdException w:name="Light Shading Accent 4" w:uiPriority="60"/>
-    <w:lsdException w:name="Light List Accent 4" w:uiPriority="61"/>
-    <w:lsdException w:name="Light Grid Accent 4" w:uiPriority="62"/>
-    <w:lsdException w:name="Medium Shading 1 Accent 4" w:uiPriority="63"/>
-    <w:lsdException w:name="Medium Shading 2 Accent 4" w:uiPriority="64"/>
-    <w:lsdException w:name="Medium List 1 Accent 4" w:uiPriority="65"/>
-    <w:lsdException w:name="Medium List 2 Accent 4" w:uiPriority="66"/>
-    <w:lsdException w:name="Medium Grid 1 Accent 4" w:uiPriority="67"/>
-    <w:lsdException w:name="Medium Grid 2 Accent 4" w:uiPriority="68"/>
-    <w:lsdException w:name="Medium Grid 3 Accent 4" w:uiPriority="69"/>
-    <w:lsdException w:name="Dark List Accent 4" w:uiPriority="70"/>
-    <w:lsdException w:name="Colorful Shading Accent 4" w:uiPriority="71"/>
-    <w:lsdException w:name="Colorful List Accent 4" w:uiPriority="72"/>
-    <w:lsdException w:name="Colorful Grid Accent 4" w:uiPriority="73"/>
-    <w:lsdException w:name="Light Shading Accent 5" w:uiPriority="60"/>
-    <w:lsdException w:name="Light List Accent 5" w:uiPriority="61"/>
-    <w:lsdException w:name="Light Grid Accent 5" w:uiPriority="62"/>
-    <w:lsdException w:name="Medium Shading 1 Accent 5" w:uiPriority="63"/>
-    <w:lsdException w:name="Medium Shading 2 Accent 5" w:uiPriority="64"/>
-    <w:lsdException w:name="Medium List 1 Accent 5" w:uiPriority="65"/>
-    <w:lsdException w:name="Medium List 2 Accent 5" w:uiPriority="66"/>
-    <w:lsdException w:name="Medium Grid 1 Accent 5" w:uiPriority="67"/>
-    <w:lsdException w:name="Medium Grid 2 Accent 5" w:uiPriority="68"/>
-    <w:lsdException w:name="Medium Grid 3 Accent 5" w:uiPriority="69"/>
-    <w:lsdException w:name="Dark List Accent 5" w:uiPriority="70"/>
-    <w:lsdException w:name="Colorful Shading Accent 5" w:uiPriority="71"/>
-    <w:lsdException w:name="Colorful List Accent 5" w:uiPriority="72"/>
-    <w:lsdException w:name="Colorful Grid Accent 5" w:uiPriority="73"/>
-    <w:lsdException w:name="Light Shading Accent 6" w:uiPriority="60"/>
-    <w:lsdException w:name="Light List Accent 6" w:uiPriority="61"/>
-    <w:lsdException w:name="Light Grid Accent 6" w:uiPriority="62"/>
-    <w:lsdException w:name="Medium Shading 1 Accent 6" w:uiPriority="63"/>
-    <w:lsdException w:name="Medium Shading 2 Accent 6" w:uiPriority="64"/>
-    <w:lsdException w:name="Medium List 1 Accent 6" w:uiPriority="65"/>
-    <w:lsdException w:name="Medium List 2 Accent 6" w:uiPriority="66"/>
-    <w:lsdException w:name="Medium Grid 1 Accent 6" w:uiPriority="67"/>
-    <w:lsdException w:name="Medium Grid 2 Accent 6" w:uiPriority="68"/>
-    <w:lsdException w:name="Medium Grid 3 Accent 6" w:uiPriority="69"/>
-    <w:lsdException w:name="Dark List Accent 6" w:uiPriority="70"/>
-    <w:lsdException w:name="Colorful Shading Accent 6" w:uiPriority="71"/>
-    <w:lsdException w:name="Colorful List Accent 6" w:uiPriority="72"/>
-    <w:lsdException w:name="Colorful Grid Accent 6" w:uiPriority="73"/>
-    <w:lsdException w:name="Subtle Emphasis" w:uiPriority="19" w:qFormat="1"/>
-    <w:lsdException w:name="Intense Emphasis" w:uiPriority="21" w:qFormat="1"/>
-    <w:lsdException w:name="Subtle Reference" w:uiPriority="31" w:qFormat="1"/>
-    <w:lsdException w:name="Intense Reference" w:uiPriority="32" w:qFormat="1"/>
-    <w:lsdException w:name="Book Title" w:uiPriority="33" w:qFormat="1"/>
-    <w:lsdException w:name="Bibliography" w:semiHidden="1" w:uiPriority="37" w:unhideWhenUsed="1"/>
-    <w:lsdException w:name="TOC Heading" w:semiHidden="1" w:uiPriority="39" w:unhideWhenUsed="1" w:qFormat="1"/>
-    <w:lsdException w:name="Plain Table 1" w:uiPriority="41"/>
-    <w:lsdException w:name="Plain Table 2" w:uiPriority="42"/>
-    <w:lsdException w:name="Plain Table 3" w:uiPriority="43"/>
-    <w:lsdException w:name="Plain Table 4" w:uiPriority="44"/>
-    <w:lsdException w:name="Plain Table 5" w:uiPriority="45"/>
-    <w:lsdException w:name="Grid Table Light" w:uiPriority="40"/>
-    <w:lsdException w:name="Grid Table 1 Light" w:uiPriority="46"/>
-    <w:lsdException w:name="Grid Table 2" w:uiPriority="47"/>
-    <w:lsdException w:name="Grid Table 3" w:uiPriority="48"/>
-    <w:lsdException w:name="Grid Table 4" w:uiPriority="49"/>
-    <w:lsdException w:name="Grid Table 5 Dark" w:uiPriority="50"/>
-    <w:lsdException w:name="Grid Table 6 Colorful" w:uiPriority="51"/>
-    <w:lsdException w:name="Grid Table 7 Colorful" w:uiPriority="52"/>
-    <w:lsdException w:name="Grid Table 1 Light Accent 1" w:uiPriority="46"/>
-    <w:lsdException w:name="Grid Table 2 Accent 1" w:uiPriority="47"/>
-    <w:lsdException w:name="Grid Table 3 Accent 1" w:uiPriority="48"/>
-    <w:lsdException w:name="Grid Table 4 Accent 1" w:uiPriority="49"/>
-    <w:lsdException w:name="Grid Table 5 Dark Accent 1" w:uiPriority="50"/>
-    <w:lsdException w:name="Grid Table 6 Colorful Accent 1" w:uiPriority="51"/>
-    <w:lsdException w:name="Grid Table 7 Colorful Accent 1" w:uiPriority="52"/>
-    <w:lsdException w:name="Grid Table 1 Light Accent 2" w:uiPriority="46"/>
-    <w:lsdException w:name="Grid Table 2 Accent 2" w:uiPriority="47"/>
-    <w:lsdException w:name="Grid Table 3 Accent 2" w:uiPriority="48"/>
-    <w:lsdException w:name="Grid Table 4 Accent 2" w:uiPriority="49"/>
-    <w:lsdException w:name="Grid Table 5 Dark Accent 2" w:uiPriority="50"/>
-    <w:lsdException w:name="Grid Table 6 Colorful Accent 2" w:uiPriority="51"/>
-    <w:lsdException w:name="Grid Table 7 Colorful Accent 2" w:uiPriority="52"/>
-    <w:lsdException w:name="Grid Table 1 Light Accent 3" w:uiPriority="46"/>
-    <w:lsdException w:name="Grid Table 2 Accent 3" w:uiPriority="47"/>
-    <w:lsdException w:name="Grid Table 3 Accent 3" w:uiPriority="48"/>
-    <w:lsdException w:name="Grid Table 4 Accent 3" w:uiPriority="49"/>
-    <w:lsdException w:name="Grid Table 5 Dark Accent 3" w:uiPriority="50"/>
-    <w:lsdException w:name="Grid Table 6 Colorful Accent 3" w:uiPriority="51"/>
-    <w:lsdException w:name="Grid Table 7 Colorful Accent 3" w:uiPriority="52"/>
-    <w:lsdException w:name="Grid Table 1 Light Accent 4" w:uiPriority="46"/>
-    <w:lsdException w:name="Grid Table 2 Accent 4" w:uiPriority="47"/>
-    <w:lsdException w:name="Grid Table 3 Accent 4" w:uiPriority="48"/>
-    <w:lsdException w:name="Grid Table 4 Accent 4" w:uiPriority="49"/>
-    <w:lsdException w:name="Grid Table 5 Dark Accent 4" w:uiPriority="50"/>
-    <w:lsdException w:name="Grid Table 6 Colorful Accent 4" w:uiPriority="51"/>
-    <w:lsdException w:name="Grid Table 7 Colorful Accent 4" w:uiPriority="52"/>
-    <w:lsdException w:name="Grid Table 1 Light Accent 5" w:uiPriority="46"/>
-    <w:lsdException w:name="Grid Table 2 Accent 5" w:uiPriority="47"/>
-    <w:lsdException w:name="Grid Table 3 Accent 5" w:uiPriority="48"/>
-    <w:lsdException w:name="Grid Table 4 Accent 5" w:uiPriority="49"/>
-    <w:lsdException w:name="Grid Table 5 Dark Accent 5" w:uiPriority="50"/>
-    <w:lsdException w:name="Grid Table 6 Colorful Accent 5" w:uiPriority="51"/>
-    <w:lsdException w:name="Grid Table 7 Colorful Accent 5" w:uiPriority="52"/>
-    <w:lsdException w:name="Grid Table 1 Light Accent 6" w:uiPriority="46"/>
-    <w:lsdException w:name="Grid Table 2 Accent 6" w:uiPriority="47"/>
-    <w:lsdException w:name="Grid Table 3 Accent 6" w:uiPriority="48"/>
-    <w:lsdException w:name="Grid Table 4 Accent 6" w:uiPriority="49"/>
-    <w:lsdException w:name="Grid Table 5 Dark Accent 6" w:uiPriority="50"/>
-    <w:lsdException w:name="Grid Table 6 Colorful Accent 6" w:uiPriority="51"/>
-    <w:lsdException w:name="Grid Table 7 Colorful Accent 6" w:uiPriority="52"/>
-    <w:lsdException w:name="List Table 1 Light" w:uiPriority="46"/>
-    <w:lsdException w:name="List Table 2" w:uiPriority="47"/>
-    <w:lsdException w:name="List Table 3" w:uiPriority="48"/>
-    <w:lsdException w:name="List Table 4" w:uiPriority="49"/>
-    <w:lsdException w:name="List Table 5 Dark" w:uiPriority="50"/>
-    <w:lsdException w:name="List Table 6 Colorful" w:uiPriority="51"/>
-    <w:lsdException w:name="List Table 7 Colorful" w:uiPriority="52"/>
-    <w:lsdException w:name="List Table 1 Light Accent 1" w:uiPriority="46"/>
-    <w:lsdException w:name="List Table 2 Accent 1" w:uiPriority="47"/>
-    <w:lsdException w:name="List Table 3 Accent 1" w:uiPriority="48"/>
-    <w:lsdException w:name="List Table 4 Accent 1" w:uiPriority="49"/>
-    <w:lsdException w:name="List Table 5 Dark Accent 1" w:uiPriority="50"/>
-    <w:lsdException w:name="List Table 6 Colorful Accent 1" w:uiPriority="51"/>
-    <w:lsdException w:name="List Table 7 Colorful Accent 1" w:uiPriority="52"/>
-    <w:lsdException w:name="List Table 1 Light Accent 2" w:uiPriority="46"/>
-    <w:lsdException w:name="List Table 2 Accent 2" w:uiPriority="47"/>
-    <w:lsdException w:name="List Table 3 Accent 2" w:uiPriority="48"/>
-    <w:lsdException w:name="List Table 4 Accent 2" w:uiPriority="49"/>
-    <w:lsdException w:name="List Table 5 Dark Accent 2" w:uiPriority="50"/>
-    <w:lsdException w:name="List Table 6 Colorful Accent 2" w:uiPriority="51"/>
-    <w:lsdException w:name="List Table 7 Colorful Accent 2" w:uiPriority="52"/>
-    <w:lsdException w:name="List Table 1 Light Accent 3" w:uiPriority="46"/>
-    <w:lsdException w:name="List Table 2 Accent 3" w:uiPriority="47"/>
-    <w:lsdException w:name="List Table 3 Accent 3" w:uiPriority="48"/>
-    <w:lsdException w:name="List Table 4 Accent 3" w:uiPriority="49"/>
-    <w:lsdException w:name="List Table 5 Dark Accent 3" w:uiPriority="50"/>
-    <w:lsdException w:name="List Table 6 Colorful Accent 3" w:uiPriority="51"/>
-    <w:lsdException w:name="List Table 7 Colorful Accent 3" w:uiPriority="52"/>
-    <w:lsdException w:name="List Table 1 Light Accent 4" w:uiPriority="46"/>
-    <w:lsdException w:name="List Table 2 Accent 4" w:uiPriority="47"/>
-    <w:lsdException w:name="List Table 3 Accent 4" w:uiPriority="48"/>
-    <w:lsdException w:name="List Table 4 Accent 4" w:uiPriority="49"/>
-    <w:lsdException w:name="List Table 5 Dark Accent 4" w:uiPriority="50"/>
-    <w:lsdException w:name="List Table 6 Colorful Accent 4" w:uiPriority="51"/>
-    <w:lsdException w:name="List Table 7 Colorful Accent 4" w:uiPriority="52"/>
-    <w:lsdException w:name="List Table 1 Light Accent 5" w:uiPriority="46"/>
-    <w:lsdException w:name="List Table 2 Accent 5" w:uiPriority="47"/>
-    <w:lsdException w:name="List Table 3 Accent 5" w:uiPriority="48"/>
-    <w:lsdException w:name="List Table 4 Accent 5" w:uiPriority="49"/>
-    <w:lsdException w:name="List Table 5 Dark Accent 5" w:uiPriority="50"/>
-    <w:lsdException w:name="List Table 6 Colorful Accent 5" w:uiPriority="51"/>
-    <w:lsdException w:name="List Table 7 Colorful Accent 5" w:uiPriority="52"/>
-    <w:lsdException w:name="List Table 1 Light Accent 6" w:uiPriority="46"/>
-    <w:lsdException w:name="List Table 2 Accent 6" w:uiPriority="47"/>
-    <w:lsdException w:name="List Table 3 Accent 6" w:uiPriority="48"/>
-    <w:lsdException w:name="List Table 4 Accent 6" w:uiPriority="49"/>
-    <w:lsdException w:name="List Table 5 Dark Accent 6" w:uiPriority="50"/>
-    <w:lsdException w:name="List Table 6 Colorful Accent 6" w:uiPriority="51"/>
-    <w:lsdException w:name="List Table 7 Colorful Accent 6" w:uiPriority="52"/>
+  <w:latentStyles w:defLockedState="0" w:defUIPriority="99" w:defSemiHidden="1" w:defUnhideWhenUsed="1" w:defQFormat="0" w:count="267">
+    <w:lsdException w:name="Normal" w:semiHidden="0" w:uiPriority="0" w:unhideWhenUsed="0" w:qFormat="1"/>
+    <w:lsdException w:name="heading 1" w:semiHidden="0" w:uiPriority="9" w:unhideWhenUsed="0" w:qFormat="1"/>
+    <w:lsdException w:name="heading 2" w:uiPriority="9" w:qFormat="1"/>
+    <w:lsdException w:name="heading 3" w:uiPriority="9" w:qFormat="1"/>
+    <w:lsdException w:name="heading 4" w:uiPriority="9" w:qFormat="1"/>
+    <w:lsdException w:name="heading 5" w:uiPriority="9" w:qFormat="1"/>
+    <w:lsdException w:name="heading 6" w:uiPriority="9" w:qFormat="1"/>
+    <w:lsdException w:name="heading 7" w:uiPriority="9" w:qFormat="1"/>
+    <w:lsdException w:name="heading 8" w:uiPriority="9" w:qFormat="1"/>
+    <w:lsdException w:name="heading 9" w:uiPriority="9" w:qFormat="1"/>
+    <w:lsdException w:name="toc 1" w:uiPriority="39"/>
+    <w:lsdException w:name="toc 2" w:uiPriority="39"/>
+    <w:lsdException w:name="toc 3" w:uiPriority="39"/>
+    <w:lsdException w:name="toc 4" w:uiPriority="39"/>
+    <w:lsdException w:name="toc 5" w:uiPriority="39"/>
+    <w:lsdException w:name="toc 6" w:uiPriority="39"/>
+    <w:lsdException w:name="toc 7" w:uiPriority="39"/>
+    <w:lsdException w:name="toc 8" w:uiPriority="39"/>
+    <w:lsdException w:name="toc 9" w:uiPriority="39"/>
+    <w:lsdException w:name="caption" w:uiPriority="35" w:qFormat="1"/>
+    <w:lsdException w:name="Title" w:semiHidden="0" w:uiPriority="10" w:unhideWhenUsed="0" w:qFormat="1"/>
+    <w:lsdException w:name="Default Paragraph Font" w:uiPriority="1"/>
+    <w:lsdException w:name="Subtitle" w:semiHidden="0" w:uiPriority="11" w:unhideWhenUsed="0" w:qFormat="1"/>
+    <w:lsdException w:name="Strong" w:semiHidden="0" w:uiPriority="22" w:unhideWhenUsed="0" w:qFormat="1"/>
+    <w:lsdException w:name="Emphasis" w:semiHidden="0" w:uiPriority="20" w:unhideWhenUsed="0" w:qFormat="1"/>
+    <w:lsdException w:name="Table Grid" w:semiHidden="0" w:uiPriority="59" w:unhideWhenUsed="0"/>
+    <w:lsdException w:name="Placeholder Text" w:unhideWhenUsed="0"/>
+    <w:lsdException w:name="No Spacing" w:semiHidden="0" w:uiPriority="1" w:unhideWhenUsed="0" w:qFormat="1"/>
+    <w:lsdException w:name="Light Shading" w:semiHidden="0" w:uiPriority="60" w:unhideWhenUsed="0"/>
+    <w:lsdException w:name="Light List" w:semiHidden="0" w:uiPriority="61" w:unhideWhenUsed="0"/>
+    <w:lsdException w:name="Light Grid" w:semiHidden="0" w:uiPriority="62" w:unhideWhenUsed="0"/>
+    <w:lsdException w:name="Medium Shading 1" w:semiHidden="0" w:uiPriority="63" w:unhideWhenUsed="0"/>
+    <w:lsdException w:name="Medium Shading 2" w:semiHidden="0" w:uiPriority="64" w:unhideWhenUsed="0"/>
+    <w:lsdException w:name="Medium List 1" w:semiHidden="0" w:uiPriority="65" w:unhideWhenUsed="0"/>
+    <w:lsdException w:name="Medium List 2" w:semiHidden="0" w:uiPriority="66" w:unhideWhenUsed="0"/>
+    <w:lsdException w:name="Medium Grid 1" w:semiHidden="0" w:uiPriority="67" w:unhideWhenUsed="0"/>
+    <w:lsdException w:name="Medium Grid 2" w:semiHidden="0" w:uiPriority="68" w:unhideWhenUsed="0"/>
+    <w:lsdException w:name="Medium Grid 3" w:semiHidden="0" w:uiPriority="69" w:unhideWhenUsed="0"/>
+    <w:lsdException w:name="Dark List" w:semiHidden="0" w:uiPriority="70" w:unhideWhenUsed="0"/>
+    <w:lsdException w:name="Colorful Shading" w:semiHidden="0" w:uiPriority="71" w:unhideWhenUsed="0"/>
+    <w:lsdException w:name="Colorful List" w:semiHidden="0" w:uiPriority="72" w:unhideWhenUsed="0"/>
+    <w:lsdException w:name="Colorful Grid" w:semiHidden="0" w:uiPriority="73" w:unhideWhenUsed="0"/>
+    <w:lsdException w:name="Light Shading Accent 1" w:semiHidden="0" w:uiPriority="60" w:unhideWhenUsed="0"/>
+    <w:lsdException w:name="Light List Accent 1" w:semiHidden="0" w:uiPriority="61" w:unhideWhenUsed="0"/>
+    <w:lsdException w:name="Light Grid Accent 1" w:semiHidden="0" w:uiPriority="62" w:unhideWhenUsed="0"/>
+    <w:lsdException w:name="Medium Shading 1 Accent 1" w:semiHidden="0" w:uiPriority="63" w:unhideWhenUsed="0"/>
+    <w:lsdException w:name="Medium Shading 2 Accent 1" w:semiHidden="0" w:uiPriority="64" w:unhideWhenUsed="0"/>
+    <w:lsdException w:name="Medium List 1 Accent 1" w:semiHidden="0" w:uiPriority="65" w:unhideWhenUsed="0"/>
+    <w:lsdException w:name="Revision" w:unhideWhenUsed="0"/>
+    <w:lsdException w:name="List Paragraph" w:semiHidden="0" w:uiPriority="34" w:unhideWhenUsed="0" w:qFormat="1"/>
+    <w:lsdException w:name="Quote" w:semiHidden="0" w:uiPriority="29" w:unhideWhenUsed="0" w:qFormat="1"/>
+    <w:lsdException w:name="Intense Quote" w:semiHidden="0" w:uiPriority="30" w:unhideWhenUsed="0" w:qFormat="1"/>
+    <w:lsdException w:name="Medium List 2 Accent 1" w:semiHidden="0" w:uiPriority="66" w:unhideWhenUsed="0"/>
+    <w:lsdException w:name="Medium Grid 1 Accent 1" w:semiHidden="0" w:uiPriority="67" w:unhideWhenUsed="0"/>
+    <w:lsdException w:name="Medium Grid 2 Accent 1" w:semiHidden="0" w:uiPriority="68" w:unhideWhenUsed="0"/>
+    <w:lsdException w:name="Medium Grid 3 Accent 1" w:semiHidden="0" w:uiPriority="69" w:unhideWhenUsed="0"/>
+    <w:lsdException w:name="Dark List Accent 1" w:semiHidden="0" w:uiPriority="70" w:unhideWhenUsed="0"/>
+    <w:lsdException w:name="Colorful Shading Accent 1" w:semiHidden="0" w:uiPriority="71" w:unhideWhenUsed="0"/>
+    <w:lsdException w:name="Colorful List Accent 1" w:semiHidden="0" w:uiPriority="72" w:unhideWhenUsed="0"/>
+    <w:lsdException w:name="Colorful Grid Accent 1" w:semiHidden="0" w:uiPriority="73" w:unhideWhenUsed="0"/>
+    <w:lsdException w:name="Light Shading Accent 2" w:semiHidden="0" w:uiPriority="60" w:unhideWhenUsed="0"/>
+    <w:lsdException w:name="Light List Accent 2" w:semiHidden="0" w:uiPriority="61" w:unhideWhenUsed="0"/>
+    <w:lsdException w:name="Light Grid Accent 2" w:semiHidden="0" w:uiPriority="62" w:unhideWhenUsed="0"/>
+    <w:lsdException w:name="Medium Shading 1 Accent 2" w:semiHidden="0" w:uiPriority="63" w:unhideWhenUsed="0"/>
+    <w:lsdException w:name="Medium Shading 2 Accent 2" w:semiHidden="0" w:uiPriority="64" w:unhideWhenUsed="0"/>
+    <w:lsdException w:name="Medium List 1 Accent 2" w:semiHidden="0" w:uiPriority="65" w:unhideWhenUsed="0"/>
+    <w:lsdException w:name="Medium List 2 Accent 2" w:semiHidden="0" w:uiPriority="66" w:unhideWhenUsed="0"/>
+    <w:lsdException w:name="Medium Grid 1 Accent 2" w:semiHidden="0" w:uiPriority="67" w:unhideWhenUsed="0"/>
+    <w:lsdException w:name="Medium Grid 2 Accent 2" w:semiHidden="0" w:uiPriority="68" w:unhideWhenUsed="0"/>
+    <w:lsdException w:name="Medium Grid 3 Accent 2" w:semiHidden="0" w:uiPriority="69" w:unhideWhenUsed="0"/>
+    <w:lsdException w:name="Dark List Accent 2" w:semiHidden="0" w:uiPriority="70" w:unhideWhenUsed="0"/>
+    <w:lsdException w:name="Colorful Shading Accent 2" w:semiHidden="0" w:uiPriority="71" w:unhideWhenUsed="0"/>
+    <w:lsdException w:name="Colorful List Accent 2" w:semiHidden="0" w:uiPriority="72" w:unhideWhenUsed="0"/>
+    <w:lsdException w:name="Colorful Grid Accent 2" w:semiHidden="0" w:uiPriority="73" w:unhideWhenUsed="0"/>
+    <w:lsdException w:name="Light Shading Accent 3" w:semiHidden="0" w:uiPriority="60" w:unhideWhenUsed="0"/>
+    <w:lsdException w:name="Light List Accent 3" w:semiHidden="0" w:uiPriority="61" w:unhideWhenUsed="0"/>
+    <w:lsdException w:name="Light Grid Accent 3" w:semiHidden="0" w:uiPriority="62" w:unhideWhenUsed="0"/>
+    <w:lsdException w:name="Medium Shading 1 Accent 3" w:semiHidden="0" w:uiPriority="63" w:unhideWhenUsed="0"/>
+    <w:lsdException w:name="Medium Shading 2 Accent 3" w:semiHidden="0" w:uiPriority="64" w:unhideWhenUsed="0"/>
+    <w:lsdException w:name="Medium List 1 Accent 3" w:semiHidden="0" w:uiPriority="65" w:unhideWhenUsed="0"/>
+    <w:lsdException w:name="Medium List 2 Accent 3" w:semiHidden="0" w:uiPriority="66" w:unhideWhenUsed="0"/>
+    <w:lsdException w:name="Medium Grid 1 Accent 3" w:semiHidden="0" w:uiPriority="67" w:unhideWhenUsed="0"/>
+    <w:lsdException w:name="Medium Grid 2 Accent 3" w:semiHidden="0" w:uiPriority="68" w:unhideWhenUsed="0"/>
+    <w:lsdException w:name="Medium Grid 3 Accent 3" w:semiHidden="0" w:uiPriority="69" w:unhideWhenUsed="0"/>
+    <w:lsdException w:name="Dark List Accent 3" w:semiHidden="0" w:uiPriority="70" w:unhideWhenUsed="0"/>
+    <w:lsdException w:name="Colorful Shading Accent 3" w:semiHidden="0" w:uiPriority="71" w:unhideWhenUsed="0"/>
+    <w:lsdException w:name="Colorful List Accent 3" w:semiHidden="0" w:uiPriority="72" w:unhideWhenUsed="0"/>
+    <w:lsdException w:name="Colorful Grid Accent 3" w:semiHidden="0" w:uiPriority="73" w:unhideWhenUsed="0"/>
+    <w:lsdException w:name="Light Shading Accent 4" w:semiHidden="0" w:uiPriority="60" w:unhideWhenUsed="0"/>
+    <w:lsdException w:name="Light List Accent 4" w:semiHidden="0" w:uiPriority="61" w:unhideWhenUsed="0"/>
+    <w:lsdException w:name="Light Grid Accent 4" w:semiHidden="0" w:uiPriority="62" w:unhideWhenUsed="0"/>
+    <w:lsdException w:name="Medium Shading 1 Accent 4" w:semiHidden="0" w:uiPriority="63" w:unhideWhenUsed="0"/>
+    <w:lsdException w:name="Medium Shading 2 Accent 4" w:semiHidden="0" w:uiPriority="64" w:unhideWhenUsed="0"/>
+    <w:lsdException w:name="Medium List 1 Accent 4" w:semiHidden="0" w:uiPriority="65" w:unhideWhenUsed="0"/>
+    <w:lsdException w:name="Medium List 2 Accent 4" w:semiHidden="0" w:uiPriority="66" w:unhideWhenUsed="0"/>
+    <w:lsdException w:name="Medium Grid 1 Accent 4" w:semiHidden="0" w:uiPriority="67" w:unhideWhenUsed="0"/>
+    <w:lsdException w:name="Medium Grid 2 Accent 4" w:semiHidden="0" w:uiPriority="68" w:unhideWhenUsed="0"/>
+    <w:lsdException w:name="Medium Grid 3 Accent 4" w:semiHidden="0" w:uiPriority="69" w:unhideWhenUsed="0"/>
+    <w:lsdException w:name="Dark List Accent 4" w:semiHidden="0" w:uiPriority="70" w:unhideWhenUsed="0"/>
+    <w:lsdException w:name="Colorful Shading Accent 4" w:semiHidden="0" w:uiPriority="71" w:unhideWhenUsed="0"/>
+    <w:lsdException w:name="Colorful List Accent 4" w:semiHidden="0" w:uiPriority="72" w:unhideWhenUsed="0"/>
+    <w:lsdException w:name="Colorful Grid Accent 4" w:semiHidden="0" w:uiPriority="73" w:unhideWhenUsed="0"/>
+    <w:lsdException w:name="Light Shading Accent 5" w:semiHidden="0" w:uiPriority="60" w:unhideWhenUsed="0"/>
+    <w:lsdException w:name="Light List Accent 5" w:semiHidden="0" w:uiPriority="61" w:unhideWhenUsed="0"/>
+    <w:lsdException w:name="Light Grid Accent 5" w:semiHidden="0" w:uiPriority="62" w:unhideWhenUsed="0"/>
+    <w:lsdException w:name="Medium Shading 1 Accent 5" w:semiHidden="0" w:uiPriority="63" w:unhideWhenUsed="0"/>
+    <w:lsdException w:name="Medium Shading 2 Accent 5" w:semiHidden="0" w:uiPriority="64" w:unhideWhenUsed="0"/>
+    <w:lsdException w:name="Medium List 1 Accent 5" w:semiHidden="0" w:uiPriority="65" w:unhideWhenUsed="0"/>
+    <w:lsdException w:name="Medium List 2 Accent 5" w:semiHidden="0" w:uiPriority="66" w:unhideWhenUsed="0"/>
+    <w:lsdException w:name="Medium Grid 1 Accent 5" w:semiHidden="0" w:uiPriority="67" w:unhideWhenUsed="0"/>
+    <w:lsdException w:name="Medium Grid 2 Accent 5" w:semiHidden="0" w:uiPriority="68" w:unhideWhenUsed="0"/>
+    <w:lsdException w:name="Medium Grid 3 Accent 5" w:semiHidden="0" w:uiPriority="69" w:unhideWhenUsed="0"/>
+    <w:lsdException w:name="Dark List Accent 5" w:semiHidden="0" w:uiPriority="70" w:unhideWhenUsed="0"/>
+    <w:lsdException w:name="Colorful Shading Accent 5" w:semiHidden="0" w:uiPriority="71" w:unhideWhenUsed="0"/>
+    <w:lsdException w:name="Colorful List Accent 5" w:semiHidden="0" w:uiPriority="72" w:unhideWhenUsed="0"/>
+    <w:lsdException w:name="Colorful Grid Accent 5" w:semiHidden="0" w:uiPriority="73" w:unhideWhenUsed="0"/>
+    <w:lsdException w:name="Light Shading Accent 6" w:semiHidden="0" w:uiPriority="60" w:unhideWhenUsed="0"/>
+    <w:lsdException w:name="Light List Accent 6" w:semiHidden="0" w:uiPriority="61" w:unhideWhenUsed="0"/>
+    <w:lsdException w:name="Light Grid Accent 6" w:semiHidden="0" w:uiPriority="62" w:unhideWhenUsed="0"/>
+    <w:lsdException w:name="Medium Shading 1 Accent 6" w:semiHidden="0" w:uiPriority="63" w:unhideWhenUsed="0"/>
+    <w:lsdException w:name="Medium Shading 2 Accent 6" w:semiHidden="0" w:uiPriority="64" w:unhideWhenUsed="0"/>
+    <w:lsdException w:name="Medium List 1 Accent 6" w:semiHidden="0" w:uiPriority="65" w:unhideWhenUsed="0"/>
+    <w:lsdException w:name="Medium List 2 Accent 6" w:semiHidden="0" w:uiPriority="66" w:unhideWhenUsed="0"/>
+    <w:lsdException w:name="Medium Grid 1 Accent 6" w:semiHidden="0" w:uiPriority="67" w:unhideWhenUsed="0"/>
+    <w:lsdException w:name="Medium Grid 2 Accent 6" w:semiHidden="0" w:uiPriority="68" w:unhideWhenUsed="0"/>
+    <w:lsdException w:name="Medium Grid 3 Accent 6" w:semiHidden="0" w:uiPriority="69" w:unhideWhenUsed="0"/>
+    <w:lsdException w:name="Dark List Accent 6" w:semiHidden="0" w:uiPriority="70" w:unhideWhenUsed="0"/>
+    <w:lsdException w:name="Colorful Shading Accent 6" w:semiHidden="0" w:uiPriority="71" w:unhideWhenUsed="0"/>
+    <w:lsdException w:name="Colorful List Accent 6" w:semiHidden="0" w:uiPriority="72" w:unhideWhenUsed="0"/>
+    <w:lsdException w:name="Colorful Grid Accent 6" w:semiHidden="0" w:uiPriority="73" w:unhideWhenUsed="0"/>
+    <w:lsdException w:name="Subtle Emphasis" w:semiHidden="0" w:uiPriority="19" w:unhideWhenUsed="0" w:qFormat="1"/>
+    <w:lsdException w:name="Intense Emphasis" w:semiHidden="0" w:uiPriority="21" w:unhideWhenUsed="0" w:qFormat="1"/>
+    <w:lsdException w:name="Subtle Reference" w:semiHidden="0" w:uiPriority="31" w:unhideWhenUsed="0" w:qFormat="1"/>
+    <w:lsdException w:name="Intense Reference" w:semiHidden="0" w:uiPriority="32" w:unhideWhenUsed="0" w:qFormat="1"/>
+    <w:lsdException w:name="Book Title" w:semiHidden="0" w:uiPriority="33" w:unhideWhenUsed="0" w:qFormat="1"/>
+    <w:lsdException w:name="Bibliography" w:uiPriority="37"/>
+    <w:lsdException w:name="TOC Heading" w:uiPriority="39" w:qFormat="1"/>
   </w:latentStyles>
   <w:style w:type="paragraph" w:default="1" w:styleId="a">
     <w:name w:val="Normal"/>
@@ -8487,7 +9755,6 @@
       <w:spacing w:after="0" w:line="240" w:lineRule="auto"/>
     </w:pPr>
     <w:tblPr>
-      <w:tblInd w:w="0" w:type="dxa"/>
       <w:tblBorders>
         <w:top w:val="single" w:sz="4" w:space="0" w:color="auto"/>
         <w:left w:val="single" w:sz="4" w:space="0" w:color="auto"/>
@@ -8496,12 +9763,318 @@
         <w:insideH w:val="single" w:sz="4" w:space="0" w:color="auto"/>
         <w:insideV w:val="single" w:sz="4" w:space="0" w:color="auto"/>
       </w:tblBorders>
+    </w:tblPr>
+  </w:style>
+  <w:style w:type="paragraph" w:styleId="a8">
+    <w:name w:val="List Paragraph"/>
+    <w:basedOn w:val="a"/>
+    <w:uiPriority w:val="34"/>
+    <w:qFormat/>
+    <w:rsid w:val="002977D2"/>
+    <w:pPr>
+      <w:ind w:left="720"/>
+      <w:contextualSpacing/>
+    </w:pPr>
+  </w:style>
+  <w:style w:type="paragraph" w:styleId="HTML">
+    <w:name w:val="HTML Preformatted"/>
+    <w:basedOn w:val="a"/>
+    <w:link w:val="HTML0"/>
+    <w:uiPriority w:val="99"/>
+    <w:unhideWhenUsed/>
+    <w:rsid w:val="006C30EF"/>
+    <w:pPr>
+      <w:tabs>
+        <w:tab w:val="left" w:pos="916"/>
+        <w:tab w:val="left" w:pos="1832"/>
+        <w:tab w:val="left" w:pos="2748"/>
+        <w:tab w:val="left" w:pos="3664"/>
+        <w:tab w:val="left" w:pos="4580"/>
+        <w:tab w:val="left" w:pos="5496"/>
+        <w:tab w:val="left" w:pos="6412"/>
+        <w:tab w:val="left" w:pos="7328"/>
+        <w:tab w:val="left" w:pos="8244"/>
+        <w:tab w:val="left" w:pos="9160"/>
+        <w:tab w:val="left" w:pos="10076"/>
+        <w:tab w:val="left" w:pos="10992"/>
+        <w:tab w:val="left" w:pos="11908"/>
+        <w:tab w:val="left" w:pos="12824"/>
+        <w:tab w:val="left" w:pos="13740"/>
+        <w:tab w:val="left" w:pos="14656"/>
+      </w:tabs>
+      <w:spacing w:after="0" w:line="240" w:lineRule="auto"/>
+    </w:pPr>
+    <w:rPr>
+      <w:rFonts w:ascii="Courier New" w:eastAsia="Times New Roman" w:hAnsi="Courier New" w:cs="Courier New"/>
+      <w:sz w:val="20"/>
+      <w:szCs w:val="20"/>
+      <w:lang w:eastAsia="ru-RU"/>
+    </w:rPr>
+  </w:style>
+  <w:style w:type="character" w:customStyle="1" w:styleId="HTML0">
+    <w:name w:val="Стандартный HTML Знак"/>
+    <w:basedOn w:val="a0"/>
+    <w:link w:val="HTML"/>
+    <w:uiPriority w:val="99"/>
+    <w:rsid w:val="006C30EF"/>
+    <w:rPr>
+      <w:rFonts w:ascii="Courier New" w:eastAsia="Times New Roman" w:hAnsi="Courier New" w:cs="Courier New"/>
+      <w:sz w:val="20"/>
+      <w:szCs w:val="20"/>
+      <w:lang w:eastAsia="ru-RU"/>
+    </w:rPr>
+  </w:style>
+</w:styles>
+</file>
+
+<file path=word/stylesWithEffects.xml><?xml version="1.0" encoding="utf-8"?>
+<w:styles xmlns:wpc="http://schemas.microsoft.com/office/word/2010/wordprocessingCanvas" xmlns:mc="http://schemas.openxmlformats.org/markup-compatibility/2006" xmlns:o="urn:schemas-microsoft-com:office:office" xmlns:r="http://schemas.openxmlformats.org/officeDocument/2006/relationships" xmlns:m="http://schemas.openxmlformats.org/officeDocument/2006/math" xmlns:v="urn:schemas-microsoft-com:vml" xmlns:wp14="http://schemas.microsoft.com/office/word/2010/wordprocessingDrawing" xmlns:wp="http://schemas.openxmlformats.org/drawingml/2006/wordprocessingDrawing" xmlns:w10="urn:schemas-microsoft-com:office:word" xmlns:w="http://schemas.openxmlformats.org/wordprocessingml/2006/main" xmlns:w14="http://schemas.microsoft.com/office/word/2010/wordml" xmlns:wpg="http://schemas.microsoft.com/office/word/2010/wordprocessingGroup" xmlns:wpi="http://schemas.microsoft.com/office/word/2010/wordprocessingInk" xmlns:wne="http://schemas.microsoft.com/office/word/2006/wordml" xmlns:wps="http://schemas.microsoft.com/office/word/2010/wordprocessingShape" mc:Ignorable="w14 wp14">
+  <w:docDefaults>
+    <w:rPrDefault>
+      <w:rPr>
+        <w:rFonts w:asciiTheme="minorHAnsi" w:eastAsiaTheme="minorHAnsi" w:hAnsiTheme="minorHAnsi" w:cstheme="minorBidi"/>
+        <w:sz w:val="22"/>
+        <w:szCs w:val="22"/>
+        <w:lang w:val="ru-RU" w:eastAsia="en-US" w:bidi="ar-SA"/>
+      </w:rPr>
+    </w:rPrDefault>
+    <w:pPrDefault>
+      <w:pPr>
+        <w:spacing w:after="200" w:line="276" w:lineRule="auto"/>
+      </w:pPr>
+    </w:pPrDefault>
+  </w:docDefaults>
+  <w:latentStyles w:defLockedState="0" w:defUIPriority="99" w:defSemiHidden="1" w:defUnhideWhenUsed="1" w:defQFormat="0" w:count="267">
+    <w:lsdException w:name="Normal" w:semiHidden="0" w:uiPriority="0" w:unhideWhenUsed="0" w:qFormat="1"/>
+    <w:lsdException w:name="heading 1" w:semiHidden="0" w:uiPriority="9" w:unhideWhenUsed="0" w:qFormat="1"/>
+    <w:lsdException w:name="heading 2" w:uiPriority="9" w:qFormat="1"/>
+    <w:lsdException w:name="heading 3" w:uiPriority="9" w:qFormat="1"/>
+    <w:lsdException w:name="heading 4" w:uiPriority="9" w:qFormat="1"/>
+    <w:lsdException w:name="heading 5" w:uiPriority="9" w:qFormat="1"/>
+    <w:lsdException w:name="heading 6" w:uiPriority="9" w:qFormat="1"/>
+    <w:lsdException w:name="heading 7" w:uiPriority="9" w:qFormat="1"/>
+    <w:lsdException w:name="heading 8" w:uiPriority="9" w:qFormat="1"/>
+    <w:lsdException w:name="heading 9" w:uiPriority="9" w:qFormat="1"/>
+    <w:lsdException w:name="toc 1" w:uiPriority="39"/>
+    <w:lsdException w:name="toc 2" w:uiPriority="39"/>
+    <w:lsdException w:name="toc 3" w:uiPriority="39"/>
+    <w:lsdException w:name="toc 4" w:uiPriority="39"/>
+    <w:lsdException w:name="toc 5" w:uiPriority="39"/>
+    <w:lsdException w:name="toc 6" w:uiPriority="39"/>
+    <w:lsdException w:name="toc 7" w:uiPriority="39"/>
+    <w:lsdException w:name="toc 8" w:uiPriority="39"/>
+    <w:lsdException w:name="toc 9" w:uiPriority="39"/>
+    <w:lsdException w:name="caption" w:uiPriority="35" w:qFormat="1"/>
+    <w:lsdException w:name="Title" w:semiHidden="0" w:uiPriority="10" w:unhideWhenUsed="0" w:qFormat="1"/>
+    <w:lsdException w:name="Default Paragraph Font" w:uiPriority="1"/>
+    <w:lsdException w:name="Subtitle" w:semiHidden="0" w:uiPriority="11" w:unhideWhenUsed="0" w:qFormat="1"/>
+    <w:lsdException w:name="Strong" w:semiHidden="0" w:uiPriority="22" w:unhideWhenUsed="0" w:qFormat="1"/>
+    <w:lsdException w:name="Emphasis" w:semiHidden="0" w:uiPriority="20" w:unhideWhenUsed="0" w:qFormat="1"/>
+    <w:lsdException w:name="Table Grid" w:semiHidden="0" w:uiPriority="59" w:unhideWhenUsed="0"/>
+    <w:lsdException w:name="Placeholder Text" w:unhideWhenUsed="0"/>
+    <w:lsdException w:name="No Spacing" w:semiHidden="0" w:uiPriority="1" w:unhideWhenUsed="0" w:qFormat="1"/>
+    <w:lsdException w:name="Light Shading" w:semiHidden="0" w:uiPriority="60" w:unhideWhenUsed="0"/>
+    <w:lsdException w:name="Light List" w:semiHidden="0" w:uiPriority="61" w:unhideWhenUsed="0"/>
+    <w:lsdException w:name="Light Grid" w:semiHidden="0" w:uiPriority="62" w:unhideWhenUsed="0"/>
+    <w:lsdException w:name="Medium Shading 1" w:semiHidden="0" w:uiPriority="63" w:unhideWhenUsed="0"/>
+    <w:lsdException w:name="Medium Shading 2" w:semiHidden="0" w:uiPriority="64" w:unhideWhenUsed="0"/>
+    <w:lsdException w:name="Medium List 1" w:semiHidden="0" w:uiPriority="65" w:unhideWhenUsed="0"/>
+    <w:lsdException w:name="Medium List 2" w:semiHidden="0" w:uiPriority="66" w:unhideWhenUsed="0"/>
+    <w:lsdException w:name="Medium Grid 1" w:semiHidden="0" w:uiPriority="67" w:unhideWhenUsed="0"/>
+    <w:lsdException w:name="Medium Grid 2" w:semiHidden="0" w:uiPriority="68" w:unhideWhenUsed="0"/>
+    <w:lsdException w:name="Medium Grid 3" w:semiHidden="0" w:uiPriority="69" w:unhideWhenUsed="0"/>
+    <w:lsdException w:name="Dark List" w:semiHidden="0" w:uiPriority="70" w:unhideWhenUsed="0"/>
+    <w:lsdException w:name="Colorful Shading" w:semiHidden="0" w:uiPriority="71" w:unhideWhenUsed="0"/>
+    <w:lsdException w:name="Colorful List" w:semiHidden="0" w:uiPriority="72" w:unhideWhenUsed="0"/>
+    <w:lsdException w:name="Colorful Grid" w:semiHidden="0" w:uiPriority="73" w:unhideWhenUsed="0"/>
+    <w:lsdException w:name="Light Shading Accent 1" w:semiHidden="0" w:uiPriority="60" w:unhideWhenUsed="0"/>
+    <w:lsdException w:name="Light List Accent 1" w:semiHidden="0" w:uiPriority="61" w:unhideWhenUsed="0"/>
+    <w:lsdException w:name="Light Grid Accent 1" w:semiHidden="0" w:uiPriority="62" w:unhideWhenUsed="0"/>
+    <w:lsdException w:name="Medium Shading 1 Accent 1" w:semiHidden="0" w:uiPriority="63" w:unhideWhenUsed="0"/>
+    <w:lsdException w:name="Medium Shading 2 Accent 1" w:semiHidden="0" w:uiPriority="64" w:unhideWhenUsed="0"/>
+    <w:lsdException w:name="Medium List 1 Accent 1" w:semiHidden="0" w:uiPriority="65" w:unhideWhenUsed="0"/>
+    <w:lsdException w:name="Revision" w:unhideWhenUsed="0"/>
+    <w:lsdException w:name="List Paragraph" w:semiHidden="0" w:uiPriority="34" w:unhideWhenUsed="0" w:qFormat="1"/>
+    <w:lsdException w:name="Quote" w:semiHidden="0" w:uiPriority="29" w:unhideWhenUsed="0" w:qFormat="1"/>
+    <w:lsdException w:name="Intense Quote" w:semiHidden="0" w:uiPriority="30" w:unhideWhenUsed="0" w:qFormat="1"/>
+    <w:lsdException w:name="Medium List 2 Accent 1" w:semiHidden="0" w:uiPriority="66" w:unhideWhenUsed="0"/>
+    <w:lsdException w:name="Medium Grid 1 Accent 1" w:semiHidden="0" w:uiPriority="67" w:unhideWhenUsed="0"/>
+    <w:lsdException w:name="Medium Grid 2 Accent 1" w:semiHidden="0" w:uiPriority="68" w:unhideWhenUsed="0"/>
+    <w:lsdException w:name="Medium Grid 3 Accent 1" w:semiHidden="0" w:uiPriority="69" w:unhideWhenUsed="0"/>
+    <w:lsdException w:name="Dark List Accent 1" w:semiHidden="0" w:uiPriority="70" w:unhideWhenUsed="0"/>
+    <w:lsdException w:name="Colorful Shading Accent 1" w:semiHidden="0" w:uiPriority="71" w:unhideWhenUsed="0"/>
+    <w:lsdException w:name="Colorful List Accent 1" w:semiHidden="0" w:uiPriority="72" w:unhideWhenUsed="0"/>
+    <w:lsdException w:name="Colorful Grid Accent 1" w:semiHidden="0" w:uiPriority="73" w:unhideWhenUsed="0"/>
+    <w:lsdException w:name="Light Shading Accent 2" w:semiHidden="0" w:uiPriority="60" w:unhideWhenUsed="0"/>
+    <w:lsdException w:name="Light List Accent 2" w:semiHidden="0" w:uiPriority="61" w:unhideWhenUsed="0"/>
+    <w:lsdException w:name="Light Grid Accent 2" w:semiHidden="0" w:uiPriority="62" w:unhideWhenUsed="0"/>
+    <w:lsdException w:name="Medium Shading 1 Accent 2" w:semiHidden="0" w:uiPriority="63" w:unhideWhenUsed="0"/>
+    <w:lsdException w:name="Medium Shading 2 Accent 2" w:semiHidden="0" w:uiPriority="64" w:unhideWhenUsed="0"/>
+    <w:lsdException w:name="Medium List 1 Accent 2" w:semiHidden="0" w:uiPriority="65" w:unhideWhenUsed="0"/>
+    <w:lsdException w:name="Medium List 2 Accent 2" w:semiHidden="0" w:uiPriority="66" w:unhideWhenUsed="0"/>
+    <w:lsdException w:name="Medium Grid 1 Accent 2" w:semiHidden="0" w:uiPriority="67" w:unhideWhenUsed="0"/>
+    <w:lsdException w:name="Medium Grid 2 Accent 2" w:semiHidden="0" w:uiPriority="68" w:unhideWhenUsed="0"/>
+    <w:lsdException w:name="Medium Grid 3 Accent 2" w:semiHidden="0" w:uiPriority="69" w:unhideWhenUsed="0"/>
+    <w:lsdException w:name="Dark List Accent 2" w:semiHidden="0" w:uiPriority="70" w:unhideWhenUsed="0"/>
+    <w:lsdException w:name="Colorful Shading Accent 2" w:semiHidden="0" w:uiPriority="71" w:unhideWhenUsed="0"/>
+    <w:lsdException w:name="Colorful List Accent 2" w:semiHidden="0" w:uiPriority="72" w:unhideWhenUsed="0"/>
+    <w:lsdException w:name="Colorful Grid Accent 2" w:semiHidden="0" w:uiPriority="73" w:unhideWhenUsed="0"/>
+    <w:lsdException w:name="Light Shading Accent 3" w:semiHidden="0" w:uiPriority="60" w:unhideWhenUsed="0"/>
+    <w:lsdException w:name="Light List Accent 3" w:semiHidden="0" w:uiPriority="61" w:unhideWhenUsed="0"/>
+    <w:lsdException w:name="Light Grid Accent 3" w:semiHidden="0" w:uiPriority="62" w:unhideWhenUsed="0"/>
+    <w:lsdException w:name="Medium Shading 1 Accent 3" w:semiHidden="0" w:uiPriority="63" w:unhideWhenUsed="0"/>
+    <w:lsdException w:name="Medium Shading 2 Accent 3" w:semiHidden="0" w:uiPriority="64" w:unhideWhenUsed="0"/>
+    <w:lsdException w:name="Medium List 1 Accent 3" w:semiHidden="0" w:uiPriority="65" w:unhideWhenUsed="0"/>
+    <w:lsdException w:name="Medium List 2 Accent 3" w:semiHidden="0" w:uiPriority="66" w:unhideWhenUsed="0"/>
+    <w:lsdException w:name="Medium Grid 1 Accent 3" w:semiHidden="0" w:uiPriority="67" w:unhideWhenUsed="0"/>
+    <w:lsdException w:name="Medium Grid 2 Accent 3" w:semiHidden="0" w:uiPriority="68" w:unhideWhenUsed="0"/>
+    <w:lsdException w:name="Medium Grid 3 Accent 3" w:semiHidden="0" w:uiPriority="69" w:unhideWhenUsed="0"/>
+    <w:lsdException w:name="Dark List Accent 3" w:semiHidden="0" w:uiPriority="70" w:unhideWhenUsed="0"/>
+    <w:lsdException w:name="Colorful Shading Accent 3" w:semiHidden="0" w:uiPriority="71" w:unhideWhenUsed="0"/>
+    <w:lsdException w:name="Colorful List Accent 3" w:semiHidden="0" w:uiPriority="72" w:unhideWhenUsed="0"/>
+    <w:lsdException w:name="Colorful Grid Accent 3" w:semiHidden="0" w:uiPriority="73" w:unhideWhenUsed="0"/>
+    <w:lsdException w:name="Light Shading Accent 4" w:semiHidden="0" w:uiPriority="60" w:unhideWhenUsed="0"/>
+    <w:lsdException w:name="Light List Accent 4" w:semiHidden="0" w:uiPriority="61" w:unhideWhenUsed="0"/>
+    <w:lsdException w:name="Light Grid Accent 4" w:semiHidden="0" w:uiPriority="62" w:unhideWhenUsed="0"/>
+    <w:lsdException w:name="Medium Shading 1 Accent 4" w:semiHidden="0" w:uiPriority="63" w:unhideWhenUsed="0"/>
+    <w:lsdException w:name="Medium Shading 2 Accent 4" w:semiHidden="0" w:uiPriority="64" w:unhideWhenUsed="0"/>
+    <w:lsdException w:name="Medium List 1 Accent 4" w:semiHidden="0" w:uiPriority="65" w:unhideWhenUsed="0"/>
+    <w:lsdException w:name="Medium List 2 Accent 4" w:semiHidden="0" w:uiPriority="66" w:unhideWhenUsed="0"/>
+    <w:lsdException w:name="Medium Grid 1 Accent 4" w:semiHidden="0" w:uiPriority="67" w:unhideWhenUsed="0"/>
+    <w:lsdException w:name="Medium Grid 2 Accent 4" w:semiHidden="0" w:uiPriority="68" w:unhideWhenUsed="0"/>
+    <w:lsdException w:name="Medium Grid 3 Accent 4" w:semiHidden="0" w:uiPriority="69" w:unhideWhenUsed="0"/>
+    <w:lsdException w:name="Dark List Accent 4" w:semiHidden="0" w:uiPriority="70" w:unhideWhenUsed="0"/>
+    <w:lsdException w:name="Colorful Shading Accent 4" w:semiHidden="0" w:uiPriority="71" w:unhideWhenUsed="0"/>
+    <w:lsdException w:name="Colorful List Accent 4" w:semiHidden="0" w:uiPriority="72" w:unhideWhenUsed="0"/>
+    <w:lsdException w:name="Colorful Grid Accent 4" w:semiHidden="0" w:uiPriority="73" w:unhideWhenUsed="0"/>
+    <w:lsdException w:name="Light Shading Accent 5" w:semiHidden="0" w:uiPriority="60" w:unhideWhenUsed="0"/>
+    <w:lsdException w:name="Light List Accent 5" w:semiHidden="0" w:uiPriority="61" w:unhideWhenUsed="0"/>
+    <w:lsdException w:name="Light Grid Accent 5" w:semiHidden="0" w:uiPriority="62" w:unhideWhenUsed="0"/>
+    <w:lsdException w:name="Medium Shading 1 Accent 5" w:semiHidden="0" w:uiPriority="63" w:unhideWhenUsed="0"/>
+    <w:lsdException w:name="Medium Shading 2 Accent 5" w:semiHidden="0" w:uiPriority="64" w:unhideWhenUsed="0"/>
+    <w:lsdException w:name="Medium List 1 Accent 5" w:semiHidden="0" w:uiPriority="65" w:unhideWhenUsed="0"/>
+    <w:lsdException w:name="Medium List 2 Accent 5" w:semiHidden="0" w:uiPriority="66" w:unhideWhenUsed="0"/>
+    <w:lsdException w:name="Medium Grid 1 Accent 5" w:semiHidden="0" w:uiPriority="67" w:unhideWhenUsed="0"/>
+    <w:lsdException w:name="Medium Grid 2 Accent 5" w:semiHidden="0" w:uiPriority="68" w:unhideWhenUsed="0"/>
+    <w:lsdException w:name="Medium Grid 3 Accent 5" w:semiHidden="0" w:uiPriority="69" w:unhideWhenUsed="0"/>
+    <w:lsdException w:name="Dark List Accent 5" w:semiHidden="0" w:uiPriority="70" w:unhideWhenUsed="0"/>
+    <w:lsdException w:name="Colorful Shading Accent 5" w:semiHidden="0" w:uiPriority="71" w:unhideWhenUsed="0"/>
+    <w:lsdException w:name="Colorful List Accent 5" w:semiHidden="0" w:uiPriority="72" w:unhideWhenUsed="0"/>
+    <w:lsdException w:name="Colorful Grid Accent 5" w:semiHidden="0" w:uiPriority="73" w:unhideWhenUsed="0"/>
+    <w:lsdException w:name="Light Shading Accent 6" w:semiHidden="0" w:uiPriority="60" w:unhideWhenUsed="0"/>
+    <w:lsdException w:name="Light List Accent 6" w:semiHidden="0" w:uiPriority="61" w:unhideWhenUsed="0"/>
+    <w:lsdException w:name="Light Grid Accent 6" w:semiHidden="0" w:uiPriority="62" w:unhideWhenUsed="0"/>
+    <w:lsdException w:name="Medium Shading 1 Accent 6" w:semiHidden="0" w:uiPriority="63" w:unhideWhenUsed="0"/>
+    <w:lsdException w:name="Medium Shading 2 Accent 6" w:semiHidden="0" w:uiPriority="64" w:unhideWhenUsed="0"/>
+    <w:lsdException w:name="Medium List 1 Accent 6" w:semiHidden="0" w:uiPriority="65" w:unhideWhenUsed="0"/>
+    <w:lsdException w:name="Medium List 2 Accent 6" w:semiHidden="0" w:uiPriority="66" w:unhideWhenUsed="0"/>
+    <w:lsdException w:name="Medium Grid 1 Accent 6" w:semiHidden="0" w:uiPriority="67" w:unhideWhenUsed="0"/>
+    <w:lsdException w:name="Medium Grid 2 Accent 6" w:semiHidden="0" w:uiPriority="68" w:unhideWhenUsed="0"/>
+    <w:lsdException w:name="Medium Grid 3 Accent 6" w:semiHidden="0" w:uiPriority="69" w:unhideWhenUsed="0"/>
+    <w:lsdException w:name="Dark List Accent 6" w:semiHidden="0" w:uiPriority="70" w:unhideWhenUsed="0"/>
+    <w:lsdException w:name="Colorful Shading Accent 6" w:semiHidden="0" w:uiPriority="71" w:unhideWhenUsed="0"/>
+    <w:lsdException w:name="Colorful List Accent 6" w:semiHidden="0" w:uiPriority="72" w:unhideWhenUsed="0"/>
+    <w:lsdException w:name="Colorful Grid Accent 6" w:semiHidden="0" w:uiPriority="73" w:unhideWhenUsed="0"/>
+    <w:lsdException w:name="Subtle Emphasis" w:semiHidden="0" w:uiPriority="19" w:unhideWhenUsed="0" w:qFormat="1"/>
+    <w:lsdException w:name="Intense Emphasis" w:semiHidden="0" w:uiPriority="21" w:unhideWhenUsed="0" w:qFormat="1"/>
+    <w:lsdException w:name="Subtle Reference" w:semiHidden="0" w:uiPriority="31" w:unhideWhenUsed="0" w:qFormat="1"/>
+    <w:lsdException w:name="Intense Reference" w:semiHidden="0" w:uiPriority="32" w:unhideWhenUsed="0" w:qFormat="1"/>
+    <w:lsdException w:name="Book Title" w:semiHidden="0" w:uiPriority="33" w:unhideWhenUsed="0" w:qFormat="1"/>
+    <w:lsdException w:name="Bibliography" w:uiPriority="37"/>
+    <w:lsdException w:name="TOC Heading" w:uiPriority="39" w:qFormat="1"/>
+  </w:latentStyles>
+  <w:style w:type="paragraph" w:default="1" w:styleId="a">
+    <w:name w:val="Normal"/>
+    <w:qFormat/>
+  </w:style>
+  <w:style w:type="character" w:default="1" w:styleId="a0">
+    <w:name w:val="Default Paragraph Font"/>
+    <w:uiPriority w:val="1"/>
+    <w:semiHidden/>
+    <w:unhideWhenUsed/>
+  </w:style>
+  <w:style w:type="table" w:default="1" w:styleId="a1">
+    <w:name w:val="Normal Table"/>
+    <w:uiPriority w:val="99"/>
+    <w:semiHidden/>
+    <w:unhideWhenUsed/>
+    <w:tblPr>
+      <w:tblInd w:w="0" w:type="dxa"/>
       <w:tblCellMar>
         <w:top w:w="0" w:type="dxa"/>
         <w:left w:w="108" w:type="dxa"/>
         <w:bottom w:w="0" w:type="dxa"/>
         <w:right w:w="108" w:type="dxa"/>
       </w:tblCellMar>
+    </w:tblPr>
+  </w:style>
+  <w:style w:type="numbering" w:default="1" w:styleId="a2">
+    <w:name w:val="No List"/>
+    <w:uiPriority w:val="99"/>
+    <w:semiHidden/>
+    <w:unhideWhenUsed/>
+  </w:style>
+  <w:style w:type="paragraph" w:styleId="a3">
+    <w:name w:val="header"/>
+    <w:basedOn w:val="a"/>
+    <w:link w:val="a4"/>
+    <w:uiPriority w:val="99"/>
+    <w:unhideWhenUsed/>
+    <w:rsid w:val="000838FA"/>
+    <w:pPr>
+      <w:tabs>
+        <w:tab w:val="center" w:pos="4677"/>
+        <w:tab w:val="right" w:pos="9355"/>
+      </w:tabs>
+      <w:spacing w:after="0" w:line="240" w:lineRule="auto"/>
+    </w:pPr>
+  </w:style>
+  <w:style w:type="character" w:customStyle="1" w:styleId="a4">
+    <w:name w:val="Верхний колонтитул Знак"/>
+    <w:basedOn w:val="a0"/>
+    <w:link w:val="a3"/>
+    <w:uiPriority w:val="99"/>
+    <w:rsid w:val="000838FA"/>
+  </w:style>
+  <w:style w:type="paragraph" w:styleId="a5">
+    <w:name w:val="footer"/>
+    <w:basedOn w:val="a"/>
+    <w:link w:val="a6"/>
+    <w:uiPriority w:val="99"/>
+    <w:unhideWhenUsed/>
+    <w:rsid w:val="000838FA"/>
+    <w:pPr>
+      <w:tabs>
+        <w:tab w:val="center" w:pos="4677"/>
+        <w:tab w:val="right" w:pos="9355"/>
+      </w:tabs>
+      <w:spacing w:after="0" w:line="240" w:lineRule="auto"/>
+    </w:pPr>
+  </w:style>
+  <w:style w:type="character" w:customStyle="1" w:styleId="a6">
+    <w:name w:val="Нижний колонтитул Знак"/>
+    <w:basedOn w:val="a0"/>
+    <w:link w:val="a5"/>
+    <w:uiPriority w:val="99"/>
+    <w:rsid w:val="000838FA"/>
+  </w:style>
+  <w:style w:type="table" w:styleId="a7">
+    <w:name w:val="Table Grid"/>
+    <w:basedOn w:val="a1"/>
+    <w:uiPriority w:val="59"/>
+    <w:rsid w:val="00754607"/>
+    <w:pPr>
+      <w:spacing w:after="0" w:line="240" w:lineRule="auto"/>
+    </w:pPr>
+    <w:tblPr>
+      <w:tblBorders>
+        <w:top w:val="single" w:sz="4" w:space="0" w:color="auto"/>
+        <w:left w:val="single" w:sz="4" w:space="0" w:color="auto"/>
+        <w:bottom w:val="single" w:sz="4" w:space="0" w:color="auto"/>
+        <w:right w:val="single" w:sz="4" w:space="0" w:color="auto"/>
+        <w:insideH w:val="single" w:sz="4" w:space="0" w:color="auto"/>
+        <w:insideV w:val="single" w:sz="4" w:space="0" w:color="auto"/>
+      </w:tblBorders>
     </w:tblPr>
   </w:style>
   <w:style w:type="paragraph" w:styleId="a8">

</xml_diff>